<commit_message>
Apply two Fable keep/cut gates to the COVID-period opener.
Gate A states overlapping cold-day intervals and refuses “recovered health.”
Gate B splits stacked Abstract/Introduction sentences. Model 1 and the Xin
deaths clause stay. Rebuild the candidate Word file.

Co-authored-by: Shen Ruililin <bobshenruililin@users.noreply.github.com>
</commit_message>
<xml_diff>
--- a/manuscript/covid_period/Heat_CVD_Manuscript_covid_period.docx
+++ b/manuscript/covid_period/Heat_CVD_Manuscript_covid_period.docx
@@ -216,7 +216,7 @@
           <w:i w:val="0"/>
           <w:sz w:val="24"/>
         </w:rPr>
-        <w:t xml:space="preserve"> Hong Kong’s 2013–2023 hospital window includes both a decade-long decline in first coronary and heart-failure events and the 2020 shock to care-seeking. Neighbour series report fewer public hospitalisations and more cardiovascular deaths in 2020. Whether official hot nights and cold days can account for the change in first-event counts, or for the change in cold-day count ratios, is a separate question from whether temperature triggers daily admissions.</w:t>
+        <w:t xml:space="preserve"> Hong Kong’s 2013–2023 hospital window includes both a decade-long decline in first coronary and heart-failure events and the 2020 shock to care-seeking. Neighbour series report fewer public hospitalisations and more cardiovascular deaths in 2020. Official hot nights and cold days may or may not account for the change in first-event counts or in cold-day count ratios. That question is separate from whether temperature triggers daily admissions.</w:t>
       </w:r>
     </w:p>
     <w:p>
@@ -259,7 +259,7 @@
           <w:i w:val="0"/>
           <w:sz w:val="24"/>
         </w:rPr>
-        <w:t xml:space="preserve"> as a reporting scale. A labelled specification repeats Model 1 on January 2013–December 2019 (84 months). Intervals used model-based, HC1, and Newey–West lag-3 and lag-6 constructions. Benjamini–Hochberg *q*-values covered the twelve Model 1 fits on the full window.</w:t>
+        <w:t xml:space="preserve"> as a reporting scale, read per five additional such days in a month. A pre-2020 specification repeats Model 1 on January 2013–December 2019 (84 months). Intervals used model-based, HC1, and Newey–West lag-3 and lag-6 constructions. Benjamini–Hochberg *q*-values were computed across the twelve full-window Model 1 fits.</w:t>
       </w:r>
     </w:p>
     <w:p>
@@ -284,7 +284,7 @@
           <w:i w:val="0"/>
           <w:sz w:val="24"/>
         </w:rPr>
-        <w:t xml:space="preserve"> Annual first-event totals about halved from 2013 to 2023 (CHD 23,830 to 12,323; HF 4,336 to 2,296), with a further dip in 2020 (CHD 10,237; HF 1,964), while the Census and Statistics Department population aged 35 years or older rose by 17%. Under Newey–West lag-6 reporting, the HF cold-day count ratio per five days was 1.113 (1.053–1.176) before 2020 and 1.073 (1.006–1.144) in 2013–2023. The CHD cold-day ratio excluded 1 only before 2020 (1.036, 1.007–1.067 versus 0.995, 0.949–1.043). The CHD hot-night ratio was compatible with 1 before 2020 (1.011, 0.991–1.032) and was 1.022 (1.002–1.042) only when 2020–2023 were included. Both full-window headlines have *q* = 0.192; all twelve Model 1 *q*-values exceeded 0.19. Pre-2020 mean temperature was inversely associated with both outcomes (CHD 0.980, 0.970–0.990; HF 0.945, 0.927–0.963) and is not interchangeable with the official-day encodings.</w:t>
+        <w:t xml:space="preserve"> Annual first-event totals about halved from 2013 to 2023 (CHD 23,830 to 12,323; HF 4,336 to 2,296), with a further dip in 2020 (CHD 10,237; HF 1,964), while the Census and Statistics Department population aged 35 years or older rose by 17%. Under Newey–West lag-6 reporting, the HF cold-day count ratio per five days was 1.113 (1.053–1.176) before 2020 and 1.073 (1.006–1.144) in 2013–2023. The CHD cold-day ratio excluded 1 only before 2020 (1.036, 1.007–1.067 versus 0.995, 0.949–1.043). The CHD hot-night ratio was compatible with 1 before 2020 (1.011, 0.991–1.032) and was 1.022 (1.002–1.042) only when 2020–2023 were included. Both full-window estimates have *q* = 0.192. All twelve full-window *q*-values exceeded 0.19.</w:t>
       </w:r>
     </w:p>
     <w:p>
@@ -309,7 +309,7 @@
           <w:i w:val="0"/>
           <w:sz w:val="24"/>
         </w:rPr>
-        <w:t xml:space="preserve"> First-event counts and cold-day count ratios in this extract are window-dependent. Official thermal extremes are insufficient to explain that dependence, and they are not irrelevant to it. The decline in first events is not a measure of physiological improvement. Estimates remain ecological monthly count ratios for a first-event outcome without recorded admission cause.</w:t>
+        <w:t xml:space="preserve"> First-event counts and cold-day count ratios in this extract are window-dependent. Official thermal extremes are insufficient to explain that dependence. They remain part of the exposure record. The decline in first events is not a measure of physiological improvement. Estimates remain ecological monthly count ratios for a first-event outcome without recorded admission cause.</w:t>
       </w:r>
     </w:p>
     <w:p>
@@ -367,7 +367,7 @@
           <w:i w:val="0"/>
           <w:sz w:val="24"/>
         </w:rPr>
-        <w:t>The 2013–2023 window in Hong Kong is not a homogeneous thermal decade. It contains a 2020 collapse in public-hospital use, a later rebound that did not restore the early-decade first-event totals, and a closed diagnosis interval in which people can leave the still-at-risk set. Any monthly count of first coronary or heart-failure hospitalisation in that window therefore mixes weather, care-seeking, and depletion. The question for this paper is whether those objects can be told apart with the extract on file.</w:t>
+        <w:t>The 2013–2023 window in Hong Kong is not a homogeneous thermal decade. It contains a 2020 collapse in public-hospital use and a rebound that did not restore early-decade first-event totals. It also spans a closed diagnosis interval, so the still-at-risk population shrinks over time. Any monthly count of first coronary or heart-failure hospitalisation in that window therefore mixes weather, care-seeking, and depletion. This paper asks whether those components can be separated in monthly territory-level counts.</w:t>
       </w:r>
     </w:p>
     <w:p>
@@ -383,7 +383,7 @@
           <w:i w:val="0"/>
           <w:sz w:val="24"/>
         </w:rPr>
-        <w:t>Hong Kong neighbours already describe the 2020 care shock in the opposite direction from a healthier heart. Xin et al. reported fewer public hospitalisations in 2020, including cardiovascular admissions, together with additional deaths, particularly cardiovascular deaths and deaths outside public hospitals [34]. Wai et al. found fewer emergency-department visits in January–August 2020 than in the same months of 2019, and higher 28-day mortality among those who did attend [35]. A later Wai et al. cohort of non-COVID deaths likewise paired fewer emergency visits with higher 28-day mortality [36]. Hung et al. documented self-reported avoidance of consultation in a public survey [37]. Tam et al. reported longer delays to ST-elevation myocardial infarction care in Hong Kong in early 2020 [38,39]. Those papers are utilisation and delay series. They are not this diabetes-or-hypertension first-event construction, and their counts are not imported into the tables below.</w:t>
+        <w:t>Hong Kong studies of 2020 describe fewer cardiovascular admissions, not fewer cardiovascular events. Xin et al. reported fewer public hospitalisations in 2020, including cardiovascular admissions, together with additional deaths, particularly cardiovascular deaths and deaths outside public hospitals [34]. Wai et al. found fewer emergency-department visits in January–August 2020 than in the same months of 2019, and higher 28-day mortality among those who did attend [35]. A later Wai et al. cohort of non-COVID deaths likewise paired fewer emergency visits with higher 28-day mortality [36]. Hung et al. documented self-reported avoidance of consultation in a public survey [37]. Tam et al. reported longer delays to ST-elevation myocardial infarction care in Hong Kong in early 2020 [38,39]. Those papers are utilisation and delay series. They are not this diabetes-or-hypertension first-event construction, and their counts are not imported into the tables below.</w:t>
       </w:r>
     </w:p>
     <w:p>
@@ -7164,7 +7164,7 @@
           <w:i w:val="0"/>
           <w:sz w:val="24"/>
         </w:rPr>
-        <w:t>The extract shows window dependence, not a protected thermal discovery. First-event counts halved while the general population aged 35 years or older rose. Cold-day count ratios were stronger in 2013–2019 than in 2013–2023. The CHD hot-night residual appeared only when 2020–2023 were included. All twelve full-window Model 1 *q*-values exceeded 0.19, so neither headline is a confirmatory primary.</w:t>
+        <w:t>The extract shows window dependence, not a protected thermal discovery. Annual first events fell by roughly half (CHD 23,830 to 12,323; HF 4,336 to 2,296, with a 2020 dip to 10,237 and 1,964) while the general population aged 35 years or older rose 17%. Cold-day point estimates were larger in 2013–2019 than in 2013–2023 (HF 1.113 vs 1.073; CHD 1.036 vs 0.995), with overlapping intervals. The CHD hot-night interval excluded 1 only in the full window (1.022, 1.002–1.042; 2013–2019: 1.011, 0.991–1.032). All twelve full-window Model 1 *q*-values exceeded 0.19, so neither headline is a confirmatory primary.</w:t>
       </w:r>
     </w:p>
     <w:p>
@@ -7205,7 +7205,7 @@
           <w:i w:val="0"/>
           <w:sz w:val="24"/>
         </w:rPr>
-        <w:t xml:space="preserve"> Neighbour Hong Kong files show fewer hospitalisations and more cardiovascular deaths in 2020 [34–37]. Emergency-department visits fell and 28-day mortality among attenders rose [35,36]. Self-reported avoidance of consultation was common [37]. ST-elevation myocardial infarction care was delayed [38,39]. Those are care-seeking and system-shock patterns. They predict fewer first recorded hospitalisations in a monthly Hospital Authority series without requiring a quieter myocardium. They do not identify how much of Table 1 is delayed presentation. They forbid reading the count drop as recovered health.</w:t>
+        <w:t xml:space="preserve"> Neighbour Hong Kong files show fewer hospitalisations and more cardiovascular deaths in 2020 [34–37]. Emergency-department visits fell and 28-day mortality among attenders rose [35,36]. Self-reported avoidance of consultation was common [37]. ST-elevation myocardial infarction care was delayed [38,39]. Those patterns are consistent with reduced care-seeking and system shock. They predict fewer first recorded hospitalisations in a monthly Hospital Authority series without requiring a quieter myocardium. They do not identify how much of Table 1 is delayed presentation. They do not license reading the count drop as recovered health.</w:t>
       </w:r>
     </w:p>
     <w:p>

</xml_diff>

<commit_message>
Strip LaTeX leftovers from the COVID-period Word export.
Inline math now prints I(count/5) rather than mathrm, and q/p are italic
runs. Hogan weather sentences are unchanged.

Co-authored-by: Shen Ruililin <bobshenruililin@users.noreply.github.com>
</commit_message>
<xml_diff>
--- a/manuscript/covid_period/Heat_CVD_Manuscript_covid_period.docx
+++ b/manuscript/covid_period/Heat_CVD_Manuscript_covid_period.docx
@@ -250,7 +250,7 @@
           <w:i/>
           <w:sz w:val="24"/>
         </w:rPr>
-        <w:t>I(\mathrm{count}/5)</w:t>
+        <w:t>I(count/5)</w:t>
       </w:r>
       <w:r>
         <w:rPr>
@@ -259,7 +259,25 @@
           <w:i w:val="0"/>
           <w:sz w:val="24"/>
         </w:rPr>
-        <w:t xml:space="preserve"> as a reporting scale, read per five additional such days in a month. A pre-2020 specification repeats Model 1 on January 2013–December 2019 (84 months). Intervals used model-based, HC1, and Newey–West lag-3 and lag-6 constructions. Benjamini–Hochberg *q*-values were computed across the twelve full-window Model 1 fits.</w:t>
+        <w:t xml:space="preserve"> as a reporting scale, read per five additional such days in a month. A pre-2020 specification repeats Model 1 on January 2013–December 2019 (84 months). Intervals used model-based, HC1, and Newey–West lag-3 and lag-6 constructions. Benjamini–Hochberg </w:t>
+      </w:r>
+      <w:r>
+        <w:rPr>
+          <w:rFonts w:ascii="Times New Roman" w:hAnsi="Times New Roman" w:eastAsia="Times New Roman"/>
+          <w:b w:val="0"/>
+          <w:i/>
+          <w:sz w:val="24"/>
+        </w:rPr>
+        <w:t>q</w:t>
+      </w:r>
+      <w:r>
+        <w:rPr>
+          <w:rFonts w:ascii="Times New Roman" w:hAnsi="Times New Roman" w:eastAsia="Times New Roman"/>
+          <w:b w:val="0"/>
+          <w:i w:val="0"/>
+          <w:sz w:val="24"/>
+        </w:rPr>
+        <w:t>-values were computed across the twelve full-window Model 1 fits.</w:t>
       </w:r>
     </w:p>
     <w:p>
@@ -284,7 +302,43 @@
           <w:i w:val="0"/>
           <w:sz w:val="24"/>
         </w:rPr>
-        <w:t xml:space="preserve"> Annual first-event totals about halved from 2013 to 2023 (CHD 23,830 to 12,323; HF 4,336 to 2,296), with a further dip in 2020 (CHD 10,237; HF 1,964), while the Census and Statistics Department population aged 35 years or older rose by 17%. Under Newey–West lag-6 reporting, the HF cold-day count ratio per five days was 1.113 (1.053–1.176) before 2020 and 1.073 (1.006–1.144) in 2013–2023. The CHD cold-day ratio excluded 1 only before 2020 (1.036, 1.007–1.067 versus 0.995, 0.949–1.043). The CHD hot-night ratio was compatible with 1 before 2020 (1.011, 0.991–1.032) and was 1.022 (1.002–1.042) only when 2020–2023 were included. Both full-window estimates have *q* = 0.192. All twelve full-window *q*-values exceeded 0.19.</w:t>
+        <w:t xml:space="preserve"> Annual first-event totals about halved from 2013 to 2023 (CHD 23,830 to 12,323; HF 4,336 to 2,296), with a further dip in 2020 (CHD 10,237; HF 1,964), while the Census and Statistics Department population aged 35 years or older rose by 17%. Under Newey–West lag-6 reporting, the HF cold-day count ratio per five days was 1.113 (1.053–1.176) before 2020 and 1.073 (1.006–1.144) in 2013–2023. The CHD cold-day ratio excluded 1 only before 2020 (1.036, 1.007–1.067 versus 0.995, 0.949–1.043). The CHD hot-night ratio was compatible with 1 before 2020 (1.011, 0.991–1.032) and was 1.022 (1.002–1.042) only when 2020–2023 were included. Both full-window estimates have </w:t>
+      </w:r>
+      <w:r>
+        <w:rPr>
+          <w:rFonts w:ascii="Times New Roman" w:hAnsi="Times New Roman" w:eastAsia="Times New Roman"/>
+          <w:b w:val="0"/>
+          <w:i/>
+          <w:sz w:val="24"/>
+        </w:rPr>
+        <w:t>q</w:t>
+      </w:r>
+      <w:r>
+        <w:rPr>
+          <w:rFonts w:ascii="Times New Roman" w:hAnsi="Times New Roman" w:eastAsia="Times New Roman"/>
+          <w:b w:val="0"/>
+          <w:i w:val="0"/>
+          <w:sz w:val="24"/>
+        </w:rPr>
+        <w:t xml:space="preserve"> = 0.192. All twelve full-window </w:t>
+      </w:r>
+      <w:r>
+        <w:rPr>
+          <w:rFonts w:ascii="Times New Roman" w:hAnsi="Times New Roman" w:eastAsia="Times New Roman"/>
+          <w:b w:val="0"/>
+          <w:i/>
+          <w:sz w:val="24"/>
+        </w:rPr>
+        <w:t>q</w:t>
+      </w:r>
+      <w:r>
+        <w:rPr>
+          <w:rFonts w:ascii="Times New Roman" w:hAnsi="Times New Roman" w:eastAsia="Times New Roman"/>
+          <w:b w:val="0"/>
+          <w:i w:val="0"/>
+          <w:sz w:val="24"/>
+        </w:rPr>
+        <w:t>-values exceeded 0.19.</w:t>
       </w:r>
     </w:p>
     <w:p>
@@ -1030,7 +1084,7 @@
           <w:i/>
           <w:sz w:val="24"/>
         </w:rPr>
-        <w:t>I(\mathrm{month}_t = m)</w:t>
+        <w:t>I(month_t = m)</w:t>
       </w:r>
       <w:r>
         <w:rPr>
@@ -1120,7 +1174,7 @@
           <w:i/>
           <w:sz w:val="24"/>
         </w:rPr>
-        <w:t>s(t; 4~\mathrm{df})</w:t>
+        <w:t>s(t; 4~df)</w:t>
       </w:r>
       <w:r>
         <w:rPr>
@@ -1138,7 +1192,7 @@
           <w:i/>
           <w:sz w:val="24"/>
         </w:rPr>
-        <w:t>\mathrm{e}^{\beta}</w:t>
+        <w:t>e^{\beta}</w:t>
       </w:r>
       <w:r>
         <w:rPr>
@@ -1207,7 +1261,61 @@
           <w:i w:val="0"/>
           <w:sz w:val="24"/>
         </w:rPr>
-        <w:t>We report 95% confidence intervals in four ways: the model’s own standard errors, HC1, Newey–West with a lag of 3 months, and Newey–West with a lag of 6 months [19]. The main reported interval is Newey–West with lag 6. Monthly hospital counts can be correlated from one month to the next; Newey–West intervals allow for that. A *q*-value is a *p*-value adjusted for testing the twelve Model 1 fits together [20]. Multiplicity-adjusted *q*-values were computed on the full 132-month window only.</w:t>
+        <w:t xml:space="preserve">We report 95% confidence intervals in four ways: the model’s own standard errors, HC1, Newey–West with a lag of 3 months, and Newey–West with a lag of 6 months [19]. The main reported interval is Newey–West with lag 6. Monthly hospital counts can be correlated from one month to the next; Newey–West intervals allow for that. A </w:t>
+      </w:r>
+      <w:r>
+        <w:rPr>
+          <w:rFonts w:ascii="Times New Roman" w:hAnsi="Times New Roman" w:eastAsia="Times New Roman"/>
+          <w:b w:val="0"/>
+          <w:i/>
+          <w:sz w:val="24"/>
+        </w:rPr>
+        <w:t>q</w:t>
+      </w:r>
+      <w:r>
+        <w:rPr>
+          <w:rFonts w:ascii="Times New Roman" w:hAnsi="Times New Roman" w:eastAsia="Times New Roman"/>
+          <w:b w:val="0"/>
+          <w:i w:val="0"/>
+          <w:sz w:val="24"/>
+        </w:rPr>
+        <w:t xml:space="preserve">-value is a </w:t>
+      </w:r>
+      <w:r>
+        <w:rPr>
+          <w:rFonts w:ascii="Times New Roman" w:hAnsi="Times New Roman" w:eastAsia="Times New Roman"/>
+          <w:b w:val="0"/>
+          <w:i/>
+          <w:sz w:val="24"/>
+        </w:rPr>
+        <w:t>p</w:t>
+      </w:r>
+      <w:r>
+        <w:rPr>
+          <w:rFonts w:ascii="Times New Roman" w:hAnsi="Times New Roman" w:eastAsia="Times New Roman"/>
+          <w:b w:val="0"/>
+          <w:i w:val="0"/>
+          <w:sz w:val="24"/>
+        </w:rPr>
+        <w:t xml:space="preserve">-value adjusted for testing the twelve Model 1 fits together [20]. Multiplicity-adjusted </w:t>
+      </w:r>
+      <w:r>
+        <w:rPr>
+          <w:rFonts w:ascii="Times New Roman" w:hAnsi="Times New Roman" w:eastAsia="Times New Roman"/>
+          <w:b w:val="0"/>
+          <w:i/>
+          <w:sz w:val="24"/>
+        </w:rPr>
+        <w:t>q</w:t>
+      </w:r>
+      <w:r>
+        <w:rPr>
+          <w:rFonts w:ascii="Times New Roman" w:hAnsi="Times New Roman" w:eastAsia="Times New Roman"/>
+          <w:b w:val="0"/>
+          <w:i w:val="0"/>
+          <w:sz w:val="24"/>
+        </w:rPr>
+        <w:t>-values were computed on the full 132-month window only.</w:t>
       </w:r>
     </w:p>
     <w:p>
@@ -2301,7 +2409,43 @@
           <w:i w:val="0"/>
           <w:sz w:val="24"/>
         </w:rPr>
-        <w:t>The HF cold-day ratio was 1.113 (1.053–1.176) before 2020 and 1.073 (1.006–1.144) over 2013–2023. Both intervals exclude 1 under Newey–West lag-6 reporting. The full-window estimate has *q* = 0.192. The CHD cold-day ratio excluded 1 only before 2020 (1.036, 1.007–1.067). In the full window it was 0.995 (0.949–1.043). The CHD hot-night ratio was 1.011 (0.991–1.032) before 2020, an interval that includes 1, and 1.022 (1.002–1.042) when 2020–2023 were included (*q* = 0.192). COVID-phase indicators on the full sample moved the CHD hot-night ratio to 1.013 (0.994–1.033) and left the HF cold-day ratio at 1.074 (1.006–1.145). There is no 48-month post-2020 Model 1 table. Attenuation of a cold-day count ratio toward 1, or a hot-night ratio that appears only when the later years are included, is a change in a monthly count model. It is not a measure of physiological improvement.</w:t>
+        <w:t xml:space="preserve">The HF cold-day ratio was 1.113 (1.053–1.176) before 2020 and 1.073 (1.006–1.144) over 2013–2023. Both intervals exclude 1 under Newey–West lag-6 reporting. The full-window estimate has </w:t>
+      </w:r>
+      <w:r>
+        <w:rPr>
+          <w:rFonts w:ascii="Times New Roman" w:hAnsi="Times New Roman" w:eastAsia="Times New Roman"/>
+          <w:b w:val="0"/>
+          <w:i/>
+          <w:sz w:val="24"/>
+        </w:rPr>
+        <w:t>q</w:t>
+      </w:r>
+      <w:r>
+        <w:rPr>
+          <w:rFonts w:ascii="Times New Roman" w:hAnsi="Times New Roman" w:eastAsia="Times New Roman"/>
+          <w:b w:val="0"/>
+          <w:i w:val="0"/>
+          <w:sz w:val="24"/>
+        </w:rPr>
+        <w:t xml:space="preserve"> = 0.192. The CHD cold-day ratio excluded 1 only before 2020 (1.036, 1.007–1.067). In the full window it was 0.995 (0.949–1.043). The CHD hot-night ratio was 1.011 (0.991–1.032) before 2020, an interval that includes 1, and 1.022 (1.002–1.042) when 2020–2023 were included (</w:t>
+      </w:r>
+      <w:r>
+        <w:rPr>
+          <w:rFonts w:ascii="Times New Roman" w:hAnsi="Times New Roman" w:eastAsia="Times New Roman"/>
+          <w:b w:val="0"/>
+          <w:i/>
+          <w:sz w:val="24"/>
+        </w:rPr>
+        <w:t>q</w:t>
+      </w:r>
+      <w:r>
+        <w:rPr>
+          <w:rFonts w:ascii="Times New Roman" w:hAnsi="Times New Roman" w:eastAsia="Times New Roman"/>
+          <w:b w:val="0"/>
+          <w:i w:val="0"/>
+          <w:sz w:val="24"/>
+        </w:rPr>
+        <w:t xml:space="preserve"> = 0.192). COVID-phase indicators on the full sample moved the CHD hot-night ratio to 1.013 (0.994–1.033) and left the HF cold-day ratio at 1.074 (1.006–1.145). There is no 48-month post-2020 Model 1 table. Attenuation of a cold-day count ratio toward 1, or a hot-night ratio that appears only when the later years are included, is a change in a monthly count model. It is not a measure of physiological improvement.</w:t>
       </w:r>
     </w:p>
     <w:p>
@@ -2317,7 +2461,25 @@
           <w:i/>
           <w:sz w:val="22"/>
         </w:rPr>
-        <w:t>Table 2. Official-day count ratios in the full window and in January 2013–December 2019 (Newey–West lag-6). Each estimate is the Model 1 count ratio per five additional official days in the month. Pre-2020 is a labelled specification (84 months). Benjamini–Hochberg *q*-values apply to the twelve full-window Model 1 fits only.</w:t>
+        <w:t xml:space="preserve">Table 2. Official-day count ratios in the full window and in January 2013–December 2019 (Newey–West lag-6). Each estimate is the Model 1 count ratio per five additional official days in the month. Pre-2020 is a labelled specification (84 months). Benjamini–Hochberg </w:t>
+      </w:r>
+      <w:r>
+        <w:rPr>
+          <w:rFonts w:ascii="Times New Roman" w:hAnsi="Times New Roman" w:eastAsia="Times New Roman"/>
+          <w:b w:val="0"/>
+          <w:i/>
+          <w:sz w:val="22"/>
+        </w:rPr>
+        <w:t>q</w:t>
+      </w:r>
+      <w:r>
+        <w:rPr>
+          <w:rFonts w:ascii="Times New Roman" w:hAnsi="Times New Roman" w:eastAsia="Times New Roman"/>
+          <w:b w:val="0"/>
+          <w:i/>
+          <w:sz w:val="22"/>
+        </w:rPr>
+        <w:t>-values apply to the twelve full-window Model 1 fits only.</w:t>
       </w:r>
     </w:p>
     <w:tbl>
@@ -5368,7 +5530,25 @@
           <w:i w:val="0"/>
           <w:sz w:val="24"/>
         </w:rPr>
-        <w:t>All twelve *q*-values exceeded 0.19, with a minimum of 0.192. No model meets a multiplicity-protected confirmatory threshold. The HF mean-minimum-temperature interval narrowly included 1, with an unrounded upper bound of 1.00005. For CHD, the continuous monthly temperature estimates were near null, between 0.993 and 0.994, whereas the official hot-night count estimate was larger under Newey–West lag-6 reporting. These encodings describe different monthly thermal questions. The contrast does not imply that a hot-night effect was missed by the means, and it is not a test of hourly nighttime excess heat [17]. For HF, the continuous temperature estimates were weakly inverse, and the cold-day count estimate was positive.</w:t>
+        <w:t xml:space="preserve">All twelve </w:t>
+      </w:r>
+      <w:r>
+        <w:rPr>
+          <w:rFonts w:ascii="Times New Roman" w:hAnsi="Times New Roman" w:eastAsia="Times New Roman"/>
+          <w:b w:val="0"/>
+          <w:i/>
+          <w:sz w:val="24"/>
+        </w:rPr>
+        <w:t>q</w:t>
+      </w:r>
+      <w:r>
+        <w:rPr>
+          <w:rFonts w:ascii="Times New Roman" w:hAnsi="Times New Roman" w:eastAsia="Times New Roman"/>
+          <w:b w:val="0"/>
+          <w:i w:val="0"/>
+          <w:sz w:val="24"/>
+        </w:rPr>
+        <w:t>-values exceeded 0.19, with a minimum of 0.192. No model meets a multiplicity-protected confirmatory threshold. The HF mean-minimum-temperature interval narrowly included 1, with an unrounded upper bound of 1.00005. For CHD, the continuous monthly temperature estimates were near null, between 0.993 and 0.994, whereas the official hot-night count estimate was larger under Newey–West lag-6 reporting. These encodings describe different monthly thermal questions. The contrast does not imply that a hot-night effect was missed by the means, and it is not a test of hourly nighttime excess heat [17]. For HF, the continuous temperature estimates were weakly inverse, and the cold-day count estimate was positive.</w:t>
       </w:r>
     </w:p>
     <w:p>
@@ -5900,7 +6080,25 @@
           <w:i w:val="0"/>
           <w:sz w:val="24"/>
         </w:rPr>
-        <w:t>For CHD hot nights, the model-based and HC1 intervals included 1, while both Newey–West intervals excluded 1 on the unrounded scale (lag 3: 1.000253 to 1.043860). The ladder narrowed from the model-based interval to the Newey–West intervals for that contrast. Robust intervals are not automatically wider, and the direction of that change is itself informative. For HF cold days, all four constructions excluded 1, and *q* remained 0.192. Concordance across standard-error methods does not create multiplicity protection. No interval was chosen because it excluded 1.</w:t>
+        <w:t xml:space="preserve">For CHD hot nights, the model-based and HC1 intervals included 1, while both Newey–West intervals excluded 1 on the unrounded scale (lag 3: 1.000253 to 1.043860). The ladder narrowed from the model-based interval to the Newey–West intervals for that contrast. Robust intervals are not automatically wider, and the direction of that change is itself informative. For HF cold days, all four constructions excluded 1, and </w:t>
+      </w:r>
+      <w:r>
+        <w:rPr>
+          <w:rFonts w:ascii="Times New Roman" w:hAnsi="Times New Roman" w:eastAsia="Times New Roman"/>
+          <w:b w:val="0"/>
+          <w:i/>
+          <w:sz w:val="24"/>
+        </w:rPr>
+        <w:t>q</w:t>
+      </w:r>
+      <w:r>
+        <w:rPr>
+          <w:rFonts w:ascii="Times New Roman" w:hAnsi="Times New Roman" w:eastAsia="Times New Roman"/>
+          <w:b w:val="0"/>
+          <w:i w:val="0"/>
+          <w:sz w:val="24"/>
+        </w:rPr>
+        <w:t xml:space="preserve"> remained 0.192. Concordance across standard-error methods does not create multiplicity protection. No interval was chosen because it excluded 1.</w:t>
       </w:r>
     </w:p>
     <w:p>
@@ -7100,7 +7298,43 @@
           <w:i w:val="0"/>
           <w:sz w:val="24"/>
         </w:rPr>
-        <w:t>Pearson residual autocorrelation at lag 1 was 0.508 in the CHD hot-night model and 0.146 in the HF cold-day model. Ljung–Box tests at lag 6 gave *p* &lt; 10^−7^ for every CHD Model 1 fit and *p* &gt; 0.3 for every HF Model 1 fit. Serial dependence is part of the inferential problem for CHD, which is why the four-construction ladder is shown rather than a single interval.</w:t>
+        <w:t xml:space="preserve">Pearson residual autocorrelation at lag 1 was 0.508 in the CHD hot-night model and 0.146 in the HF cold-day model. Ljung–Box tests at lag 6 gave </w:t>
+      </w:r>
+      <w:r>
+        <w:rPr>
+          <w:rFonts w:ascii="Times New Roman" w:hAnsi="Times New Roman" w:eastAsia="Times New Roman"/>
+          <w:b w:val="0"/>
+          <w:i/>
+          <w:sz w:val="24"/>
+        </w:rPr>
+        <w:t>p</w:t>
+      </w:r>
+      <w:r>
+        <w:rPr>
+          <w:rFonts w:ascii="Times New Roman" w:hAnsi="Times New Roman" w:eastAsia="Times New Roman"/>
+          <w:b w:val="0"/>
+          <w:i w:val="0"/>
+          <w:sz w:val="24"/>
+        </w:rPr>
+        <w:t xml:space="preserve"> &lt; 10^−7^ for every CHD Model 1 fit and </w:t>
+      </w:r>
+      <w:r>
+        <w:rPr>
+          <w:rFonts w:ascii="Times New Roman" w:hAnsi="Times New Roman" w:eastAsia="Times New Roman"/>
+          <w:b w:val="0"/>
+          <w:i/>
+          <w:sz w:val="24"/>
+        </w:rPr>
+        <w:t>p</w:t>
+      </w:r>
+      <w:r>
+        <w:rPr>
+          <w:rFonts w:ascii="Times New Roman" w:hAnsi="Times New Roman" w:eastAsia="Times New Roman"/>
+          <w:b w:val="0"/>
+          <w:i w:val="0"/>
+          <w:sz w:val="24"/>
+        </w:rPr>
+        <w:t xml:space="preserve"> &gt; 0.3 for every HF Model 1 fit. Serial dependence is part of the inferential problem for CHD, which is why the four-construction ladder is shown rather than a single interval.</w:t>
       </w:r>
     </w:p>
     <w:p>
@@ -7164,7 +7398,25 @@
           <w:i w:val="0"/>
           <w:sz w:val="24"/>
         </w:rPr>
-        <w:t>The extract shows window dependence, not a protected thermal discovery. Annual first events fell by roughly half (CHD 23,830 to 12,323; HF 4,336 to 2,296, with a 2020 dip to 10,237 and 1,964) while the general population aged 35 years or older rose 17%. Cold-day point estimates were larger in 2013–2019 than in 2013–2023 (HF 1.113 vs 1.073; CHD 1.036 vs 0.995), with overlapping intervals. The CHD hot-night interval excluded 1 only in the full window (1.022, 1.002–1.042; 2013–2019: 1.011, 0.991–1.032). All twelve full-window Model 1 *q*-values exceeded 0.19, so neither headline is a confirmatory primary.</w:t>
+        <w:t xml:space="preserve">The extract shows window dependence, not a protected thermal discovery. Annual first events fell by roughly half (CHD 23,830 to 12,323; HF 4,336 to 2,296, with a 2020 dip to 10,237 and 1,964) while the general population aged 35 years or older rose 17%. Cold-day point estimates were larger in 2013–2019 than in 2013–2023 (HF 1.113 vs 1.073; CHD 1.036 vs 0.995), with overlapping intervals. The CHD hot-night interval excluded 1 only in the full window (1.022, 1.002–1.042; 2013–2019: 1.011, 0.991–1.032). All twelve full-window Model 1 </w:t>
+      </w:r>
+      <w:r>
+        <w:rPr>
+          <w:rFonts w:ascii="Times New Roman" w:hAnsi="Times New Roman" w:eastAsia="Times New Roman"/>
+          <w:b w:val="0"/>
+          <w:i/>
+          <w:sz w:val="24"/>
+        </w:rPr>
+        <w:t>q</w:t>
+      </w:r>
+      <w:r>
+        <w:rPr>
+          <w:rFonts w:ascii="Times New Roman" w:hAnsi="Times New Roman" w:eastAsia="Times New Roman"/>
+          <w:b w:val="0"/>
+          <w:i w:val="0"/>
+          <w:sz w:val="24"/>
+        </w:rPr>
+        <w:t>-values exceeded 0.19, so neither headline is a confirmatory primary.</w:t>
       </w:r>
     </w:p>
     <w:p>

</xml_diff>

<commit_message>
Apply covid_period hostile-read FIXes without inventing data
Name the nested 84 ⊂ 132 official-day ratios as the ruling-out exhibit,
move the encoding contrast into that section, and stop calling Newey–West
lag-6 the main interval. Drop the sixth Results heading, the nested-window
significance-count, and the daily-recovery Type I dump. Rebuild Word/PDF.

Co-authored-by: Shen Ruililin <bobshenruililin@users.noreply.github.com>
</commit_message>
<xml_diff>
--- a/manuscript/covid_period/Heat_CVD_Manuscript_covid_period.docx
+++ b/manuscript/covid_period/Heat_CVD_Manuscript_covid_period.docx
@@ -48,7 +48,7 @@
           <w:i/>
           <w:sz w:val="21"/>
         </w:rPr>
-        <w:t>Candidate article. Confirmatory freeze has not been declared. Estimates are the same parked Model 1 and window checks; the thesis is the analysis window, not a new thermal discovery.</w:t>
+        <w:t>Candidate article. Estimates are the parked Model 1 and nested-window checks. A confirmatory freeze has not been declared. The thesis is the analysis window, not a new thermal discovery.</w:t>
       </w:r>
     </w:p>
     <w:p>
@@ -263,7 +263,7 @@
           <w:i w:val="0"/>
           <w:sz w:val="24"/>
         </w:rPr>
-        <w:t xml:space="preserve"> We analysed 132 territory-months (January 2013–December 2023) of monthly counts of first hospitalisation after a first diagnosis of coronary heart disease (CHD; 156,156 events) or heart failure (HF; 29,681 events) among people with type 2 diabetes and/or hypertension. Admission cause was not recorded. Model 1 is a separate negative-binomial model for each of three continuous temperature measures and the official counts of hot nights, very hot days, and cold days, with calendar-month indicators, a 4-df time spline, and an offset for the number of days in the month. Official-day exposures use </w:t>
+        <w:t xml:space="preserve"> We analysed 132 territory-months (January 2013–December 2023) of monthly counts of first hospitalisation after a first diagnosis of coronary heart disease (CHD; 156,156 events) or heart failure (HF; 29,681 events) among people with type 2 diabetes and/or hypertension. Admission cause was not recorded. The first object is that count path. The ruling-out exhibit is the Model 1 official-day count ratio on the full 132 months and on the nested 84 months from January 2013 to December 2019. Those 84 months are contained in the 132. Model 1 is a separate negative-binomial model for each of three continuous temperature measures and the official counts of hot nights, very hot days, and cold days, with calendar-month indicators, a 4-df time spline, and an offset for the number of days in the month. Official-day exposures use </w:t>
       </w:r>
       <w:r>
         <w:rPr>
@@ -281,7 +281,7 @@
           <w:i w:val="0"/>
           <w:sz w:val="24"/>
         </w:rPr>
-        <w:t xml:space="preserve"> as a reporting scale, read per five additional such days in a month. A nested specification repeats Model 1 on the 84 months from January 2013 to December 2019, which are contained in the full window. Intervals used model-based, HC1, and Newey–West lag-3 and lag-6 constructions. Benjamini–Hochberg </w:t>
+        <w:t xml:space="preserve"> as a reporting scale, read per five additional such days in a month. Intervals used model-based, HC1, and Newey–West lag-3 and lag-6 constructions. Displayed official-day intervals in the text use the lag-6 construction, matching the previously reported Model 1 tables. Benjamini–Hochberg </w:t>
       </w:r>
       <w:r>
         <w:rPr>
@@ -299,7 +299,7 @@
           <w:i w:val="0"/>
           <w:sz w:val="24"/>
         </w:rPr>
-        <w:t>-values were computed across the twelve full-window Model 1 fits.</w:t>
+        <w:t>-values were computed across the twelve full-window Model 1 fits. No 48-month post-2020 Model 1 table is reported.</w:t>
       </w:r>
     </w:p>
     <w:p>
@@ -325,7 +325,7 @@
           <w:i w:val="0"/>
           <w:sz w:val="24"/>
         </w:rPr>
-        <w:t xml:space="preserve"> Annual first-event totals about halved from 2013 to 2023 (CHD 23,830 to 12,323; HF 4,336 to 2,296), with a further dip in 2020 (CHD 10,237; HF 1,964), while the Census and Statistics Department population aged 35 years or older rose by 17%. Under Newey–West lag-6 reporting, the HF cold-day count ratio per five days was 1.113 (1.053–1.176) in the nested 84 months and 1.073 (1.006–1.144) in the full 132. The CHD cold-day ratio excluded 1 only in the nested window (1.036, 1.007–1.067 versus 0.995, 0.949–1.043). The CHD hot-night ratio was compatible with 1 in the nested window (1.011, 0.991–1.032) and was 1.022 (1.002–1.042) in the full window. Both full-window estimates have </w:t>
+        <w:t xml:space="preserve"> Annual first-event totals about halved from 2013 to 2023 (CHD 23,830 to 12,323; HF 4,336 to 2,296), with a further dip in 2020 (CHD 10,237; HF 1,964), while the Census and Statistics Department population aged 35 years or older rose by 17%. Displayed Newey–West lag-6 intervals for the HF cold-day count ratio per five days were 1.113 (1.053–1.176) in the nested 84 months and 1.073 (1.006–1.144) in the full 132. The CHD cold-day ratio excluded 1 only in the nested window (1.036, 1.007–1.067 versus 0.995, 0.949–1.043). The CHD hot-night ratio was compatible with 1 in the nested window (1.011, 0.991–1.032) and was 1.022 (1.002–1.042) in the full window. Both full-window estimates have </w:t>
       </w:r>
       <w:r>
         <w:rPr>
@@ -361,7 +361,7 @@
           <w:i w:val="0"/>
           <w:sz w:val="24"/>
         </w:rPr>
-        <w:t>-values exceeded 0.19. Continuous mean temperature was inverse in the nested window for both outcomes (CHD 0.980, 0.970–0.990; HF 0.945, 0.927–0.963), so official day counts and monthly means are not interchangeable encodings.</w:t>
+        <w:t>-values exceeded 0.19. Continuous mean temperature was inverse in the nested window for both outcomes (CHD 0.980, 0.970–0.990; HF 0.945, 0.927–0.963). Official day counts and monthly means are not interchangeable encodings.</w:t>
       </w:r>
     </w:p>
     <w:p>
@@ -482,7 +482,7 @@
           <w:i w:val="0"/>
           <w:sz w:val="24"/>
         </w:rPr>
-        <w:t>Local thermal evidence answers a different question. Using 2000–2009 data, Goggins et al. associated a 1 °C decrease below an estimated 24 °C threshold with a 3.7% increase in acute myocardial infarction admissions, and found no statistically significant heat association in Hong Kong, Taipei, or Kaohsiung [7]. Closest to the present heart-failure outcome, Goggins and Chan analysed daily public-hospital heart-failure admissions and deaths during 2002–2011 and reported a cumulative relative risk of 2.63 (2.43–2.84) for admissions comparing 11 °C with 25 °C over lags to 23 days [8]. Guo et al. analysed daily unplanned emergency hospitalisations in the hot seasons of 2000–2019: after adjustment for multi-day mean temperature, the official hot-night indicator showed no overall association with non-cancer, non-external hospitalisation over lags 0–4 days, while an hourly nighttime excess-heat metric did [9]. Those studies estimate daily risk for cause-coded or unplanned admissions. Their coefficients do not transfer to monthly counts of first hospitalisation after a first CHD or HF diagnosis, and they do not identify why a 2013–2019 count ratio would differ from a 2013–2023 fit.</w:t>
+        <w:t>Local thermal evidence answers a different question. Using 2000–2009 data, Goggins et al. associated a 1 °C decrease below an estimated 24 °C threshold with a 3.7% increase in acute myocardial infarction admissions, and found no statistically significant heat association in Hong Kong, Taipei, or Kaohsiung [7]. Closest to the present heart-failure outcome, Goggins and Chan analysed daily public-hospital heart-failure admissions and deaths during 2002–2011 and reported a cumulative relative risk of 2.63 (2.43–2.84) for admissions comparing 11 °C with 25 °C over lags to 23 days [8]. Guo et al. analysed daily unplanned emergency hospitalisations in the hot seasons of 2000–2019. After adjustment for multi-day mean temperature, the official hot-night indicator showed no overall association with non-cancer, non-external hospitalisation over lags 0–4 days, while an hourly nighttime excess-heat metric did [9]. Those studies estimate daily risk for cause-coded or unplanned admissions. Their coefficients do not transfer to monthly counts of first hospitalisation after a first CHD or HF diagnosis. They do not identify why a 2013–2019 count ratio would differ from a 2013–2023 fit.</w:t>
       </w:r>
     </w:p>
     <w:p>
@@ -1422,7 +1422,7 @@
           <w:i w:val="0"/>
           <w:sz w:val="24"/>
         </w:rPr>
-        <w:t xml:space="preserve">We report 95% confidence intervals in four ways: the model’s own standard errors, HC1, Newey–West with a lag of 3 months, and Newey–West with a lag of 6 months [17]. The main reported interval is Newey–West with lag 6. Monthly hospital counts can be correlated from one month to the next; Newey–West intervals allow for that. A </w:t>
+        <w:t xml:space="preserve">We report 95% confidence intervals in four ways: the model’s own standard errors, HC1, Newey–West with a lag of 3 months, and Newey–West with a lag of 6 months [17]. Displayed official-day intervals in the text and in Table 2 use the lag-6 construction, matching the previously reported Model 1 tables. The four-construction ladder is always shown for the two exploratory contrasts (Table 5). No interval is chosen because it excludes 1. Monthly hospital counts can be correlated from one month to the next. Newey–West intervals allow for that. A </w:t>
       </w:r>
       <w:r>
         <w:rPr>
@@ -1834,7 +1834,7 @@
           <w:i w:val="0"/>
           <w:sz w:val="24"/>
         </w:rPr>
-        <w:t>CHD contributed 156,156 first recorded hospitalisations over 132 months, a mean of 1,183.0 per month. HF contributed 29,681, a mean of 224.9 per month (Table 1). Annual totals fell by about half from 2013 to 2023 (CHD 23,830 to 12,323; HF 4,336 to 2,296), with a further dip in 2020 (CHD 10,237; HF 1,964). Over the same years, the interpolated Census and Statistics Department population aged 35 years or older rose by 17%. Mean monthly first-event counts were 1,315 for CHD and 252 for HF in 2013–2019, against 926 and 173 in 2020–2022. Figure 1 indexes both hospital series and the general-population series to 2013. The decline in first-event counts is compatible with depletion of the at-risk set in a 2013–2023 diagnosis window, together with pandemic changes in care-seeking. It is not a measure of physiological improvement. It does not quantify the share attributable to depletion without monthly still-at-risk person-time. Mean monthly HF counts were highest in January (287) and lowest in September (196). CHD showed a milder winter elevation (January 1,386; September 1,097). After calendar-month indicators, the thermal estimates ask whether a given January or July differs from a typical January or July, and not whether winter counts exceed summer counts.</w:t>
+        <w:t>CHD contributed 156,156 first recorded hospitalisations over 132 months, a mean of 1,183.0 per month. HF contributed 29,681, a mean of 224.9 per month (Table 1). Annual totals fell by about half from 2013 to 2023 (CHD 23,830 to 12,323; HF 4,336 to 2,296), with a further dip in 2020 (CHD 10,237; HF 1,964). Over the same years, the interpolated Census and Statistics Department population aged 35 years or older rose by 17%. Mean monthly first-event counts were 1,315 for CHD and 252 for HF in 2013–2019, against 926 and 173 in 2020–2022. Figure 1 indexes both hospital series and the general-population series to 2013. The decline in first-event counts is compatible with depletion of the at-risk set in a 2013–2023 diagnosis window, together with pandemic changes in care-seeking. It is not a measure of physiological improvement. It does not quantify the share attributable to depletion without monthly still-at-risk person-time. Mean monthly HF counts were highest in January (287) and lowest in September (196). CHD showed a milder winter elevation (January 1,386; September 1,097). After calendar-month indicators, the thermal estimates ask whether a given January or July differs from a typical January or July. They do not ask whether winter counts exceed summer counts.</w:t>
       </w:r>
     </w:p>
     <w:p>
@@ -2648,7 +2648,7 @@
           <w:i w:val="0"/>
           <w:sz w:val="24"/>
         </w:rPr>
-        <w:t xml:space="preserve">The HF cold-day ratio was 1.113 (1.053–1.176) in the nested window and 1.073 (1.006–1.144) over the full window. Both intervals exclude 1 under Newey–West lag-6 reporting. The full-window estimate has </w:t>
+        <w:t xml:space="preserve">The HF cold-day ratio was 1.113 (1.053–1.176) in the nested window and 1.073 (1.006–1.144) over the full window. Both displayed Newey–West lag-6 intervals exclude 1. The full-window estimate has </w:t>
       </w:r>
       <w:r>
         <w:rPr>
@@ -3659,7 +3659,7 @@
           <w:i/>
           <w:sz w:val="22"/>
         </w:rPr>
-        <w:t>Figure 3. Model 1 count ratios for official day counts across time-trend, window, and COVID-period specifications (Newey–West lag-6 intervals). The exposure is the monthly official day count divided by five, so each estimate is the count ratio per five additional such days in that month. Rows labelled 3, 6, or 8 df replace the 4-df time-trend spline of Model 1. Neither the five-day scale nor the spline degrees of freedom refers to consecutive days. The nested window is January 2013–December 2019 (84 months). Continuous-temperature fits for the same specifications are a supplement, not a physiology panel.</w:t>
+        <w:t>Figure 3. Model 1 count ratios for official day counts across time-trend, window, and COVID-period specifications (Newey–West lag-6 intervals). The exposure is the monthly official day count divided by five, so each estimate is the count ratio per five additional such days in that month. Rows labelled 3, 6, or 8 df replace the 4-df time-trend spline of Model 1. Neither the five-day scale nor the spline degrees of freedom refers to consecutive days. The nested window is January 2013–December 2019 (84 months). Continuous-temperature fits for the same specifications are a labelled check, not a physiology panel.</w:t>
       </w:r>
     </w:p>
     <w:p>
@@ -3708,6 +3708,1176 @@
       <w:pPr>
         <w:keepNext/>
         <w:keepLines/>
+        <w:spacing w:after="120" w:before="0" w:line="240" w:lineRule="auto"/>
+        <w:ind w:firstLine="0"/>
+        <w:jc w:val="left"/>
+      </w:pPr>
+      <w:r>
+        <w:rPr>
+          <w:rFonts w:ascii="Times New Roman" w:hAnsi="Times New Roman" w:eastAsia="Times New Roman"/>
+          <w:b w:val="0"/>
+          <w:i/>
+          <w:sz w:val="22"/>
+        </w:rPr>
+        <w:t>Table 3 places mean temperature beside the official-day headlines in the same two windows. In the nested window, mean temperature was inversely associated with both outcomes (CHD 0.980, 0.970–0.990; HF 0.945, 0.927–0.963). In the same 84 months, official cold days were positively associated with both outcomes, and official hot nights were compatible with 1 for CHD and inverse for HF. COVID-phase indicators on the full sample moved mean temperature to 0.989 (0.975–1.003) for CHD and 0.967 (0.944–0.991) for HF. Continuous monthly temperature and official day counts are therefore not interchangeable encodings of the same contrast. All six continuous-temperature contrasts were inverse in the nested window. No multiplicity control was computed within that window. No nested-window estimate is promoted beyond a labelled specification.</w:t>
+      </w:r>
+    </w:p>
+    <w:p>
+      <w:pPr>
+        <w:keepNext/>
+        <w:keepLines/>
+        <w:spacing w:after="120" w:before="0" w:line="240" w:lineRule="auto"/>
+        <w:ind w:firstLine="0"/>
+        <w:jc w:val="left"/>
+      </w:pPr>
+      <w:r>
+        <w:rPr>
+          <w:rFonts w:ascii="Times New Roman" w:hAnsi="Times New Roman" w:eastAsia="Times New Roman"/>
+          <w:b w:val="0"/>
+          <w:i/>
+          <w:sz w:val="22"/>
+        </w:rPr>
+        <w:t>Table 3. Mean temperature versus official-day encodings (Newey–West lag-6).</w:t>
+      </w:r>
+    </w:p>
+    <w:tbl>
+      <w:tblPr>
+        <w:tblStyle w:val="TableGrid"/>
+        <w:tblLayout w:type="fixed"/>
+        <w:tblLook w:firstColumn="1" w:firstRow="1" w:lastColumn="0" w:lastRow="0" w:noHBand="0" w:noVBand="1" w:val="04A0"/>
+        <w:tblW w:w="5000" w:type="pct"/>
+        <w:tblLayout w:type="fixed"/>
+      </w:tblPr>
+      <w:tblGrid>
+        <w:gridCol w:w="1152"/>
+        <w:gridCol w:w="2232"/>
+        <w:gridCol w:w="1800"/>
+        <w:gridCol w:w="1800"/>
+        <w:gridCol w:w="1800"/>
+      </w:tblGrid>
+      <w:tr>
+        <w:trPr>
+          <w:cantSplit/>
+          <w:tblHeader/>
+        </w:trPr>
+        <w:tc>
+          <w:tcPr>
+            <w:tcW w:type="dxa" w:w="1152"/>
+            <w:tcMar>
+              <w:top w:w="40" w:type="dxa"/>
+              <w:left w:w="55" w:type="dxa"/>
+              <w:bottom w:w="40" w:type="dxa"/>
+              <w:right w:w="55" w:type="dxa"/>
+            </w:tcMar>
+          </w:tcPr>
+          <w:p>
+            <w:pPr>
+              <w:keepNext/>
+              <w:keepLines/>
+              <w:spacing w:after="20" w:before="20" w:line="240" w:lineRule="auto"/>
+              <w:ind w:firstLine="0"/>
+              <w:jc w:val="left"/>
+            </w:pPr>
+            <w:r/>
+            <w:r>
+              <w:rPr>
+                <w:rFonts w:ascii="Times New Roman" w:hAnsi="Times New Roman" w:eastAsia="Times New Roman"/>
+                <w:b/>
+                <w:i w:val="0"/>
+                <w:sz w:val="18"/>
+              </w:rPr>
+              <w:t>Outcome</w:t>
+            </w:r>
+          </w:p>
+        </w:tc>
+        <w:tc>
+          <w:tcPr>
+            <w:tcW w:type="dxa" w:w="2232"/>
+            <w:tcMar>
+              <w:top w:w="40" w:type="dxa"/>
+              <w:left w:w="55" w:type="dxa"/>
+              <w:bottom w:w="40" w:type="dxa"/>
+              <w:right w:w="55" w:type="dxa"/>
+            </w:tcMar>
+          </w:tcPr>
+          <w:p>
+            <w:pPr>
+              <w:keepNext/>
+              <w:keepLines/>
+              <w:spacing w:after="20" w:before="20" w:line="240" w:lineRule="auto"/>
+              <w:ind w:firstLine="0"/>
+              <w:jc w:val="left"/>
+            </w:pPr>
+            <w:r/>
+            <w:r>
+              <w:rPr>
+                <w:rFonts w:ascii="Times New Roman" w:hAnsi="Times New Roman" w:eastAsia="Times New Roman"/>
+                <w:b/>
+                <w:i w:val="0"/>
+                <w:sz w:val="18"/>
+              </w:rPr>
+              <w:t>Encoding</w:t>
+            </w:r>
+          </w:p>
+        </w:tc>
+        <w:tc>
+          <w:tcPr>
+            <w:tcW w:type="dxa" w:w="1800"/>
+            <w:tcMar>
+              <w:top w:w="40" w:type="dxa"/>
+              <w:left w:w="55" w:type="dxa"/>
+              <w:bottom w:w="40" w:type="dxa"/>
+              <w:right w:w="55" w:type="dxa"/>
+            </w:tcMar>
+          </w:tcPr>
+          <w:p>
+            <w:pPr>
+              <w:keepNext/>
+              <w:keepLines/>
+              <w:spacing w:after="20" w:before="20" w:line="240" w:lineRule="auto"/>
+              <w:ind w:firstLine="0"/>
+              <w:jc w:val="left"/>
+            </w:pPr>
+            <w:r/>
+            <w:r>
+              <w:rPr>
+                <w:rFonts w:ascii="Times New Roman" w:hAnsi="Times New Roman" w:eastAsia="Times New Roman"/>
+                <w:b/>
+                <w:i w:val="0"/>
+                <w:sz w:val="18"/>
+              </w:rPr>
+              <w:t>2013–2023</w:t>
+            </w:r>
+          </w:p>
+        </w:tc>
+        <w:tc>
+          <w:tcPr>
+            <w:tcW w:type="dxa" w:w="1800"/>
+            <w:tcMar>
+              <w:top w:w="40" w:type="dxa"/>
+              <w:left w:w="55" w:type="dxa"/>
+              <w:bottom w:w="40" w:type="dxa"/>
+              <w:right w:w="55" w:type="dxa"/>
+            </w:tcMar>
+          </w:tcPr>
+          <w:p>
+            <w:pPr>
+              <w:keepNext/>
+              <w:keepLines/>
+              <w:spacing w:after="20" w:before="20" w:line="240" w:lineRule="auto"/>
+              <w:ind w:firstLine="0"/>
+              <w:jc w:val="left"/>
+            </w:pPr>
+            <w:r/>
+            <w:r>
+              <w:rPr>
+                <w:rFonts w:ascii="Times New Roman" w:hAnsi="Times New Roman" w:eastAsia="Times New Roman"/>
+                <w:b/>
+                <w:i w:val="0"/>
+                <w:sz w:val="18"/>
+              </w:rPr>
+              <w:t>Nested 2013–2019</w:t>
+            </w:r>
+          </w:p>
+        </w:tc>
+        <w:tc>
+          <w:tcPr>
+            <w:tcW w:type="dxa" w:w="1800"/>
+            <w:tcMar>
+              <w:top w:w="40" w:type="dxa"/>
+              <w:left w:w="55" w:type="dxa"/>
+              <w:bottom w:w="40" w:type="dxa"/>
+              <w:right w:w="55" w:type="dxa"/>
+            </w:tcMar>
+          </w:tcPr>
+          <w:p>
+            <w:pPr>
+              <w:keepNext/>
+              <w:keepLines/>
+              <w:spacing w:after="20" w:before="20" w:line="240" w:lineRule="auto"/>
+              <w:ind w:firstLine="0"/>
+              <w:jc w:val="left"/>
+            </w:pPr>
+            <w:r/>
+            <w:r>
+              <w:rPr>
+                <w:rFonts w:ascii="Times New Roman" w:hAnsi="Times New Roman" w:eastAsia="Times New Roman"/>
+                <w:b/>
+                <w:i w:val="0"/>
+                <w:sz w:val="18"/>
+              </w:rPr>
+              <w:t>COVID-phase indicators</w:t>
+            </w:r>
+          </w:p>
+        </w:tc>
+      </w:tr>
+      <w:tr>
+        <w:trPr>
+          <w:cantSplit/>
+        </w:trPr>
+        <w:tc>
+          <w:tcPr>
+            <w:tcW w:type="dxa" w:w="1152"/>
+            <w:tcMar>
+              <w:top w:w="40" w:type="dxa"/>
+              <w:left w:w="55" w:type="dxa"/>
+              <w:bottom w:w="40" w:type="dxa"/>
+              <w:right w:w="55" w:type="dxa"/>
+            </w:tcMar>
+          </w:tcPr>
+          <w:p>
+            <w:pPr>
+              <w:keepNext/>
+              <w:keepLines/>
+              <w:spacing w:after="20" w:before="20" w:line="240" w:lineRule="auto"/>
+              <w:ind w:firstLine="0"/>
+              <w:jc w:val="left"/>
+            </w:pPr>
+            <w:r/>
+            <w:r>
+              <w:rPr>
+                <w:rFonts w:ascii="Times New Roman" w:hAnsi="Times New Roman" w:eastAsia="Times New Roman"/>
+                <w:b w:val="0"/>
+                <w:i w:val="0"/>
+                <w:sz w:val="18"/>
+              </w:rPr>
+              <w:t>CHD</w:t>
+            </w:r>
+          </w:p>
+        </w:tc>
+        <w:tc>
+          <w:tcPr>
+            <w:tcW w:type="dxa" w:w="2232"/>
+            <w:tcMar>
+              <w:top w:w="40" w:type="dxa"/>
+              <w:left w:w="55" w:type="dxa"/>
+              <w:bottom w:w="40" w:type="dxa"/>
+              <w:right w:w="55" w:type="dxa"/>
+            </w:tcMar>
+          </w:tcPr>
+          <w:p>
+            <w:pPr>
+              <w:keepNext/>
+              <w:keepLines/>
+              <w:spacing w:after="20" w:before="20" w:line="240" w:lineRule="auto"/>
+              <w:ind w:firstLine="0"/>
+              <w:jc w:val="left"/>
+            </w:pPr>
+            <w:r/>
+            <w:r>
+              <w:rPr>
+                <w:rFonts w:ascii="Times New Roman" w:hAnsi="Times New Roman" w:eastAsia="Times New Roman"/>
+                <w:b w:val="0"/>
+                <w:i w:val="0"/>
+                <w:sz w:val="18"/>
+              </w:rPr>
+              <w:t>Mean temperature / 1 °C</w:t>
+            </w:r>
+          </w:p>
+        </w:tc>
+        <w:tc>
+          <w:tcPr>
+            <w:tcW w:type="dxa" w:w="1800"/>
+            <w:tcMar>
+              <w:top w:w="40" w:type="dxa"/>
+              <w:left w:w="55" w:type="dxa"/>
+              <w:bottom w:w="40" w:type="dxa"/>
+              <w:right w:w="55" w:type="dxa"/>
+            </w:tcMar>
+          </w:tcPr>
+          <w:p>
+            <w:pPr>
+              <w:keepNext/>
+              <w:keepLines/>
+              <w:spacing w:after="20" w:before="20" w:line="240" w:lineRule="auto"/>
+              <w:ind w:firstLine="0"/>
+              <w:jc w:val="left"/>
+            </w:pPr>
+            <w:r/>
+            <w:r>
+              <w:rPr>
+                <w:rFonts w:ascii="Times New Roman" w:hAnsi="Times New Roman" w:eastAsia="Times New Roman"/>
+                <w:b w:val="0"/>
+                <w:i w:val="0"/>
+                <w:sz w:val="18"/>
+              </w:rPr>
+              <w:t>0.993 (0.976–1.010)</w:t>
+            </w:r>
+          </w:p>
+        </w:tc>
+        <w:tc>
+          <w:tcPr>
+            <w:tcW w:type="dxa" w:w="1800"/>
+            <w:tcMar>
+              <w:top w:w="40" w:type="dxa"/>
+              <w:left w:w="55" w:type="dxa"/>
+              <w:bottom w:w="40" w:type="dxa"/>
+              <w:right w:w="55" w:type="dxa"/>
+            </w:tcMar>
+          </w:tcPr>
+          <w:p>
+            <w:pPr>
+              <w:keepNext/>
+              <w:keepLines/>
+              <w:spacing w:after="20" w:before="20" w:line="240" w:lineRule="auto"/>
+              <w:ind w:firstLine="0"/>
+              <w:jc w:val="left"/>
+            </w:pPr>
+            <w:r/>
+            <w:r>
+              <w:rPr>
+                <w:rFonts w:ascii="Times New Roman" w:hAnsi="Times New Roman" w:eastAsia="Times New Roman"/>
+                <w:b w:val="0"/>
+                <w:i w:val="0"/>
+                <w:sz w:val="18"/>
+              </w:rPr>
+              <w:t>0.980 (0.970–0.990)</w:t>
+            </w:r>
+          </w:p>
+        </w:tc>
+        <w:tc>
+          <w:tcPr>
+            <w:tcW w:type="dxa" w:w="1800"/>
+            <w:tcMar>
+              <w:top w:w="40" w:type="dxa"/>
+              <w:left w:w="55" w:type="dxa"/>
+              <w:bottom w:w="40" w:type="dxa"/>
+              <w:right w:w="55" w:type="dxa"/>
+            </w:tcMar>
+          </w:tcPr>
+          <w:p>
+            <w:pPr>
+              <w:keepNext/>
+              <w:keepLines/>
+              <w:spacing w:after="20" w:before="20" w:line="240" w:lineRule="auto"/>
+              <w:ind w:firstLine="0"/>
+              <w:jc w:val="left"/>
+            </w:pPr>
+            <w:r/>
+            <w:r>
+              <w:rPr>
+                <w:rFonts w:ascii="Times New Roman" w:hAnsi="Times New Roman" w:eastAsia="Times New Roman"/>
+                <w:b w:val="0"/>
+                <w:i w:val="0"/>
+                <w:sz w:val="18"/>
+              </w:rPr>
+              <w:t>0.989 (0.975–1.003)</w:t>
+            </w:r>
+          </w:p>
+        </w:tc>
+      </w:tr>
+      <w:tr>
+        <w:trPr>
+          <w:cantSplit/>
+        </w:trPr>
+        <w:tc>
+          <w:tcPr>
+            <w:tcW w:type="dxa" w:w="1152"/>
+            <w:tcMar>
+              <w:top w:w="40" w:type="dxa"/>
+              <w:left w:w="55" w:type="dxa"/>
+              <w:bottom w:w="40" w:type="dxa"/>
+              <w:right w:w="55" w:type="dxa"/>
+            </w:tcMar>
+          </w:tcPr>
+          <w:p>
+            <w:pPr>
+              <w:keepNext/>
+              <w:keepLines/>
+              <w:spacing w:after="20" w:before="20" w:line="240" w:lineRule="auto"/>
+              <w:ind w:firstLine="0"/>
+              <w:jc w:val="left"/>
+            </w:pPr>
+            <w:r/>
+            <w:r>
+              <w:rPr>
+                <w:rFonts w:ascii="Times New Roman" w:hAnsi="Times New Roman" w:eastAsia="Times New Roman"/>
+                <w:b w:val="0"/>
+                <w:i w:val="0"/>
+                <w:sz w:val="18"/>
+              </w:rPr>
+              <w:t>CHD</w:t>
+            </w:r>
+          </w:p>
+        </w:tc>
+        <w:tc>
+          <w:tcPr>
+            <w:tcW w:type="dxa" w:w="2232"/>
+            <w:tcMar>
+              <w:top w:w="40" w:type="dxa"/>
+              <w:left w:w="55" w:type="dxa"/>
+              <w:bottom w:w="40" w:type="dxa"/>
+              <w:right w:w="55" w:type="dxa"/>
+            </w:tcMar>
+          </w:tcPr>
+          <w:p>
+            <w:pPr>
+              <w:keepNext/>
+              <w:keepLines/>
+              <w:spacing w:after="20" w:before="20" w:line="240" w:lineRule="auto"/>
+              <w:ind w:firstLine="0"/>
+              <w:jc w:val="left"/>
+            </w:pPr>
+            <w:r/>
+            <w:r>
+              <w:rPr>
+                <w:rFonts w:ascii="Times New Roman" w:hAnsi="Times New Roman" w:eastAsia="Times New Roman"/>
+                <w:b w:val="0"/>
+                <w:i w:val="0"/>
+                <w:sz w:val="18"/>
+              </w:rPr>
+              <w:t>Hot nights / 5 days</w:t>
+            </w:r>
+          </w:p>
+        </w:tc>
+        <w:tc>
+          <w:tcPr>
+            <w:tcW w:type="dxa" w:w="1800"/>
+            <w:tcMar>
+              <w:top w:w="40" w:type="dxa"/>
+              <w:left w:w="55" w:type="dxa"/>
+              <w:bottom w:w="40" w:type="dxa"/>
+              <w:right w:w="55" w:type="dxa"/>
+            </w:tcMar>
+          </w:tcPr>
+          <w:p>
+            <w:pPr>
+              <w:keepNext/>
+              <w:keepLines/>
+              <w:spacing w:after="20" w:before="20" w:line="240" w:lineRule="auto"/>
+              <w:ind w:firstLine="0"/>
+              <w:jc w:val="left"/>
+            </w:pPr>
+            <w:r/>
+            <w:r>
+              <w:rPr>
+                <w:rFonts w:ascii="Times New Roman" w:hAnsi="Times New Roman" w:eastAsia="Times New Roman"/>
+                <w:b w:val="0"/>
+                <w:i w:val="0"/>
+                <w:sz w:val="18"/>
+              </w:rPr>
+              <w:t>1.022 (1.002–1.042)</w:t>
+            </w:r>
+          </w:p>
+        </w:tc>
+        <w:tc>
+          <w:tcPr>
+            <w:tcW w:type="dxa" w:w="1800"/>
+            <w:tcMar>
+              <w:top w:w="40" w:type="dxa"/>
+              <w:left w:w="55" w:type="dxa"/>
+              <w:bottom w:w="40" w:type="dxa"/>
+              <w:right w:w="55" w:type="dxa"/>
+            </w:tcMar>
+          </w:tcPr>
+          <w:p>
+            <w:pPr>
+              <w:keepNext/>
+              <w:keepLines/>
+              <w:spacing w:after="20" w:before="20" w:line="240" w:lineRule="auto"/>
+              <w:ind w:firstLine="0"/>
+              <w:jc w:val="left"/>
+            </w:pPr>
+            <w:r/>
+            <w:r>
+              <w:rPr>
+                <w:rFonts w:ascii="Times New Roman" w:hAnsi="Times New Roman" w:eastAsia="Times New Roman"/>
+                <w:b w:val="0"/>
+                <w:i w:val="0"/>
+                <w:sz w:val="18"/>
+              </w:rPr>
+              <w:t>1.011 (0.991–1.032)</w:t>
+            </w:r>
+          </w:p>
+        </w:tc>
+        <w:tc>
+          <w:tcPr>
+            <w:tcW w:type="dxa" w:w="1800"/>
+            <w:tcMar>
+              <w:top w:w="40" w:type="dxa"/>
+              <w:left w:w="55" w:type="dxa"/>
+              <w:bottom w:w="40" w:type="dxa"/>
+              <w:right w:w="55" w:type="dxa"/>
+            </w:tcMar>
+          </w:tcPr>
+          <w:p>
+            <w:pPr>
+              <w:keepNext/>
+              <w:keepLines/>
+              <w:spacing w:after="20" w:before="20" w:line="240" w:lineRule="auto"/>
+              <w:ind w:firstLine="0"/>
+              <w:jc w:val="left"/>
+            </w:pPr>
+            <w:r/>
+            <w:r>
+              <w:rPr>
+                <w:rFonts w:ascii="Times New Roman" w:hAnsi="Times New Roman" w:eastAsia="Times New Roman"/>
+                <w:b w:val="0"/>
+                <w:i w:val="0"/>
+                <w:sz w:val="18"/>
+              </w:rPr>
+              <w:t>1.013 (0.994–1.033)</w:t>
+            </w:r>
+          </w:p>
+        </w:tc>
+      </w:tr>
+      <w:tr>
+        <w:trPr>
+          <w:cantSplit/>
+        </w:trPr>
+        <w:tc>
+          <w:tcPr>
+            <w:tcW w:type="dxa" w:w="1152"/>
+            <w:tcMar>
+              <w:top w:w="40" w:type="dxa"/>
+              <w:left w:w="55" w:type="dxa"/>
+              <w:bottom w:w="40" w:type="dxa"/>
+              <w:right w:w="55" w:type="dxa"/>
+            </w:tcMar>
+          </w:tcPr>
+          <w:p>
+            <w:pPr>
+              <w:keepNext/>
+              <w:keepLines/>
+              <w:spacing w:after="20" w:before="20" w:line="240" w:lineRule="auto"/>
+              <w:ind w:firstLine="0"/>
+              <w:jc w:val="left"/>
+            </w:pPr>
+            <w:r/>
+            <w:r>
+              <w:rPr>
+                <w:rFonts w:ascii="Times New Roman" w:hAnsi="Times New Roman" w:eastAsia="Times New Roman"/>
+                <w:b w:val="0"/>
+                <w:i w:val="0"/>
+                <w:sz w:val="18"/>
+              </w:rPr>
+              <w:t>CHD</w:t>
+            </w:r>
+          </w:p>
+        </w:tc>
+        <w:tc>
+          <w:tcPr>
+            <w:tcW w:type="dxa" w:w="2232"/>
+            <w:tcMar>
+              <w:top w:w="40" w:type="dxa"/>
+              <w:left w:w="55" w:type="dxa"/>
+              <w:bottom w:w="40" w:type="dxa"/>
+              <w:right w:w="55" w:type="dxa"/>
+            </w:tcMar>
+          </w:tcPr>
+          <w:p>
+            <w:pPr>
+              <w:keepNext/>
+              <w:keepLines/>
+              <w:spacing w:after="20" w:before="20" w:line="240" w:lineRule="auto"/>
+              <w:ind w:firstLine="0"/>
+              <w:jc w:val="left"/>
+            </w:pPr>
+            <w:r/>
+            <w:r>
+              <w:rPr>
+                <w:rFonts w:ascii="Times New Roman" w:hAnsi="Times New Roman" w:eastAsia="Times New Roman"/>
+                <w:b w:val="0"/>
+                <w:i w:val="0"/>
+                <w:sz w:val="18"/>
+              </w:rPr>
+              <w:t>Cold days / 5 days</w:t>
+            </w:r>
+          </w:p>
+        </w:tc>
+        <w:tc>
+          <w:tcPr>
+            <w:tcW w:type="dxa" w:w="1800"/>
+            <w:tcMar>
+              <w:top w:w="40" w:type="dxa"/>
+              <w:left w:w="55" w:type="dxa"/>
+              <w:bottom w:w="40" w:type="dxa"/>
+              <w:right w:w="55" w:type="dxa"/>
+            </w:tcMar>
+          </w:tcPr>
+          <w:p>
+            <w:pPr>
+              <w:keepNext/>
+              <w:keepLines/>
+              <w:spacing w:after="20" w:before="20" w:line="240" w:lineRule="auto"/>
+              <w:ind w:firstLine="0"/>
+              <w:jc w:val="left"/>
+            </w:pPr>
+            <w:r/>
+            <w:r>
+              <w:rPr>
+                <w:rFonts w:ascii="Times New Roman" w:hAnsi="Times New Roman" w:eastAsia="Times New Roman"/>
+                <w:b w:val="0"/>
+                <w:i w:val="0"/>
+                <w:sz w:val="18"/>
+              </w:rPr>
+              <w:t>0.995 (0.949–1.043)</w:t>
+            </w:r>
+          </w:p>
+        </w:tc>
+        <w:tc>
+          <w:tcPr>
+            <w:tcW w:type="dxa" w:w="1800"/>
+            <w:tcMar>
+              <w:top w:w="40" w:type="dxa"/>
+              <w:left w:w="55" w:type="dxa"/>
+              <w:bottom w:w="40" w:type="dxa"/>
+              <w:right w:w="55" w:type="dxa"/>
+            </w:tcMar>
+          </w:tcPr>
+          <w:p>
+            <w:pPr>
+              <w:keepNext/>
+              <w:keepLines/>
+              <w:spacing w:after="20" w:before="20" w:line="240" w:lineRule="auto"/>
+              <w:ind w:firstLine="0"/>
+              <w:jc w:val="left"/>
+            </w:pPr>
+            <w:r/>
+            <w:r>
+              <w:rPr>
+                <w:rFonts w:ascii="Times New Roman" w:hAnsi="Times New Roman" w:eastAsia="Times New Roman"/>
+                <w:b w:val="0"/>
+                <w:i w:val="0"/>
+                <w:sz w:val="18"/>
+              </w:rPr>
+              <w:t>1.036 (1.007–1.067)</w:t>
+            </w:r>
+          </w:p>
+        </w:tc>
+        <w:tc>
+          <w:tcPr>
+            <w:tcW w:type="dxa" w:w="1800"/>
+            <w:tcMar>
+              <w:top w:w="40" w:type="dxa"/>
+              <w:left w:w="55" w:type="dxa"/>
+              <w:bottom w:w="40" w:type="dxa"/>
+              <w:right w:w="55" w:type="dxa"/>
+            </w:tcMar>
+          </w:tcPr>
+          <w:p>
+            <w:pPr>
+              <w:keepNext/>
+              <w:keepLines/>
+              <w:spacing w:after="20" w:before="20" w:line="240" w:lineRule="auto"/>
+              <w:ind w:firstLine="0"/>
+              <w:jc w:val="left"/>
+            </w:pPr>
+            <w:r/>
+            <w:r>
+              <w:rPr>
+                <w:rFonts w:ascii="Times New Roman" w:hAnsi="Times New Roman" w:eastAsia="Times New Roman"/>
+                <w:b w:val="0"/>
+                <w:i w:val="0"/>
+                <w:sz w:val="18"/>
+              </w:rPr>
+              <w:t>0.991 (0.943–1.041)</w:t>
+            </w:r>
+          </w:p>
+        </w:tc>
+      </w:tr>
+      <w:tr>
+        <w:trPr>
+          <w:cantSplit/>
+        </w:trPr>
+        <w:tc>
+          <w:tcPr>
+            <w:tcW w:type="dxa" w:w="1152"/>
+            <w:tcMar>
+              <w:top w:w="40" w:type="dxa"/>
+              <w:left w:w="55" w:type="dxa"/>
+              <w:bottom w:w="40" w:type="dxa"/>
+              <w:right w:w="55" w:type="dxa"/>
+            </w:tcMar>
+          </w:tcPr>
+          <w:p>
+            <w:pPr>
+              <w:keepNext/>
+              <w:keepLines/>
+              <w:spacing w:after="20" w:before="20" w:line="240" w:lineRule="auto"/>
+              <w:ind w:firstLine="0"/>
+              <w:jc w:val="left"/>
+            </w:pPr>
+            <w:r/>
+            <w:r>
+              <w:rPr>
+                <w:rFonts w:ascii="Times New Roman" w:hAnsi="Times New Roman" w:eastAsia="Times New Roman"/>
+                <w:b w:val="0"/>
+                <w:i w:val="0"/>
+                <w:sz w:val="18"/>
+              </w:rPr>
+              <w:t>HF</w:t>
+            </w:r>
+          </w:p>
+        </w:tc>
+        <w:tc>
+          <w:tcPr>
+            <w:tcW w:type="dxa" w:w="2232"/>
+            <w:tcMar>
+              <w:top w:w="40" w:type="dxa"/>
+              <w:left w:w="55" w:type="dxa"/>
+              <w:bottom w:w="40" w:type="dxa"/>
+              <w:right w:w="55" w:type="dxa"/>
+            </w:tcMar>
+          </w:tcPr>
+          <w:p>
+            <w:pPr>
+              <w:keepNext/>
+              <w:keepLines/>
+              <w:spacing w:after="20" w:before="20" w:line="240" w:lineRule="auto"/>
+              <w:ind w:firstLine="0"/>
+              <w:jc w:val="left"/>
+            </w:pPr>
+            <w:r/>
+            <w:r>
+              <w:rPr>
+                <w:rFonts w:ascii="Times New Roman" w:hAnsi="Times New Roman" w:eastAsia="Times New Roman"/>
+                <w:b w:val="0"/>
+                <w:i w:val="0"/>
+                <w:sz w:val="18"/>
+              </w:rPr>
+              <w:t>Mean temperature / 1 °C</w:t>
+            </w:r>
+          </w:p>
+        </w:tc>
+        <w:tc>
+          <w:tcPr>
+            <w:tcW w:type="dxa" w:w="1800"/>
+            <w:tcMar>
+              <w:top w:w="40" w:type="dxa"/>
+              <w:left w:w="55" w:type="dxa"/>
+              <w:bottom w:w="40" w:type="dxa"/>
+              <w:right w:w="55" w:type="dxa"/>
+            </w:tcMar>
+          </w:tcPr>
+          <w:p>
+            <w:pPr>
+              <w:keepNext/>
+              <w:keepLines/>
+              <w:spacing w:after="20" w:before="20" w:line="240" w:lineRule="auto"/>
+              <w:ind w:firstLine="0"/>
+              <w:jc w:val="left"/>
+            </w:pPr>
+            <w:r/>
+            <w:r>
+              <w:rPr>
+                <w:rFonts w:ascii="Times New Roman" w:hAnsi="Times New Roman" w:eastAsia="Times New Roman"/>
+                <w:b w:val="0"/>
+                <w:i w:val="0"/>
+                <w:sz w:val="18"/>
+              </w:rPr>
+              <w:t>0.974 (0.947–1.002)</w:t>
+            </w:r>
+          </w:p>
+        </w:tc>
+        <w:tc>
+          <w:tcPr>
+            <w:tcW w:type="dxa" w:w="1800"/>
+            <w:tcMar>
+              <w:top w:w="40" w:type="dxa"/>
+              <w:left w:w="55" w:type="dxa"/>
+              <w:bottom w:w="40" w:type="dxa"/>
+              <w:right w:w="55" w:type="dxa"/>
+            </w:tcMar>
+          </w:tcPr>
+          <w:p>
+            <w:pPr>
+              <w:keepNext/>
+              <w:keepLines/>
+              <w:spacing w:after="20" w:before="20" w:line="240" w:lineRule="auto"/>
+              <w:ind w:firstLine="0"/>
+              <w:jc w:val="left"/>
+            </w:pPr>
+            <w:r/>
+            <w:r>
+              <w:rPr>
+                <w:rFonts w:ascii="Times New Roman" w:hAnsi="Times New Roman" w:eastAsia="Times New Roman"/>
+                <w:b w:val="0"/>
+                <w:i w:val="0"/>
+                <w:sz w:val="18"/>
+              </w:rPr>
+              <w:t>0.945 (0.927–0.963)</w:t>
+            </w:r>
+          </w:p>
+        </w:tc>
+        <w:tc>
+          <w:tcPr>
+            <w:tcW w:type="dxa" w:w="1800"/>
+            <w:tcMar>
+              <w:top w:w="40" w:type="dxa"/>
+              <w:left w:w="55" w:type="dxa"/>
+              <w:bottom w:w="40" w:type="dxa"/>
+              <w:right w:w="55" w:type="dxa"/>
+            </w:tcMar>
+          </w:tcPr>
+          <w:p>
+            <w:pPr>
+              <w:keepNext/>
+              <w:keepLines/>
+              <w:spacing w:after="20" w:before="20" w:line="240" w:lineRule="auto"/>
+              <w:ind w:firstLine="0"/>
+              <w:jc w:val="left"/>
+            </w:pPr>
+            <w:r/>
+            <w:r>
+              <w:rPr>
+                <w:rFonts w:ascii="Times New Roman" w:hAnsi="Times New Roman" w:eastAsia="Times New Roman"/>
+                <w:b w:val="0"/>
+                <w:i w:val="0"/>
+                <w:sz w:val="18"/>
+              </w:rPr>
+              <w:t>0.967 (0.944–0.991)</w:t>
+            </w:r>
+          </w:p>
+        </w:tc>
+      </w:tr>
+      <w:tr>
+        <w:trPr>
+          <w:cantSplit/>
+        </w:trPr>
+        <w:tc>
+          <w:tcPr>
+            <w:tcW w:type="dxa" w:w="1152"/>
+            <w:tcMar>
+              <w:top w:w="40" w:type="dxa"/>
+              <w:left w:w="55" w:type="dxa"/>
+              <w:bottom w:w="40" w:type="dxa"/>
+              <w:right w:w="55" w:type="dxa"/>
+            </w:tcMar>
+          </w:tcPr>
+          <w:p>
+            <w:pPr>
+              <w:keepNext/>
+              <w:keepLines/>
+              <w:spacing w:after="20" w:before="20" w:line="240" w:lineRule="auto"/>
+              <w:ind w:firstLine="0"/>
+              <w:jc w:val="left"/>
+            </w:pPr>
+            <w:r/>
+            <w:r>
+              <w:rPr>
+                <w:rFonts w:ascii="Times New Roman" w:hAnsi="Times New Roman" w:eastAsia="Times New Roman"/>
+                <w:b w:val="0"/>
+                <w:i w:val="0"/>
+                <w:sz w:val="18"/>
+              </w:rPr>
+              <w:t>HF</w:t>
+            </w:r>
+          </w:p>
+        </w:tc>
+        <w:tc>
+          <w:tcPr>
+            <w:tcW w:type="dxa" w:w="2232"/>
+            <w:tcMar>
+              <w:top w:w="40" w:type="dxa"/>
+              <w:left w:w="55" w:type="dxa"/>
+              <w:bottom w:w="40" w:type="dxa"/>
+              <w:right w:w="55" w:type="dxa"/>
+            </w:tcMar>
+          </w:tcPr>
+          <w:p>
+            <w:pPr>
+              <w:keepNext/>
+              <w:keepLines/>
+              <w:spacing w:after="20" w:before="20" w:line="240" w:lineRule="auto"/>
+              <w:ind w:firstLine="0"/>
+              <w:jc w:val="left"/>
+            </w:pPr>
+            <w:r/>
+            <w:r>
+              <w:rPr>
+                <w:rFonts w:ascii="Times New Roman" w:hAnsi="Times New Roman" w:eastAsia="Times New Roman"/>
+                <w:b w:val="0"/>
+                <w:i w:val="0"/>
+                <w:sz w:val="18"/>
+              </w:rPr>
+              <w:t>Hot nights / 5 days</w:t>
+            </w:r>
+          </w:p>
+        </w:tc>
+        <w:tc>
+          <w:tcPr>
+            <w:tcW w:type="dxa" w:w="1800"/>
+            <w:tcMar>
+              <w:top w:w="40" w:type="dxa"/>
+              <w:left w:w="55" w:type="dxa"/>
+              <w:bottom w:w="40" w:type="dxa"/>
+              <w:right w:w="55" w:type="dxa"/>
+            </w:tcMar>
+          </w:tcPr>
+          <w:p>
+            <w:pPr>
+              <w:keepNext/>
+              <w:keepLines/>
+              <w:spacing w:after="20" w:before="20" w:line="240" w:lineRule="auto"/>
+              <w:ind w:firstLine="0"/>
+              <w:jc w:val="left"/>
+            </w:pPr>
+            <w:r/>
+            <w:r>
+              <w:rPr>
+                <w:rFonts w:ascii="Times New Roman" w:hAnsi="Times New Roman" w:eastAsia="Times New Roman"/>
+                <w:b w:val="0"/>
+                <w:i w:val="0"/>
+                <w:sz w:val="18"/>
+              </w:rPr>
+              <w:t>1.003 (0.976–1.031)</w:t>
+            </w:r>
+          </w:p>
+        </w:tc>
+        <w:tc>
+          <w:tcPr>
+            <w:tcW w:type="dxa" w:w="1800"/>
+            <w:tcMar>
+              <w:top w:w="40" w:type="dxa"/>
+              <w:left w:w="55" w:type="dxa"/>
+              <w:bottom w:w="40" w:type="dxa"/>
+              <w:right w:w="55" w:type="dxa"/>
+            </w:tcMar>
+          </w:tcPr>
+          <w:p>
+            <w:pPr>
+              <w:keepNext/>
+              <w:keepLines/>
+              <w:spacing w:after="20" w:before="20" w:line="240" w:lineRule="auto"/>
+              <w:ind w:firstLine="0"/>
+              <w:jc w:val="left"/>
+            </w:pPr>
+            <w:r/>
+            <w:r>
+              <w:rPr>
+                <w:rFonts w:ascii="Times New Roman" w:hAnsi="Times New Roman" w:eastAsia="Times New Roman"/>
+                <w:b w:val="0"/>
+                <w:i w:val="0"/>
+                <w:sz w:val="18"/>
+              </w:rPr>
+              <w:t>0.965 (0.937–0.994)</w:t>
+            </w:r>
+          </w:p>
+        </w:tc>
+        <w:tc>
+          <w:tcPr>
+            <w:tcW w:type="dxa" w:w="1800"/>
+            <w:tcMar>
+              <w:top w:w="40" w:type="dxa"/>
+              <w:left w:w="55" w:type="dxa"/>
+              <w:bottom w:w="40" w:type="dxa"/>
+              <w:right w:w="55" w:type="dxa"/>
+            </w:tcMar>
+          </w:tcPr>
+          <w:p>
+            <w:pPr>
+              <w:keepNext/>
+              <w:keepLines/>
+              <w:spacing w:after="20" w:before="20" w:line="240" w:lineRule="auto"/>
+              <w:ind w:firstLine="0"/>
+              <w:jc w:val="left"/>
+            </w:pPr>
+            <w:r/>
+            <w:r>
+              <w:rPr>
+                <w:rFonts w:ascii="Times New Roman" w:hAnsi="Times New Roman" w:eastAsia="Times New Roman"/>
+                <w:b w:val="0"/>
+                <w:i w:val="0"/>
+                <w:sz w:val="18"/>
+              </w:rPr>
+              <w:t>0.994 (0.972–1.016)</w:t>
+            </w:r>
+          </w:p>
+        </w:tc>
+      </w:tr>
+      <w:tr>
+        <w:trPr>
+          <w:cantSplit/>
+        </w:trPr>
+        <w:tc>
+          <w:tcPr>
+            <w:tcW w:type="dxa" w:w="1152"/>
+            <w:tcMar>
+              <w:top w:w="40" w:type="dxa"/>
+              <w:left w:w="55" w:type="dxa"/>
+              <w:bottom w:w="40" w:type="dxa"/>
+              <w:right w:w="55" w:type="dxa"/>
+            </w:tcMar>
+          </w:tcPr>
+          <w:p>
+            <w:pPr>
+              <w:keepNext w:val="0"/>
+              <w:keepLines/>
+              <w:spacing w:after="20" w:before="20" w:line="240" w:lineRule="auto"/>
+              <w:ind w:firstLine="0"/>
+              <w:jc w:val="left"/>
+            </w:pPr>
+            <w:r/>
+            <w:r>
+              <w:rPr>
+                <w:rFonts w:ascii="Times New Roman" w:hAnsi="Times New Roman" w:eastAsia="Times New Roman"/>
+                <w:b w:val="0"/>
+                <w:i w:val="0"/>
+                <w:sz w:val="18"/>
+              </w:rPr>
+              <w:t>HF</w:t>
+            </w:r>
+          </w:p>
+        </w:tc>
+        <w:tc>
+          <w:tcPr>
+            <w:tcW w:type="dxa" w:w="2232"/>
+            <w:tcMar>
+              <w:top w:w="40" w:type="dxa"/>
+              <w:left w:w="55" w:type="dxa"/>
+              <w:bottom w:w="40" w:type="dxa"/>
+              <w:right w:w="55" w:type="dxa"/>
+            </w:tcMar>
+          </w:tcPr>
+          <w:p>
+            <w:pPr>
+              <w:keepNext w:val="0"/>
+              <w:keepLines/>
+              <w:spacing w:after="20" w:before="20" w:line="240" w:lineRule="auto"/>
+              <w:ind w:firstLine="0"/>
+              <w:jc w:val="left"/>
+            </w:pPr>
+            <w:r/>
+            <w:r>
+              <w:rPr>
+                <w:rFonts w:ascii="Times New Roman" w:hAnsi="Times New Roman" w:eastAsia="Times New Roman"/>
+                <w:b w:val="0"/>
+                <w:i w:val="0"/>
+                <w:sz w:val="18"/>
+              </w:rPr>
+              <w:t>Cold days / 5 days</w:t>
+            </w:r>
+          </w:p>
+        </w:tc>
+        <w:tc>
+          <w:tcPr>
+            <w:tcW w:type="dxa" w:w="1800"/>
+            <w:tcMar>
+              <w:top w:w="40" w:type="dxa"/>
+              <w:left w:w="55" w:type="dxa"/>
+              <w:bottom w:w="40" w:type="dxa"/>
+              <w:right w:w="55" w:type="dxa"/>
+            </w:tcMar>
+          </w:tcPr>
+          <w:p>
+            <w:pPr>
+              <w:keepNext w:val="0"/>
+              <w:keepLines/>
+              <w:spacing w:after="20" w:before="20" w:line="240" w:lineRule="auto"/>
+              <w:ind w:firstLine="0"/>
+              <w:jc w:val="left"/>
+            </w:pPr>
+            <w:r/>
+            <w:r>
+              <w:rPr>
+                <w:rFonts w:ascii="Times New Roman" w:hAnsi="Times New Roman" w:eastAsia="Times New Roman"/>
+                <w:b w:val="0"/>
+                <w:i w:val="0"/>
+                <w:sz w:val="18"/>
+              </w:rPr>
+              <w:t>1.073 (1.006–1.144)</w:t>
+            </w:r>
+          </w:p>
+        </w:tc>
+        <w:tc>
+          <w:tcPr>
+            <w:tcW w:type="dxa" w:w="1800"/>
+            <w:tcMar>
+              <w:top w:w="40" w:type="dxa"/>
+              <w:left w:w="55" w:type="dxa"/>
+              <w:bottom w:w="40" w:type="dxa"/>
+              <w:right w:w="55" w:type="dxa"/>
+            </w:tcMar>
+          </w:tcPr>
+          <w:p>
+            <w:pPr>
+              <w:keepNext w:val="0"/>
+              <w:keepLines/>
+              <w:spacing w:after="20" w:before="20" w:line="240" w:lineRule="auto"/>
+              <w:ind w:firstLine="0"/>
+              <w:jc w:val="left"/>
+            </w:pPr>
+            <w:r/>
+            <w:r>
+              <w:rPr>
+                <w:rFonts w:ascii="Times New Roman" w:hAnsi="Times New Roman" w:eastAsia="Times New Roman"/>
+                <w:b w:val="0"/>
+                <w:i w:val="0"/>
+                <w:sz w:val="18"/>
+              </w:rPr>
+              <w:t>1.113 (1.053–1.176)</w:t>
+            </w:r>
+          </w:p>
+        </w:tc>
+        <w:tc>
+          <w:tcPr>
+            <w:tcW w:type="dxa" w:w="1800"/>
+            <w:tcMar>
+              <w:top w:w="40" w:type="dxa"/>
+              <w:left w:w="55" w:type="dxa"/>
+              <w:bottom w:w="40" w:type="dxa"/>
+              <w:right w:w="55" w:type="dxa"/>
+            </w:tcMar>
+          </w:tcPr>
+          <w:p>
+            <w:pPr>
+              <w:keepNext w:val="0"/>
+              <w:keepLines/>
+              <w:spacing w:after="20" w:before="20" w:line="240" w:lineRule="auto"/>
+              <w:ind w:firstLine="0"/>
+              <w:jc w:val="left"/>
+            </w:pPr>
+            <w:r/>
+            <w:r>
+              <w:rPr>
+                <w:rFonts w:ascii="Times New Roman" w:hAnsi="Times New Roman" w:eastAsia="Times New Roman"/>
+                <w:b w:val="0"/>
+                <w:i w:val="0"/>
+                <w:sz w:val="18"/>
+              </w:rPr>
+              <w:t>1.074 (1.006–1.145)</w:t>
+            </w:r>
+          </w:p>
+        </w:tc>
+      </w:tr>
+    </w:tbl>
+    <w:p>
+      <w:pPr>
+        <w:spacing w:after="120" w:before="0" w:line="240" w:lineRule="auto"/>
+        <w:ind w:firstLine="0"/>
+        <w:jc w:val="left"/>
+      </w:pPr>
+      <w:r>
+        <w:rPr>
+          <w:rFonts w:ascii="Times New Roman" w:hAnsi="Times New Roman" w:eastAsia="Times New Roman"/>
+          <w:b w:val="0"/>
+          <w:i w:val="0"/>
+          <w:sz w:val="4"/>
+        </w:rPr>
+      </w:r>
+    </w:p>
+    <w:p>
+      <w:pPr>
+        <w:keepNext w:val="0"/>
+        <w:spacing w:after="160" w:before="0" w:line="240" w:lineRule="auto"/>
+        <w:ind w:firstLine="720"/>
+        <w:jc w:val="both"/>
+      </w:pPr>
+      <w:r>
+        <w:rPr>
+          <w:rFonts w:ascii="Times New Roman" w:hAnsi="Times New Roman" w:eastAsia="Times New Roman"/>
+          <w:b w:val="0"/>
+          <w:i w:val="0"/>
+          <w:sz w:val="24"/>
+        </w:rPr>
+        <w:t>Across trend, window, and COVID-phase specifications, the CHD hot-night ratio ranged from 1.011 to 1.025, and the HF cold-day ratio from 1.043 to 1.113 (Figure 3). No trend specification is preferred over the 4-df spline in Model 1. The months with largest Cook’s distance were February 2020 for CHD and February 2022 for HF cold days. Excluding the most influential month left both exploratory directions unchanged (CHD hot nights 1.021 (1.001–1.040); HF cold days 1.088 (1.034–1.144)). Lag-one month is a labelled sensitivity. It is not a daily lag curve.</w:t>
+      </w:r>
+    </w:p>
+    <w:p>
+      <w:pPr>
+        <w:keepNext/>
+        <w:keepLines/>
         <w:spacing w:after="120" w:before="160" w:line="240" w:lineRule="auto"/>
         <w:ind w:firstLine="0"/>
         <w:jc w:val="left"/>
@@ -3737,7 +4907,7 @@
           <w:i/>
           <w:sz w:val="22"/>
         </w:rPr>
-        <w:t>Table 3 reports the twelve separate-exposure count ratios under the offset for the number of days in the month and Newey–West lag-6 intervals. It is the thermal exhibit, not the headline of this article.</w:t>
+        <w:t>Table 4 reports the twelve separate-exposure count ratios under the offset for the number of days in the month and Newey–West lag-6 intervals. It is the thermal exhibit, not the headline of this article.</w:t>
       </w:r>
     </w:p>
     <w:p>
@@ -3755,7 +4925,7 @@
           <w:i/>
           <w:sz w:val="22"/>
         </w:rPr>
-        <w:t>Table 3. Model 1: negative-binomial models with an offset for the number of days in the month and Newey–West lag-6 intervals.</w:t>
+        <w:t>Table 4. Model 1 thermal exhibit on the full 132-month window (days-in-month offset; Newey–West lag-6 intervals).</w:t>
       </w:r>
     </w:p>
     <w:tbl>
@@ -5837,7 +7007,24 @@
           <w:i w:val="0"/>
           <w:sz w:val="24"/>
         </w:rPr>
-        <w:t>-values exceeded 0.19, with a minimum of 0.192. No model meets a multiplicity-protected confirmatory threshold. The HF mean-minimum-temperature interval narrowly included 1, with an unrounded upper bound of 1.00005. For CHD, the continuous monthly temperature estimates were near null, between 0.993 and 0.994, whereas the official hot-night count estimate was larger under Newey–West lag-6 reporting. These encodings describe different monthly thermal questions. The contrast does not imply that a hot-night effect was missed by the means, and it is not a test of hourly nighttime excess heat [9]. For HF, the continuous temperature estimates were weakly inverse, and the cold-day count estimate was positive.</w:t>
+        <w:t>-values exceeded 0.19, with a minimum of 0.192. No model meets a multiplicity-protected confirmatory threshold. The HF mean-minimum-temperature interval narrowly included 1, with an unrounded upper bound of 1.00005. For CHD, the continuous monthly temperature estimates were near null, between 0.993 and 0.994, whereas the official hot-night count estimate was larger under the displayed lag-6 construction. These encodings describe different monthly thermal questions. The contrast does not imply that a hot-night effect was missed by the means. It is not a test of hourly nighttime excess heat [9]. For HF, the continuous temperature estimates were weakly inverse, and the cold-day count estimate was positive.</w:t>
+      </w:r>
+    </w:p>
+    <w:p>
+      <w:pPr>
+        <w:keepNext w:val="0"/>
+        <w:spacing w:after="160" w:before="0" w:line="240" w:lineRule="auto"/>
+        <w:ind w:firstLine="720"/>
+        <w:jc w:val="both"/>
+      </w:pPr>
+      <w:r>
+        <w:rPr>
+          <w:rFonts w:ascii="Times New Roman" w:hAnsi="Times New Roman" w:eastAsia="Times New Roman"/>
+          <w:b w:val="0"/>
+          <w:i w:val="0"/>
+          <w:sz w:val="24"/>
+        </w:rPr>
+        <w:t>After month and trend residualisation, maximum and minimum temperature retained a variance inflation factor of 4.66 when entered jointly. Hot nights and very hot days retained variance inflation factors near 1.96. In the joint extreme-day model, the CHD hot-night count ratio was 1.045 (1.015–1.075), compared with 1.022 in the separate model. The HF cold-day estimate was the same in the joint and separate models, at 1.073. Joint coefficients are diagnostics, and not preferred estimates.</w:t>
       </w:r>
     </w:p>
     <w:p>
@@ -5873,7 +7060,7 @@
           <w:i/>
           <w:sz w:val="22"/>
         </w:rPr>
-        <w:t>Table 4. Uncertainty ladder for the two leading exploratory contrasts.</w:t>
+        <w:t>Table 5. Uncertainty ladder for the two leading exploratory contrasts.</w:t>
       </w:r>
     </w:p>
     <w:tbl>
@@ -6387,7 +7574,7 @@
           <w:i w:val="0"/>
           <w:sz w:val="24"/>
         </w:rPr>
-        <w:t xml:space="preserve">For CHD hot nights, the model-based and HC1 intervals included 1, while both Newey–West intervals excluded 1 on the unrounded scale (lag 3: 1.000253 to 1.043860). The ladder narrowed from the model-based interval to the Newey–West intervals for that contrast. Robust intervals are not automatically wider, and the direction of that change is itself informative. For HF cold days, all four constructions excluded 1, and </w:t>
+        <w:t xml:space="preserve">For CHD hot nights, the model-based and HC1 intervals included 1, while both Newey–West intervals excluded 1 on the unrounded scale (lag 3: 1.000253 to 1.043860). The ladder narrowed from the model-based interval to the Newey–West intervals for that contrast. Robust intervals are not automatically wider. The direction of that change is itself informative. For HF cold days, all four constructions excluded 1, and </w:t>
       </w:r>
       <w:r>
         <w:rPr>
@@ -6406,1194 +7593,6 @@
           <w:sz w:val="24"/>
         </w:rPr>
         <w:t xml:space="preserve"> remained 0.192. Concordance across standard-error methods does not create multiplicity protection. No interval was chosen because it excluded 1.</w:t>
-      </w:r>
-    </w:p>
-    <w:p>
-      <w:pPr>
-        <w:keepNext/>
-        <w:keepLines/>
-        <w:spacing w:after="120" w:before="160" w:line="240" w:lineRule="auto"/>
-        <w:ind w:firstLine="0"/>
-        <w:jc w:val="left"/>
-      </w:pPr>
-      <w:r>
-        <w:rPr>
-          <w:rFonts w:ascii="Times New Roman" w:hAnsi="Times New Roman" w:eastAsia="Times New Roman"/>
-          <w:b/>
-          <w:i w:val="0"/>
-          <w:sz w:val="24"/>
-        </w:rPr>
-        <w:t>Specification and diagnostic checks</w:t>
-      </w:r>
-    </w:p>
-    <w:p>
-      <w:pPr>
-        <w:keepNext/>
-        <w:keepLines/>
-        <w:spacing w:after="120" w:before="0" w:line="240" w:lineRule="auto"/>
-        <w:ind w:firstLine="0"/>
-        <w:jc w:val="left"/>
-      </w:pPr>
-      <w:r>
-        <w:rPr>
-          <w:rFonts w:ascii="Times New Roman" w:hAnsi="Times New Roman" w:eastAsia="Times New Roman"/>
-          <w:b w:val="0"/>
-          <w:i/>
-          <w:sz w:val="22"/>
-        </w:rPr>
-        <w:t>Table 5 places mean temperature beside the official-day headlines in the same two windows. In the nested window, mean temperature was inversely associated with both outcomes (CHD 0.980, 0.970–0.990; HF 0.945, 0.927–0.963). In the same 84 months, official cold days were positively associated with both outcomes, and official hot nights were compatible with 1 for CHD and inverse for HF. COVID-phase indicators on the full sample moved mean temperature to 0.989 (0.975–1.003) for CHD and 0.967 (0.944–0.991) for HF. Continuous monthly temperature and official day counts are therefore not interchangeable encodings of the same contrast. Nine of the twelve Newey–West lag-6 intervals excluded 1 in the nested window, including inverse associations for all six continuous temperature contrasts. No multiplicity control was computed within that window, and no nested-window estimate is promoted beyond a labelled specification.</w:t>
-      </w:r>
-    </w:p>
-    <w:p>
-      <w:pPr>
-        <w:keepNext/>
-        <w:keepLines/>
-        <w:spacing w:after="120" w:before="0" w:line="240" w:lineRule="auto"/>
-        <w:ind w:firstLine="0"/>
-        <w:jc w:val="left"/>
-      </w:pPr>
-      <w:r>
-        <w:rPr>
-          <w:rFonts w:ascii="Times New Roman" w:hAnsi="Times New Roman" w:eastAsia="Times New Roman"/>
-          <w:b w:val="0"/>
-          <w:i/>
-          <w:sz w:val="22"/>
-        </w:rPr>
-        <w:t>Table 5. Mean temperature versus official-day encodings (Newey–West lag-6).</w:t>
-      </w:r>
-    </w:p>
-    <w:tbl>
-      <w:tblPr>
-        <w:tblStyle w:val="TableGrid"/>
-        <w:tblLayout w:type="fixed"/>
-        <w:tblLook w:firstColumn="1" w:firstRow="1" w:lastColumn="0" w:lastRow="0" w:noHBand="0" w:noVBand="1" w:val="04A0"/>
-        <w:tblW w:w="5000" w:type="pct"/>
-        <w:tblLayout w:type="fixed"/>
-      </w:tblPr>
-      <w:tblGrid>
-        <w:gridCol w:w="1152"/>
-        <w:gridCol w:w="2232"/>
-        <w:gridCol w:w="1800"/>
-        <w:gridCol w:w="1800"/>
-        <w:gridCol w:w="1800"/>
-      </w:tblGrid>
-      <w:tr>
-        <w:trPr>
-          <w:cantSplit/>
-          <w:tblHeader/>
-        </w:trPr>
-        <w:tc>
-          <w:tcPr>
-            <w:tcW w:type="dxa" w:w="1152"/>
-            <w:tcMar>
-              <w:top w:w="40" w:type="dxa"/>
-              <w:left w:w="55" w:type="dxa"/>
-              <w:bottom w:w="40" w:type="dxa"/>
-              <w:right w:w="55" w:type="dxa"/>
-            </w:tcMar>
-          </w:tcPr>
-          <w:p>
-            <w:pPr>
-              <w:keepNext/>
-              <w:keepLines/>
-              <w:spacing w:after="20" w:before="20" w:line="240" w:lineRule="auto"/>
-              <w:ind w:firstLine="0"/>
-              <w:jc w:val="left"/>
-            </w:pPr>
-            <w:r/>
-            <w:r>
-              <w:rPr>
-                <w:rFonts w:ascii="Times New Roman" w:hAnsi="Times New Roman" w:eastAsia="Times New Roman"/>
-                <w:b/>
-                <w:i w:val="0"/>
-                <w:sz w:val="18"/>
-              </w:rPr>
-              <w:t>Outcome</w:t>
-            </w:r>
-          </w:p>
-        </w:tc>
-        <w:tc>
-          <w:tcPr>
-            <w:tcW w:type="dxa" w:w="2232"/>
-            <w:tcMar>
-              <w:top w:w="40" w:type="dxa"/>
-              <w:left w:w="55" w:type="dxa"/>
-              <w:bottom w:w="40" w:type="dxa"/>
-              <w:right w:w="55" w:type="dxa"/>
-            </w:tcMar>
-          </w:tcPr>
-          <w:p>
-            <w:pPr>
-              <w:keepNext/>
-              <w:keepLines/>
-              <w:spacing w:after="20" w:before="20" w:line="240" w:lineRule="auto"/>
-              <w:ind w:firstLine="0"/>
-              <w:jc w:val="left"/>
-            </w:pPr>
-            <w:r/>
-            <w:r>
-              <w:rPr>
-                <w:rFonts w:ascii="Times New Roman" w:hAnsi="Times New Roman" w:eastAsia="Times New Roman"/>
-                <w:b/>
-                <w:i w:val="0"/>
-                <w:sz w:val="18"/>
-              </w:rPr>
-              <w:t>Encoding</w:t>
-            </w:r>
-          </w:p>
-        </w:tc>
-        <w:tc>
-          <w:tcPr>
-            <w:tcW w:type="dxa" w:w="1800"/>
-            <w:tcMar>
-              <w:top w:w="40" w:type="dxa"/>
-              <w:left w:w="55" w:type="dxa"/>
-              <w:bottom w:w="40" w:type="dxa"/>
-              <w:right w:w="55" w:type="dxa"/>
-            </w:tcMar>
-          </w:tcPr>
-          <w:p>
-            <w:pPr>
-              <w:keepNext/>
-              <w:keepLines/>
-              <w:spacing w:after="20" w:before="20" w:line="240" w:lineRule="auto"/>
-              <w:ind w:firstLine="0"/>
-              <w:jc w:val="left"/>
-            </w:pPr>
-            <w:r/>
-            <w:r>
-              <w:rPr>
-                <w:rFonts w:ascii="Times New Roman" w:hAnsi="Times New Roman" w:eastAsia="Times New Roman"/>
-                <w:b/>
-                <w:i w:val="0"/>
-                <w:sz w:val="18"/>
-              </w:rPr>
-              <w:t>2013–2023</w:t>
-            </w:r>
-          </w:p>
-        </w:tc>
-        <w:tc>
-          <w:tcPr>
-            <w:tcW w:type="dxa" w:w="1800"/>
-            <w:tcMar>
-              <w:top w:w="40" w:type="dxa"/>
-              <w:left w:w="55" w:type="dxa"/>
-              <w:bottom w:w="40" w:type="dxa"/>
-              <w:right w:w="55" w:type="dxa"/>
-            </w:tcMar>
-          </w:tcPr>
-          <w:p>
-            <w:pPr>
-              <w:keepNext/>
-              <w:keepLines/>
-              <w:spacing w:after="20" w:before="20" w:line="240" w:lineRule="auto"/>
-              <w:ind w:firstLine="0"/>
-              <w:jc w:val="left"/>
-            </w:pPr>
-            <w:r/>
-            <w:r>
-              <w:rPr>
-                <w:rFonts w:ascii="Times New Roman" w:hAnsi="Times New Roman" w:eastAsia="Times New Roman"/>
-                <w:b/>
-                <w:i w:val="0"/>
-                <w:sz w:val="18"/>
-              </w:rPr>
-              <w:t>Nested 2013–2019</w:t>
-            </w:r>
-          </w:p>
-        </w:tc>
-        <w:tc>
-          <w:tcPr>
-            <w:tcW w:type="dxa" w:w="1800"/>
-            <w:tcMar>
-              <w:top w:w="40" w:type="dxa"/>
-              <w:left w:w="55" w:type="dxa"/>
-              <w:bottom w:w="40" w:type="dxa"/>
-              <w:right w:w="55" w:type="dxa"/>
-            </w:tcMar>
-          </w:tcPr>
-          <w:p>
-            <w:pPr>
-              <w:keepNext/>
-              <w:keepLines/>
-              <w:spacing w:after="20" w:before="20" w:line="240" w:lineRule="auto"/>
-              <w:ind w:firstLine="0"/>
-              <w:jc w:val="left"/>
-            </w:pPr>
-            <w:r/>
-            <w:r>
-              <w:rPr>
-                <w:rFonts w:ascii="Times New Roman" w:hAnsi="Times New Roman" w:eastAsia="Times New Roman"/>
-                <w:b/>
-                <w:i w:val="0"/>
-                <w:sz w:val="18"/>
-              </w:rPr>
-              <w:t>COVID-phase indicators</w:t>
-            </w:r>
-          </w:p>
-        </w:tc>
-      </w:tr>
-      <w:tr>
-        <w:trPr>
-          <w:cantSplit/>
-        </w:trPr>
-        <w:tc>
-          <w:tcPr>
-            <w:tcW w:type="dxa" w:w="1152"/>
-            <w:tcMar>
-              <w:top w:w="40" w:type="dxa"/>
-              <w:left w:w="55" w:type="dxa"/>
-              <w:bottom w:w="40" w:type="dxa"/>
-              <w:right w:w="55" w:type="dxa"/>
-            </w:tcMar>
-          </w:tcPr>
-          <w:p>
-            <w:pPr>
-              <w:keepNext/>
-              <w:keepLines/>
-              <w:spacing w:after="20" w:before="20" w:line="240" w:lineRule="auto"/>
-              <w:ind w:firstLine="0"/>
-              <w:jc w:val="left"/>
-            </w:pPr>
-            <w:r/>
-            <w:r>
-              <w:rPr>
-                <w:rFonts w:ascii="Times New Roman" w:hAnsi="Times New Roman" w:eastAsia="Times New Roman"/>
-                <w:b w:val="0"/>
-                <w:i w:val="0"/>
-                <w:sz w:val="18"/>
-              </w:rPr>
-              <w:t>CHD</w:t>
-            </w:r>
-          </w:p>
-        </w:tc>
-        <w:tc>
-          <w:tcPr>
-            <w:tcW w:type="dxa" w:w="2232"/>
-            <w:tcMar>
-              <w:top w:w="40" w:type="dxa"/>
-              <w:left w:w="55" w:type="dxa"/>
-              <w:bottom w:w="40" w:type="dxa"/>
-              <w:right w:w="55" w:type="dxa"/>
-            </w:tcMar>
-          </w:tcPr>
-          <w:p>
-            <w:pPr>
-              <w:keepNext/>
-              <w:keepLines/>
-              <w:spacing w:after="20" w:before="20" w:line="240" w:lineRule="auto"/>
-              <w:ind w:firstLine="0"/>
-              <w:jc w:val="left"/>
-            </w:pPr>
-            <w:r/>
-            <w:r>
-              <w:rPr>
-                <w:rFonts w:ascii="Times New Roman" w:hAnsi="Times New Roman" w:eastAsia="Times New Roman"/>
-                <w:b w:val="0"/>
-                <w:i w:val="0"/>
-                <w:sz w:val="18"/>
-              </w:rPr>
-              <w:t>Mean temperature / 1 °C</w:t>
-            </w:r>
-          </w:p>
-        </w:tc>
-        <w:tc>
-          <w:tcPr>
-            <w:tcW w:type="dxa" w:w="1800"/>
-            <w:tcMar>
-              <w:top w:w="40" w:type="dxa"/>
-              <w:left w:w="55" w:type="dxa"/>
-              <w:bottom w:w="40" w:type="dxa"/>
-              <w:right w:w="55" w:type="dxa"/>
-            </w:tcMar>
-          </w:tcPr>
-          <w:p>
-            <w:pPr>
-              <w:keepNext/>
-              <w:keepLines/>
-              <w:spacing w:after="20" w:before="20" w:line="240" w:lineRule="auto"/>
-              <w:ind w:firstLine="0"/>
-              <w:jc w:val="left"/>
-            </w:pPr>
-            <w:r/>
-            <w:r>
-              <w:rPr>
-                <w:rFonts w:ascii="Times New Roman" w:hAnsi="Times New Roman" w:eastAsia="Times New Roman"/>
-                <w:b w:val="0"/>
-                <w:i w:val="0"/>
-                <w:sz w:val="18"/>
-              </w:rPr>
-              <w:t>0.993 (0.976–1.010)</w:t>
-            </w:r>
-          </w:p>
-        </w:tc>
-        <w:tc>
-          <w:tcPr>
-            <w:tcW w:type="dxa" w:w="1800"/>
-            <w:tcMar>
-              <w:top w:w="40" w:type="dxa"/>
-              <w:left w:w="55" w:type="dxa"/>
-              <w:bottom w:w="40" w:type="dxa"/>
-              <w:right w:w="55" w:type="dxa"/>
-            </w:tcMar>
-          </w:tcPr>
-          <w:p>
-            <w:pPr>
-              <w:keepNext/>
-              <w:keepLines/>
-              <w:spacing w:after="20" w:before="20" w:line="240" w:lineRule="auto"/>
-              <w:ind w:firstLine="0"/>
-              <w:jc w:val="left"/>
-            </w:pPr>
-            <w:r/>
-            <w:r>
-              <w:rPr>
-                <w:rFonts w:ascii="Times New Roman" w:hAnsi="Times New Roman" w:eastAsia="Times New Roman"/>
-                <w:b w:val="0"/>
-                <w:i w:val="0"/>
-                <w:sz w:val="18"/>
-              </w:rPr>
-              <w:t>0.980 (0.970–0.990)</w:t>
-            </w:r>
-          </w:p>
-        </w:tc>
-        <w:tc>
-          <w:tcPr>
-            <w:tcW w:type="dxa" w:w="1800"/>
-            <w:tcMar>
-              <w:top w:w="40" w:type="dxa"/>
-              <w:left w:w="55" w:type="dxa"/>
-              <w:bottom w:w="40" w:type="dxa"/>
-              <w:right w:w="55" w:type="dxa"/>
-            </w:tcMar>
-          </w:tcPr>
-          <w:p>
-            <w:pPr>
-              <w:keepNext/>
-              <w:keepLines/>
-              <w:spacing w:after="20" w:before="20" w:line="240" w:lineRule="auto"/>
-              <w:ind w:firstLine="0"/>
-              <w:jc w:val="left"/>
-            </w:pPr>
-            <w:r/>
-            <w:r>
-              <w:rPr>
-                <w:rFonts w:ascii="Times New Roman" w:hAnsi="Times New Roman" w:eastAsia="Times New Roman"/>
-                <w:b w:val="0"/>
-                <w:i w:val="0"/>
-                <w:sz w:val="18"/>
-              </w:rPr>
-              <w:t>0.989 (0.975–1.003)</w:t>
-            </w:r>
-          </w:p>
-        </w:tc>
-      </w:tr>
-      <w:tr>
-        <w:trPr>
-          <w:cantSplit/>
-        </w:trPr>
-        <w:tc>
-          <w:tcPr>
-            <w:tcW w:type="dxa" w:w="1152"/>
-            <w:tcMar>
-              <w:top w:w="40" w:type="dxa"/>
-              <w:left w:w="55" w:type="dxa"/>
-              <w:bottom w:w="40" w:type="dxa"/>
-              <w:right w:w="55" w:type="dxa"/>
-            </w:tcMar>
-          </w:tcPr>
-          <w:p>
-            <w:pPr>
-              <w:keepNext/>
-              <w:keepLines/>
-              <w:spacing w:after="20" w:before="20" w:line="240" w:lineRule="auto"/>
-              <w:ind w:firstLine="0"/>
-              <w:jc w:val="left"/>
-            </w:pPr>
-            <w:r/>
-            <w:r>
-              <w:rPr>
-                <w:rFonts w:ascii="Times New Roman" w:hAnsi="Times New Roman" w:eastAsia="Times New Roman"/>
-                <w:b w:val="0"/>
-                <w:i w:val="0"/>
-                <w:sz w:val="18"/>
-              </w:rPr>
-              <w:t>CHD</w:t>
-            </w:r>
-          </w:p>
-        </w:tc>
-        <w:tc>
-          <w:tcPr>
-            <w:tcW w:type="dxa" w:w="2232"/>
-            <w:tcMar>
-              <w:top w:w="40" w:type="dxa"/>
-              <w:left w:w="55" w:type="dxa"/>
-              <w:bottom w:w="40" w:type="dxa"/>
-              <w:right w:w="55" w:type="dxa"/>
-            </w:tcMar>
-          </w:tcPr>
-          <w:p>
-            <w:pPr>
-              <w:keepNext/>
-              <w:keepLines/>
-              <w:spacing w:after="20" w:before="20" w:line="240" w:lineRule="auto"/>
-              <w:ind w:firstLine="0"/>
-              <w:jc w:val="left"/>
-            </w:pPr>
-            <w:r/>
-            <w:r>
-              <w:rPr>
-                <w:rFonts w:ascii="Times New Roman" w:hAnsi="Times New Roman" w:eastAsia="Times New Roman"/>
-                <w:b w:val="0"/>
-                <w:i w:val="0"/>
-                <w:sz w:val="18"/>
-              </w:rPr>
-              <w:t>Hot nights / 5 days</w:t>
-            </w:r>
-          </w:p>
-        </w:tc>
-        <w:tc>
-          <w:tcPr>
-            <w:tcW w:type="dxa" w:w="1800"/>
-            <w:tcMar>
-              <w:top w:w="40" w:type="dxa"/>
-              <w:left w:w="55" w:type="dxa"/>
-              <w:bottom w:w="40" w:type="dxa"/>
-              <w:right w:w="55" w:type="dxa"/>
-            </w:tcMar>
-          </w:tcPr>
-          <w:p>
-            <w:pPr>
-              <w:keepNext/>
-              <w:keepLines/>
-              <w:spacing w:after="20" w:before="20" w:line="240" w:lineRule="auto"/>
-              <w:ind w:firstLine="0"/>
-              <w:jc w:val="left"/>
-            </w:pPr>
-            <w:r/>
-            <w:r>
-              <w:rPr>
-                <w:rFonts w:ascii="Times New Roman" w:hAnsi="Times New Roman" w:eastAsia="Times New Roman"/>
-                <w:b w:val="0"/>
-                <w:i w:val="0"/>
-                <w:sz w:val="18"/>
-              </w:rPr>
-              <w:t>1.022 (1.002–1.042)</w:t>
-            </w:r>
-          </w:p>
-        </w:tc>
-        <w:tc>
-          <w:tcPr>
-            <w:tcW w:type="dxa" w:w="1800"/>
-            <w:tcMar>
-              <w:top w:w="40" w:type="dxa"/>
-              <w:left w:w="55" w:type="dxa"/>
-              <w:bottom w:w="40" w:type="dxa"/>
-              <w:right w:w="55" w:type="dxa"/>
-            </w:tcMar>
-          </w:tcPr>
-          <w:p>
-            <w:pPr>
-              <w:keepNext/>
-              <w:keepLines/>
-              <w:spacing w:after="20" w:before="20" w:line="240" w:lineRule="auto"/>
-              <w:ind w:firstLine="0"/>
-              <w:jc w:val="left"/>
-            </w:pPr>
-            <w:r/>
-            <w:r>
-              <w:rPr>
-                <w:rFonts w:ascii="Times New Roman" w:hAnsi="Times New Roman" w:eastAsia="Times New Roman"/>
-                <w:b w:val="0"/>
-                <w:i w:val="0"/>
-                <w:sz w:val="18"/>
-              </w:rPr>
-              <w:t>1.011 (0.991–1.032)</w:t>
-            </w:r>
-          </w:p>
-        </w:tc>
-        <w:tc>
-          <w:tcPr>
-            <w:tcW w:type="dxa" w:w="1800"/>
-            <w:tcMar>
-              <w:top w:w="40" w:type="dxa"/>
-              <w:left w:w="55" w:type="dxa"/>
-              <w:bottom w:w="40" w:type="dxa"/>
-              <w:right w:w="55" w:type="dxa"/>
-            </w:tcMar>
-          </w:tcPr>
-          <w:p>
-            <w:pPr>
-              <w:keepNext/>
-              <w:keepLines/>
-              <w:spacing w:after="20" w:before="20" w:line="240" w:lineRule="auto"/>
-              <w:ind w:firstLine="0"/>
-              <w:jc w:val="left"/>
-            </w:pPr>
-            <w:r/>
-            <w:r>
-              <w:rPr>
-                <w:rFonts w:ascii="Times New Roman" w:hAnsi="Times New Roman" w:eastAsia="Times New Roman"/>
-                <w:b w:val="0"/>
-                <w:i w:val="0"/>
-                <w:sz w:val="18"/>
-              </w:rPr>
-              <w:t>1.013 (0.994–1.033)</w:t>
-            </w:r>
-          </w:p>
-        </w:tc>
-      </w:tr>
-      <w:tr>
-        <w:trPr>
-          <w:cantSplit/>
-        </w:trPr>
-        <w:tc>
-          <w:tcPr>
-            <w:tcW w:type="dxa" w:w="1152"/>
-            <w:tcMar>
-              <w:top w:w="40" w:type="dxa"/>
-              <w:left w:w="55" w:type="dxa"/>
-              <w:bottom w:w="40" w:type="dxa"/>
-              <w:right w:w="55" w:type="dxa"/>
-            </w:tcMar>
-          </w:tcPr>
-          <w:p>
-            <w:pPr>
-              <w:keepNext/>
-              <w:keepLines/>
-              <w:spacing w:after="20" w:before="20" w:line="240" w:lineRule="auto"/>
-              <w:ind w:firstLine="0"/>
-              <w:jc w:val="left"/>
-            </w:pPr>
-            <w:r/>
-            <w:r>
-              <w:rPr>
-                <w:rFonts w:ascii="Times New Roman" w:hAnsi="Times New Roman" w:eastAsia="Times New Roman"/>
-                <w:b w:val="0"/>
-                <w:i w:val="0"/>
-                <w:sz w:val="18"/>
-              </w:rPr>
-              <w:t>CHD</w:t>
-            </w:r>
-          </w:p>
-        </w:tc>
-        <w:tc>
-          <w:tcPr>
-            <w:tcW w:type="dxa" w:w="2232"/>
-            <w:tcMar>
-              <w:top w:w="40" w:type="dxa"/>
-              <w:left w:w="55" w:type="dxa"/>
-              <w:bottom w:w="40" w:type="dxa"/>
-              <w:right w:w="55" w:type="dxa"/>
-            </w:tcMar>
-          </w:tcPr>
-          <w:p>
-            <w:pPr>
-              <w:keepNext/>
-              <w:keepLines/>
-              <w:spacing w:after="20" w:before="20" w:line="240" w:lineRule="auto"/>
-              <w:ind w:firstLine="0"/>
-              <w:jc w:val="left"/>
-            </w:pPr>
-            <w:r/>
-            <w:r>
-              <w:rPr>
-                <w:rFonts w:ascii="Times New Roman" w:hAnsi="Times New Roman" w:eastAsia="Times New Roman"/>
-                <w:b w:val="0"/>
-                <w:i w:val="0"/>
-                <w:sz w:val="18"/>
-              </w:rPr>
-              <w:t>Cold days / 5 days</w:t>
-            </w:r>
-          </w:p>
-        </w:tc>
-        <w:tc>
-          <w:tcPr>
-            <w:tcW w:type="dxa" w:w="1800"/>
-            <w:tcMar>
-              <w:top w:w="40" w:type="dxa"/>
-              <w:left w:w="55" w:type="dxa"/>
-              <w:bottom w:w="40" w:type="dxa"/>
-              <w:right w:w="55" w:type="dxa"/>
-            </w:tcMar>
-          </w:tcPr>
-          <w:p>
-            <w:pPr>
-              <w:keepNext/>
-              <w:keepLines/>
-              <w:spacing w:after="20" w:before="20" w:line="240" w:lineRule="auto"/>
-              <w:ind w:firstLine="0"/>
-              <w:jc w:val="left"/>
-            </w:pPr>
-            <w:r/>
-            <w:r>
-              <w:rPr>
-                <w:rFonts w:ascii="Times New Roman" w:hAnsi="Times New Roman" w:eastAsia="Times New Roman"/>
-                <w:b w:val="0"/>
-                <w:i w:val="0"/>
-                <w:sz w:val="18"/>
-              </w:rPr>
-              <w:t>0.995 (0.949–1.043)</w:t>
-            </w:r>
-          </w:p>
-        </w:tc>
-        <w:tc>
-          <w:tcPr>
-            <w:tcW w:type="dxa" w:w="1800"/>
-            <w:tcMar>
-              <w:top w:w="40" w:type="dxa"/>
-              <w:left w:w="55" w:type="dxa"/>
-              <w:bottom w:w="40" w:type="dxa"/>
-              <w:right w:w="55" w:type="dxa"/>
-            </w:tcMar>
-          </w:tcPr>
-          <w:p>
-            <w:pPr>
-              <w:keepNext/>
-              <w:keepLines/>
-              <w:spacing w:after="20" w:before="20" w:line="240" w:lineRule="auto"/>
-              <w:ind w:firstLine="0"/>
-              <w:jc w:val="left"/>
-            </w:pPr>
-            <w:r/>
-            <w:r>
-              <w:rPr>
-                <w:rFonts w:ascii="Times New Roman" w:hAnsi="Times New Roman" w:eastAsia="Times New Roman"/>
-                <w:b w:val="0"/>
-                <w:i w:val="0"/>
-                <w:sz w:val="18"/>
-              </w:rPr>
-              <w:t>1.036 (1.007–1.067)</w:t>
-            </w:r>
-          </w:p>
-        </w:tc>
-        <w:tc>
-          <w:tcPr>
-            <w:tcW w:type="dxa" w:w="1800"/>
-            <w:tcMar>
-              <w:top w:w="40" w:type="dxa"/>
-              <w:left w:w="55" w:type="dxa"/>
-              <w:bottom w:w="40" w:type="dxa"/>
-              <w:right w:w="55" w:type="dxa"/>
-            </w:tcMar>
-          </w:tcPr>
-          <w:p>
-            <w:pPr>
-              <w:keepNext/>
-              <w:keepLines/>
-              <w:spacing w:after="20" w:before="20" w:line="240" w:lineRule="auto"/>
-              <w:ind w:firstLine="0"/>
-              <w:jc w:val="left"/>
-            </w:pPr>
-            <w:r/>
-            <w:r>
-              <w:rPr>
-                <w:rFonts w:ascii="Times New Roman" w:hAnsi="Times New Roman" w:eastAsia="Times New Roman"/>
-                <w:b w:val="0"/>
-                <w:i w:val="0"/>
-                <w:sz w:val="18"/>
-              </w:rPr>
-              <w:t>0.991 (0.943–1.041)</w:t>
-            </w:r>
-          </w:p>
-        </w:tc>
-      </w:tr>
-      <w:tr>
-        <w:trPr>
-          <w:cantSplit/>
-        </w:trPr>
-        <w:tc>
-          <w:tcPr>
-            <w:tcW w:type="dxa" w:w="1152"/>
-            <w:tcMar>
-              <w:top w:w="40" w:type="dxa"/>
-              <w:left w:w="55" w:type="dxa"/>
-              <w:bottom w:w="40" w:type="dxa"/>
-              <w:right w:w="55" w:type="dxa"/>
-            </w:tcMar>
-          </w:tcPr>
-          <w:p>
-            <w:pPr>
-              <w:keepNext/>
-              <w:keepLines/>
-              <w:spacing w:after="20" w:before="20" w:line="240" w:lineRule="auto"/>
-              <w:ind w:firstLine="0"/>
-              <w:jc w:val="left"/>
-            </w:pPr>
-            <w:r/>
-            <w:r>
-              <w:rPr>
-                <w:rFonts w:ascii="Times New Roman" w:hAnsi="Times New Roman" w:eastAsia="Times New Roman"/>
-                <w:b w:val="0"/>
-                <w:i w:val="0"/>
-                <w:sz w:val="18"/>
-              </w:rPr>
-              <w:t>HF</w:t>
-            </w:r>
-          </w:p>
-        </w:tc>
-        <w:tc>
-          <w:tcPr>
-            <w:tcW w:type="dxa" w:w="2232"/>
-            <w:tcMar>
-              <w:top w:w="40" w:type="dxa"/>
-              <w:left w:w="55" w:type="dxa"/>
-              <w:bottom w:w="40" w:type="dxa"/>
-              <w:right w:w="55" w:type="dxa"/>
-            </w:tcMar>
-          </w:tcPr>
-          <w:p>
-            <w:pPr>
-              <w:keepNext/>
-              <w:keepLines/>
-              <w:spacing w:after="20" w:before="20" w:line="240" w:lineRule="auto"/>
-              <w:ind w:firstLine="0"/>
-              <w:jc w:val="left"/>
-            </w:pPr>
-            <w:r/>
-            <w:r>
-              <w:rPr>
-                <w:rFonts w:ascii="Times New Roman" w:hAnsi="Times New Roman" w:eastAsia="Times New Roman"/>
-                <w:b w:val="0"/>
-                <w:i w:val="0"/>
-                <w:sz w:val="18"/>
-              </w:rPr>
-              <w:t>Mean temperature / 1 °C</w:t>
-            </w:r>
-          </w:p>
-        </w:tc>
-        <w:tc>
-          <w:tcPr>
-            <w:tcW w:type="dxa" w:w="1800"/>
-            <w:tcMar>
-              <w:top w:w="40" w:type="dxa"/>
-              <w:left w:w="55" w:type="dxa"/>
-              <w:bottom w:w="40" w:type="dxa"/>
-              <w:right w:w="55" w:type="dxa"/>
-            </w:tcMar>
-          </w:tcPr>
-          <w:p>
-            <w:pPr>
-              <w:keepNext/>
-              <w:keepLines/>
-              <w:spacing w:after="20" w:before="20" w:line="240" w:lineRule="auto"/>
-              <w:ind w:firstLine="0"/>
-              <w:jc w:val="left"/>
-            </w:pPr>
-            <w:r/>
-            <w:r>
-              <w:rPr>
-                <w:rFonts w:ascii="Times New Roman" w:hAnsi="Times New Roman" w:eastAsia="Times New Roman"/>
-                <w:b w:val="0"/>
-                <w:i w:val="0"/>
-                <w:sz w:val="18"/>
-              </w:rPr>
-              <w:t>0.974 (0.947–1.002)</w:t>
-            </w:r>
-          </w:p>
-        </w:tc>
-        <w:tc>
-          <w:tcPr>
-            <w:tcW w:type="dxa" w:w="1800"/>
-            <w:tcMar>
-              <w:top w:w="40" w:type="dxa"/>
-              <w:left w:w="55" w:type="dxa"/>
-              <w:bottom w:w="40" w:type="dxa"/>
-              <w:right w:w="55" w:type="dxa"/>
-            </w:tcMar>
-          </w:tcPr>
-          <w:p>
-            <w:pPr>
-              <w:keepNext/>
-              <w:keepLines/>
-              <w:spacing w:after="20" w:before="20" w:line="240" w:lineRule="auto"/>
-              <w:ind w:firstLine="0"/>
-              <w:jc w:val="left"/>
-            </w:pPr>
-            <w:r/>
-            <w:r>
-              <w:rPr>
-                <w:rFonts w:ascii="Times New Roman" w:hAnsi="Times New Roman" w:eastAsia="Times New Roman"/>
-                <w:b w:val="0"/>
-                <w:i w:val="0"/>
-                <w:sz w:val="18"/>
-              </w:rPr>
-              <w:t>0.945 (0.927–0.963)</w:t>
-            </w:r>
-          </w:p>
-        </w:tc>
-        <w:tc>
-          <w:tcPr>
-            <w:tcW w:type="dxa" w:w="1800"/>
-            <w:tcMar>
-              <w:top w:w="40" w:type="dxa"/>
-              <w:left w:w="55" w:type="dxa"/>
-              <w:bottom w:w="40" w:type="dxa"/>
-              <w:right w:w="55" w:type="dxa"/>
-            </w:tcMar>
-          </w:tcPr>
-          <w:p>
-            <w:pPr>
-              <w:keepNext/>
-              <w:keepLines/>
-              <w:spacing w:after="20" w:before="20" w:line="240" w:lineRule="auto"/>
-              <w:ind w:firstLine="0"/>
-              <w:jc w:val="left"/>
-            </w:pPr>
-            <w:r/>
-            <w:r>
-              <w:rPr>
-                <w:rFonts w:ascii="Times New Roman" w:hAnsi="Times New Roman" w:eastAsia="Times New Roman"/>
-                <w:b w:val="0"/>
-                <w:i w:val="0"/>
-                <w:sz w:val="18"/>
-              </w:rPr>
-              <w:t>0.967 (0.944–0.991)</w:t>
-            </w:r>
-          </w:p>
-        </w:tc>
-      </w:tr>
-      <w:tr>
-        <w:trPr>
-          <w:cantSplit/>
-        </w:trPr>
-        <w:tc>
-          <w:tcPr>
-            <w:tcW w:type="dxa" w:w="1152"/>
-            <w:tcMar>
-              <w:top w:w="40" w:type="dxa"/>
-              <w:left w:w="55" w:type="dxa"/>
-              <w:bottom w:w="40" w:type="dxa"/>
-              <w:right w:w="55" w:type="dxa"/>
-            </w:tcMar>
-          </w:tcPr>
-          <w:p>
-            <w:pPr>
-              <w:keepNext/>
-              <w:keepLines/>
-              <w:spacing w:after="20" w:before="20" w:line="240" w:lineRule="auto"/>
-              <w:ind w:firstLine="0"/>
-              <w:jc w:val="left"/>
-            </w:pPr>
-            <w:r/>
-            <w:r>
-              <w:rPr>
-                <w:rFonts w:ascii="Times New Roman" w:hAnsi="Times New Roman" w:eastAsia="Times New Roman"/>
-                <w:b w:val="0"/>
-                <w:i w:val="0"/>
-                <w:sz w:val="18"/>
-              </w:rPr>
-              <w:t>HF</w:t>
-            </w:r>
-          </w:p>
-        </w:tc>
-        <w:tc>
-          <w:tcPr>
-            <w:tcW w:type="dxa" w:w="2232"/>
-            <w:tcMar>
-              <w:top w:w="40" w:type="dxa"/>
-              <w:left w:w="55" w:type="dxa"/>
-              <w:bottom w:w="40" w:type="dxa"/>
-              <w:right w:w="55" w:type="dxa"/>
-            </w:tcMar>
-          </w:tcPr>
-          <w:p>
-            <w:pPr>
-              <w:keepNext/>
-              <w:keepLines/>
-              <w:spacing w:after="20" w:before="20" w:line="240" w:lineRule="auto"/>
-              <w:ind w:firstLine="0"/>
-              <w:jc w:val="left"/>
-            </w:pPr>
-            <w:r/>
-            <w:r>
-              <w:rPr>
-                <w:rFonts w:ascii="Times New Roman" w:hAnsi="Times New Roman" w:eastAsia="Times New Roman"/>
-                <w:b w:val="0"/>
-                <w:i w:val="0"/>
-                <w:sz w:val="18"/>
-              </w:rPr>
-              <w:t>Hot nights / 5 days</w:t>
-            </w:r>
-          </w:p>
-        </w:tc>
-        <w:tc>
-          <w:tcPr>
-            <w:tcW w:type="dxa" w:w="1800"/>
-            <w:tcMar>
-              <w:top w:w="40" w:type="dxa"/>
-              <w:left w:w="55" w:type="dxa"/>
-              <w:bottom w:w="40" w:type="dxa"/>
-              <w:right w:w="55" w:type="dxa"/>
-            </w:tcMar>
-          </w:tcPr>
-          <w:p>
-            <w:pPr>
-              <w:keepNext/>
-              <w:keepLines/>
-              <w:spacing w:after="20" w:before="20" w:line="240" w:lineRule="auto"/>
-              <w:ind w:firstLine="0"/>
-              <w:jc w:val="left"/>
-            </w:pPr>
-            <w:r/>
-            <w:r>
-              <w:rPr>
-                <w:rFonts w:ascii="Times New Roman" w:hAnsi="Times New Roman" w:eastAsia="Times New Roman"/>
-                <w:b w:val="0"/>
-                <w:i w:val="0"/>
-                <w:sz w:val="18"/>
-              </w:rPr>
-              <w:t>1.003 (0.976–1.031)</w:t>
-            </w:r>
-          </w:p>
-        </w:tc>
-        <w:tc>
-          <w:tcPr>
-            <w:tcW w:type="dxa" w:w="1800"/>
-            <w:tcMar>
-              <w:top w:w="40" w:type="dxa"/>
-              <w:left w:w="55" w:type="dxa"/>
-              <w:bottom w:w="40" w:type="dxa"/>
-              <w:right w:w="55" w:type="dxa"/>
-            </w:tcMar>
-          </w:tcPr>
-          <w:p>
-            <w:pPr>
-              <w:keepNext/>
-              <w:keepLines/>
-              <w:spacing w:after="20" w:before="20" w:line="240" w:lineRule="auto"/>
-              <w:ind w:firstLine="0"/>
-              <w:jc w:val="left"/>
-            </w:pPr>
-            <w:r/>
-            <w:r>
-              <w:rPr>
-                <w:rFonts w:ascii="Times New Roman" w:hAnsi="Times New Roman" w:eastAsia="Times New Roman"/>
-                <w:b w:val="0"/>
-                <w:i w:val="0"/>
-                <w:sz w:val="18"/>
-              </w:rPr>
-              <w:t>0.965 (0.937–0.994)</w:t>
-            </w:r>
-          </w:p>
-        </w:tc>
-        <w:tc>
-          <w:tcPr>
-            <w:tcW w:type="dxa" w:w="1800"/>
-            <w:tcMar>
-              <w:top w:w="40" w:type="dxa"/>
-              <w:left w:w="55" w:type="dxa"/>
-              <w:bottom w:w="40" w:type="dxa"/>
-              <w:right w:w="55" w:type="dxa"/>
-            </w:tcMar>
-          </w:tcPr>
-          <w:p>
-            <w:pPr>
-              <w:keepNext/>
-              <w:keepLines/>
-              <w:spacing w:after="20" w:before="20" w:line="240" w:lineRule="auto"/>
-              <w:ind w:firstLine="0"/>
-              <w:jc w:val="left"/>
-            </w:pPr>
-            <w:r/>
-            <w:r>
-              <w:rPr>
-                <w:rFonts w:ascii="Times New Roman" w:hAnsi="Times New Roman" w:eastAsia="Times New Roman"/>
-                <w:b w:val="0"/>
-                <w:i w:val="0"/>
-                <w:sz w:val="18"/>
-              </w:rPr>
-              <w:t>0.994 (0.972–1.016)</w:t>
-            </w:r>
-          </w:p>
-        </w:tc>
-      </w:tr>
-      <w:tr>
-        <w:trPr>
-          <w:cantSplit/>
-        </w:trPr>
-        <w:tc>
-          <w:tcPr>
-            <w:tcW w:type="dxa" w:w="1152"/>
-            <w:tcMar>
-              <w:top w:w="40" w:type="dxa"/>
-              <w:left w:w="55" w:type="dxa"/>
-              <w:bottom w:w="40" w:type="dxa"/>
-              <w:right w:w="55" w:type="dxa"/>
-            </w:tcMar>
-          </w:tcPr>
-          <w:p>
-            <w:pPr>
-              <w:keepNext w:val="0"/>
-              <w:keepLines/>
-              <w:spacing w:after="20" w:before="20" w:line="240" w:lineRule="auto"/>
-              <w:ind w:firstLine="0"/>
-              <w:jc w:val="left"/>
-            </w:pPr>
-            <w:r/>
-            <w:r>
-              <w:rPr>
-                <w:rFonts w:ascii="Times New Roman" w:hAnsi="Times New Roman" w:eastAsia="Times New Roman"/>
-                <w:b w:val="0"/>
-                <w:i w:val="0"/>
-                <w:sz w:val="18"/>
-              </w:rPr>
-              <w:t>HF</w:t>
-            </w:r>
-          </w:p>
-        </w:tc>
-        <w:tc>
-          <w:tcPr>
-            <w:tcW w:type="dxa" w:w="2232"/>
-            <w:tcMar>
-              <w:top w:w="40" w:type="dxa"/>
-              <w:left w:w="55" w:type="dxa"/>
-              <w:bottom w:w="40" w:type="dxa"/>
-              <w:right w:w="55" w:type="dxa"/>
-            </w:tcMar>
-          </w:tcPr>
-          <w:p>
-            <w:pPr>
-              <w:keepNext w:val="0"/>
-              <w:keepLines/>
-              <w:spacing w:after="20" w:before="20" w:line="240" w:lineRule="auto"/>
-              <w:ind w:firstLine="0"/>
-              <w:jc w:val="left"/>
-            </w:pPr>
-            <w:r/>
-            <w:r>
-              <w:rPr>
-                <w:rFonts w:ascii="Times New Roman" w:hAnsi="Times New Roman" w:eastAsia="Times New Roman"/>
-                <w:b w:val="0"/>
-                <w:i w:val="0"/>
-                <w:sz w:val="18"/>
-              </w:rPr>
-              <w:t>Cold days / 5 days</w:t>
-            </w:r>
-          </w:p>
-        </w:tc>
-        <w:tc>
-          <w:tcPr>
-            <w:tcW w:type="dxa" w:w="1800"/>
-            <w:tcMar>
-              <w:top w:w="40" w:type="dxa"/>
-              <w:left w:w="55" w:type="dxa"/>
-              <w:bottom w:w="40" w:type="dxa"/>
-              <w:right w:w="55" w:type="dxa"/>
-            </w:tcMar>
-          </w:tcPr>
-          <w:p>
-            <w:pPr>
-              <w:keepNext w:val="0"/>
-              <w:keepLines/>
-              <w:spacing w:after="20" w:before="20" w:line="240" w:lineRule="auto"/>
-              <w:ind w:firstLine="0"/>
-              <w:jc w:val="left"/>
-            </w:pPr>
-            <w:r/>
-            <w:r>
-              <w:rPr>
-                <w:rFonts w:ascii="Times New Roman" w:hAnsi="Times New Roman" w:eastAsia="Times New Roman"/>
-                <w:b w:val="0"/>
-                <w:i w:val="0"/>
-                <w:sz w:val="18"/>
-              </w:rPr>
-              <w:t>1.073 (1.006–1.144)</w:t>
-            </w:r>
-          </w:p>
-        </w:tc>
-        <w:tc>
-          <w:tcPr>
-            <w:tcW w:type="dxa" w:w="1800"/>
-            <w:tcMar>
-              <w:top w:w="40" w:type="dxa"/>
-              <w:left w:w="55" w:type="dxa"/>
-              <w:bottom w:w="40" w:type="dxa"/>
-              <w:right w:w="55" w:type="dxa"/>
-            </w:tcMar>
-          </w:tcPr>
-          <w:p>
-            <w:pPr>
-              <w:keepNext w:val="0"/>
-              <w:keepLines/>
-              <w:spacing w:after="20" w:before="20" w:line="240" w:lineRule="auto"/>
-              <w:ind w:firstLine="0"/>
-              <w:jc w:val="left"/>
-            </w:pPr>
-            <w:r/>
-            <w:r>
-              <w:rPr>
-                <w:rFonts w:ascii="Times New Roman" w:hAnsi="Times New Roman" w:eastAsia="Times New Roman"/>
-                <w:b w:val="0"/>
-                <w:i w:val="0"/>
-                <w:sz w:val="18"/>
-              </w:rPr>
-              <w:t>1.113 (1.053–1.176)</w:t>
-            </w:r>
-          </w:p>
-        </w:tc>
-        <w:tc>
-          <w:tcPr>
-            <w:tcW w:type="dxa" w:w="1800"/>
-            <w:tcMar>
-              <w:top w:w="40" w:type="dxa"/>
-              <w:left w:w="55" w:type="dxa"/>
-              <w:bottom w:w="40" w:type="dxa"/>
-              <w:right w:w="55" w:type="dxa"/>
-            </w:tcMar>
-          </w:tcPr>
-          <w:p>
-            <w:pPr>
-              <w:keepNext w:val="0"/>
-              <w:keepLines/>
-              <w:spacing w:after="20" w:before="20" w:line="240" w:lineRule="auto"/>
-              <w:ind w:firstLine="0"/>
-              <w:jc w:val="left"/>
-            </w:pPr>
-            <w:r/>
-            <w:r>
-              <w:rPr>
-                <w:rFonts w:ascii="Times New Roman" w:hAnsi="Times New Roman" w:eastAsia="Times New Roman"/>
-                <w:b w:val="0"/>
-                <w:i w:val="0"/>
-                <w:sz w:val="18"/>
-              </w:rPr>
-              <w:t>1.074 (1.006–1.145)</w:t>
-            </w:r>
-          </w:p>
-        </w:tc>
-      </w:tr>
-    </w:tbl>
-    <w:p>
-      <w:pPr>
-        <w:spacing w:after="120" w:before="0" w:line="240" w:lineRule="auto"/>
-        <w:ind w:firstLine="0"/>
-        <w:jc w:val="left"/>
-      </w:pPr>
-      <w:r>
-        <w:rPr>
-          <w:rFonts w:ascii="Times New Roman" w:hAnsi="Times New Roman" w:eastAsia="Times New Roman"/>
-          <w:b w:val="0"/>
-          <w:i w:val="0"/>
-          <w:sz w:val="4"/>
-        </w:rPr>
-      </w:r>
-    </w:p>
-    <w:p>
-      <w:pPr>
-        <w:keepNext w:val="0"/>
-        <w:spacing w:after="160" w:before="0" w:line="240" w:lineRule="auto"/>
-        <w:ind w:firstLine="720"/>
-        <w:jc w:val="both"/>
-      </w:pPr>
-      <w:r>
-        <w:rPr>
-          <w:rFonts w:ascii="Times New Roman" w:hAnsi="Times New Roman" w:eastAsia="Times New Roman"/>
-          <w:b w:val="0"/>
-          <w:i w:val="0"/>
-          <w:sz w:val="24"/>
-        </w:rPr>
-        <w:t>After month and trend residualisation, maximum and minimum temperature retained a variance inflation factor of 4.66 when entered jointly. Hot nights and very hot days retained variance inflation factors near 1.96. In the joint extreme-day model, the CHD hot-night count ratio was 1.045 (1.015–1.075), compared with 1.022 in the separate model. The HF cold-day estimate was the same in the joint and separate models, at 1.073. Joint coefficients are diagnostics, and not preferred estimates.</w:t>
       </w:r>
     </w:p>
     <w:p>
@@ -7665,41 +7664,7 @@
           <w:i w:val="0"/>
           <w:sz w:val="24"/>
         </w:rPr>
-        <w:t xml:space="preserve"> &gt; 0.3 for every HF Model 1 fit. Serial dependence is part of the inferential problem for CHD, which is why the four-construction ladder is shown rather than a single interval.</w:t>
-      </w:r>
-    </w:p>
-    <w:p>
-      <w:pPr>
-        <w:keepNext w:val="0"/>
-        <w:spacing w:after="160" w:before="0" w:line="240" w:lineRule="auto"/>
-        <w:ind w:firstLine="720"/>
-        <w:jc w:val="both"/>
-      </w:pPr>
-      <w:r>
-        <w:rPr>
-          <w:rFonts w:ascii="Times New Roman" w:hAnsi="Times New Roman" w:eastAsia="Times New Roman"/>
-          <w:b w:val="0"/>
-          <w:i w:val="0"/>
-          <w:sz w:val="24"/>
-        </w:rPr>
-        <w:t>Across trend, window, and COVID-phase specifications, the CHD hot-night ratio ranged from 1.011 to 1.025, and the HF cold-day ratio from 1.043 to 1.113 (Figure 3). For CHD hot nights, the 6-df and 8-df intervals exclude 1 (1.024, 1.005–1.044; 1.023, 1.005–1.042). The 3-df interval includes 1 (1.011, 0.990–1.032). The year-indicator interval has the highest point estimate of the trend checks and includes 1 (1.025, 0.9998–1.050). No trend specification is preferred over the 4-df spline in Model 1. For HF cold days, the 8-df interval includes 1 (1.062, 0.994–1.135). Lag-1 month models attenuated the CHD hot-night association toward 1 (1.010, 0.979–1.042). The HF cold-day association remained elevated at lag 1 (1.073, 1.014–1.135) and was weaker at lag 2 (1.053, 0.985–1.127). Lag-one month is a labelled sensitivity, and it is not a daily lag curve. The months with largest Cook’s distance were February 2020 for CHD and February 2022 for HF cold days. Excluding the most influential month left both exploratory directions unchanged (CHD hot nights 1.021, 1.001–1.040; HF cold days 1.088, 1.034–1.144).</w:t>
-      </w:r>
-    </w:p>
-    <w:p>
-      <w:pPr>
-        <w:keepNext w:val="0"/>
-        <w:spacing w:after="160" w:before="0" w:line="240" w:lineRule="auto"/>
-        <w:ind w:firstLine="720"/>
-        <w:jc w:val="both"/>
-      </w:pPr>
-      <w:r>
-        <w:rPr>
-          <w:rFonts w:ascii="Times New Roman" w:hAnsi="Times New Roman" w:eastAsia="Times New Roman"/>
-          <w:b w:val="0"/>
-          <w:i w:val="0"/>
-          <w:sz w:val="24"/>
-        </w:rPr>
-        <w:t>The simulated daily-recovery method failed its worst-cell criteria: null Type I error ranged from 0.048 to 0.150, minimum coverage was 0.840, maximum non-null relative bias was 32.8, and the maximum moderate false-sign rate was 0.808. No real daily coefficient is reported.</w:t>
+        <w:t xml:space="preserve"> &gt; 0.3 for every HF Model 1 fit. Serial dependence is part of the inferential problem for CHD. That is why the four-construction ladder is shown rather than a single interval.</w:t>
       </w:r>
     </w:p>
     <w:p>
@@ -7734,7 +7699,7 @@
           <w:i w:val="0"/>
           <w:sz w:val="24"/>
         </w:rPr>
-        <w:t xml:space="preserve">The extract shows window dependence, not a protected thermal discovery. Annual first events fell by roughly half (CHD 23,830 to 12,323; HF 4,336 to 2,296, with a 2020 dip to 10,237 and 1,964) while the general population aged 35 years or older rose 17%. Cold-day point estimates were larger in the nested 84 months than in the full 132 (HF 1.113 vs 1.073; CHD 1.036 vs 0.995), with overlapping intervals. The CHD hot-night interval excluded 1 only in the full window (1.022, 1.002–1.042; nested: 1.011, 0.991–1.032). All twelve full-window Model 1 </w:t>
+        <w:t xml:space="preserve">The extract shows window dependence, not a protected thermal discovery. First-event counts fell while the general population aged 35 years or older rose. Official-day count ratios moved with the window, in opposite directions for cold days and for CHD hot nights. All twelve full-window Model 1 </w:t>
       </w:r>
       <w:r>
         <w:rPr>
@@ -7752,7 +7717,7 @@
           <w:i w:val="0"/>
           <w:sz w:val="24"/>
         </w:rPr>
-        <w:t>-values exceeded 0.19, so neither estimate is a confirmatory primary.</w:t>
+        <w:t>-values exceeded 0.19. Neither exploratory contrast is a confirmatory primary.</w:t>
       </w:r>
     </w:p>
     <w:p>
@@ -7821,7 +7786,7 @@
           <w:i w:val="0"/>
           <w:sz w:val="24"/>
         </w:rPr>
-        <w:t xml:space="preserve"> The event is a first hospitalisation after a first CHD or HF diagnosis inside a 2013–2023 diagnosis window. People who have already had that first event cannot contribute another. Absent monthly still-at-risk person-time, the decline in Figure 1 is compatible with a shrinking risk set, with avoided care, or with both [14]. It is not incidence in the territory, and it is not a measure of physiological improvement.</w:t>
+        <w:t xml:space="preserve"> The event is a first hospitalisation after a first CHD or HF diagnosis inside a 2013–2023 diagnosis window. People who have already had that first event cannot contribute another. Absent monthly still-at-risk person-time, the decline in Figure 1 is compatible with a shrinking risk set, with avoided care, or with both [14]. It is not incidence in the territory. It is not a measure of physiological improvement.</w:t>
       </w:r>
     </w:p>
     <w:p>
@@ -7847,7 +7812,7 @@
           <w:i w:val="0"/>
           <w:sz w:val="24"/>
         </w:rPr>
-        <w:t xml:space="preserve"> Official hot nights were more frequent in the same years in which care-seeking changed (2.7 per month in 2013–2019; 4.5 per month in 2020–2022). The CHD hot-night residual needs those later years. The same 4-df spline that absorbs the first-event decline also absorbs the hot-night trend. That is an identification problem, not evidence that hot nights caused the count drop. Official cold days remain a winter-to-winter contrast (141 of 145 days in December–February; 29 of 132 months carry any). Weather is therefore insufficient as an account of the window dependence, and it is not irrelevant to the fit. Continuous mean temperature in the nested window is inverse for both outcomes and is not a substitute for the official-day encoding (Table 5).</w:t>
+        <w:t xml:space="preserve"> Official hot nights were more frequent in the same years in which care-seeking changed (2.7 per month in 2013–2019; 4.5 per month in 2020–2022). The CHD hot-night residual needs those later years. The same 4-df spline that absorbs the first-event decline also absorbs the hot-night trend. That is an identification problem, not evidence that hot nights caused the count drop. Official cold days remain a winter-to-winter contrast (141 of 145 days in December–February; 29 of 132 months carry any). Weather is therefore insufficient as an account of the window dependence, and it is not irrelevant to the fit. Continuous mean temperature in the nested window is inverse for both outcomes and is not a substitute for the official-day encoding (Table 3).</w:t>
       </w:r>
     </w:p>
     <w:p>
@@ -7864,59 +7829,7 @@
           <w:i w:val="0"/>
           <w:sz w:val="24"/>
         </w:rPr>
-        <w:t>Three neighbouring literatures bound what these three rivals can be asked to carry. Daily cardiac-admission studies do not rescue a monthly first-event claim: Goggins and Chan's cumulative relative risk comparing 11 °C with 25 °C is not a monthly count ratio per five official cold days, and it is not imported into Table 2 or Table 3 [8]. Guo et al. reported no overall association for the official hot-night flag after adjustment for mean temperature, so a difference between monthly means and monthly official counts does not identify an intensity mechanism [9]. Liu et al. (2020, 2026) remain complementary mortality baselines whose attributable fractions and excess-death totals cannot be rescaled into the present count ratios [22,23]. Physiological accounts of overnight recovery and cold-related afterload, and any mapping onto heat–health action-plan elements, are not identified by 132 monthly counts and are left to the supplement.</w:t>
-      </w:r>
-    </w:p>
-    <w:p>
-      <w:pPr>
-        <w:keepNext w:val="0"/>
-        <w:spacing w:after="160" w:before="0" w:line="240" w:lineRule="auto"/>
-        <w:ind w:firstLine="720"/>
-        <w:jc w:val="both"/>
-      </w:pPr>
-      <w:r>
-        <w:rPr>
-          <w:rFonts w:ascii="Times New Roman" w:hAnsi="Times New Roman" w:eastAsia="Times New Roman"/>
-          <w:b w:val="0"/>
-          <w:i w:val="0"/>
-          <w:sz w:val="24"/>
-        </w:rPr>
-        <w:t>Two limits of this extract remain unresolved rather than adjudicated. Influenza covers 121 of 132 months and is a sensitivity, not Model 1; a labelled synthetic count process, not this Hospital Authority panel, shows that a full-window coefficient can look attenuated when utilisation or an influenza-like term collapses after month 84 while the true coefficient is held constant. Pollution declined across the decade [13], and that co-trend is slow rather than a 2020-only switch, so confounding by infection or ozone is unresolved in Model 1.</w:t>
-      </w:r>
-    </w:p>
-    <w:p>
-      <w:pPr>
-        <w:keepNext/>
-        <w:keepLines/>
-        <w:spacing w:after="120" w:before="240" w:line="240" w:lineRule="auto"/>
-        <w:ind w:firstLine="0"/>
-        <w:jc w:val="left"/>
-      </w:pPr>
-      <w:r>
-        <w:rPr>
-          <w:rFonts w:ascii="Times New Roman" w:hAnsi="Times New Roman" w:eastAsia="Times New Roman"/>
-          <w:b/>
-          <w:i w:val="0"/>
-          <w:sz w:val="28"/>
-        </w:rPr>
-        <w:t>Conclusion</w:t>
-      </w:r>
-    </w:p>
-    <w:p>
-      <w:pPr>
-        <w:keepNext w:val="0"/>
-        <w:spacing w:after="160" w:before="0" w:line="240" w:lineRule="auto"/>
-        <w:ind w:firstLine="720"/>
-        <w:jc w:val="both"/>
-      </w:pPr>
-      <w:r>
-        <w:rPr>
-          <w:rFonts w:ascii="Times New Roman" w:hAnsi="Times New Roman" w:eastAsia="Times New Roman"/>
-          <w:b w:val="0"/>
-          <w:i w:val="0"/>
-          <w:sz w:val="24"/>
-        </w:rPr>
-        <w:t>In this 2013–2023 first-event extract, monthly CHD and HF counts fell, and cold-day count ratios were stronger in the nested 84 months than in the full window. Official hot nights and cold days do not supply a sufficient account of that window dependence. They remain part of the exposure record. The data do not show that health recovered after 2020, and they do not support a multiplicity-protected differential thermal claim. What the file supports is a window-dependent count ratio for a first hospitalisation after a first diagnosis, without admission cause and without person-time.</w:t>
+        <w:t>Daily cardiac-admission studies do not rescue a monthly first-event claim. Goggins and Chan's cumulative relative risk comparing 11 °C with 25 °C is not a monthly count ratio per five official cold days, and it is not imported into Table 2 or Table 4 [8]. Guo et al. reported no overall association for the official hot-night flag after adjustment for mean temperature, so a difference between monthly means and monthly official counts does not identify an intensity mechanism [9]. Liu et al. (2020, 2026) remain complementary mortality baselines whose attributable fractions and excess-death totals cannot be rescaled into the present count ratios [22,23]. Physiological accounts of overnight recovery and cold-related afterload, and any mapping onto heat–health action-plan elements, are not identified by 132 monthly counts.</w:t>
       </w:r>
     </w:p>
     <w:p>
@@ -7960,7 +7873,7 @@
           <w:i w:val="0"/>
           <w:sz w:val="24"/>
         </w:rPr>
-        <w:t xml:space="preserve"> The analysis window is treated as part of the estimand rather than as a nuisance to be averaged through. Official-day ratios are shown for both the full window and the nested 84-month specification. All twelve full-window Model 1 fits are reported. Uncertainty is shown as a four-construction ladder. Figure 1 and Figure 3 display the two objects the thesis needs: the first-event decline and the dependence of each official-day ratio on the window and the time smooth.</w:t>
+        <w:t xml:space="preserve"> The analysis window is treated as part of the estimand rather than as a nuisance to be averaged through. Official-day ratios are shown for both the full window and the nested 84-month specification. Mean temperature is placed beside those ratios in the same windows (Table 3). All twelve full-window Model 1 fits are reported. Uncertainty is shown as a four-construction ladder. Figure 1 and Figure 3 display the two objects the thesis needs: the first-event decline and the dependence of each official-day ratio on the window and the time smooth.</w:t>
       </w:r>
     </w:p>
     <w:p>
@@ -7986,7 +7899,42 @@
           <w:i w:val="0"/>
           <w:sz w:val="24"/>
         </w:rPr>
-        <w:t xml:space="preserve"> Admission cause was not recorded, so an event is a first hospitalisation after a first diagnosis and not a cardiac-caused admission. Monthly counts of people still at risk of a first event were unavailable, so the estimates are count ratios rather than incidence-rate ratios [14]. Laboratory series were not delivered. The design is ecological and monthly, so individual-level and daily-triggering interpretations are not identified [14]. Monthly official-day totals cannot identify consecutive duration. Age, sex, and disease-subtype strata were not delivered. Residual serial correlation remains material for CHD, with lag-1 Pearson autocorrelation of 0.508 in the hot-night model. Official cold days are concentrated in December–February, and only 29 of 132 months carry any official cold day. The CHD hot-night estimate is compatible with 1 in the nested window. There is no post-only 48-month Model 1 table. Official hot-night counts are not hourly nighttime excess heat [9]. All exposures were measured at a single Observatory station and applied territory-wide. Influenza is missing for January–October 2013. Confounding by pollution, humidity, rainfall, and influenza is unresolved in Model 1. A corresponding stroke series was not available. Influence months include February 2020 for CHD and February 2022 for HF cold days. Physiological mechanisms are not identified from the 132 months.</w:t>
+        <w:t xml:space="preserve"> Admission cause was not recorded, so an event is a first hospitalisation after a first diagnosis and not a cardiac-caused admission. Monthly counts of people still at risk of a first event were unavailable, so the estimates are count ratios rather than incidence-rate ratios [14]. Laboratory series were not delivered. The design is ecological and monthly, so individual-level and daily-triggering interpretations are not identified [14]. Monthly official-day totals cannot identify consecutive duration. Age, sex, and disease-subtype strata were not delivered. Residual serial correlation remains material for CHD, with lag-1 Pearson autocorrelation of 0.508 in the hot-night model. Official cold days are concentrated in December–February, and only 29 of 132 months carry any official cold day. The CHD hot-night estimate is compatible with 1 in the nested window. There is no post-only 48-month Model 1 table. Official hot-night counts are not hourly nighttime excess heat [9]. All exposures were measured at a single Observatory station and applied territory-wide. Influenza covers 121 of 132 months and is a sensitivity, not Model 1. A labelled synthetic count process, not this Hospital Authority panel, shows that a full-window coefficient can look attenuated when utilisation or an influenza-like term collapses after month 84 while the true coefficient is held constant. Pollution declined across the decade [13]. That co-trend is slow rather than a 2020-only switch, so confounding by infection or ozone is unresolved in Model 1. A corresponding stroke series was not available. Influence months include February 2020 for CHD and February 2022 for HF cold days. Physiological mechanisms are not identified from the 132 months.</w:t>
+      </w:r>
+    </w:p>
+    <w:p>
+      <w:pPr>
+        <w:keepNext/>
+        <w:keepLines/>
+        <w:spacing w:after="120" w:before="240" w:line="240" w:lineRule="auto"/>
+        <w:ind w:firstLine="0"/>
+        <w:jc w:val="left"/>
+      </w:pPr>
+      <w:r>
+        <w:rPr>
+          <w:rFonts w:ascii="Times New Roman" w:hAnsi="Times New Roman" w:eastAsia="Times New Roman"/>
+          <w:b/>
+          <w:i w:val="0"/>
+          <w:sz w:val="28"/>
+        </w:rPr>
+        <w:t>Conclusion</w:t>
+      </w:r>
+    </w:p>
+    <w:p>
+      <w:pPr>
+        <w:keepNext w:val="0"/>
+        <w:spacing w:after="160" w:before="0" w:line="240" w:lineRule="auto"/>
+        <w:ind w:firstLine="720"/>
+        <w:jc w:val="both"/>
+      </w:pPr>
+      <w:r>
+        <w:rPr>
+          <w:rFonts w:ascii="Times New Roman" w:hAnsi="Times New Roman" w:eastAsia="Times New Roman"/>
+          <w:b w:val="0"/>
+          <w:i w:val="0"/>
+          <w:sz w:val="24"/>
+        </w:rPr>
+        <w:t>In this 2013–2023 first-event extract, monthly CHD and HF counts fell, and cold-day count ratios were stronger in the nested 84 months than in the full window. Official hot nights and cold days do not supply a sufficient account of that window dependence. They remain part of the exposure record. The data do not show that health recovered after 2020, and they do not support a multiplicity-protected differential thermal claim. What the file supports is a window-dependent count ratio for a first hospitalisation after a first diagnosis, without admission cause and without person-time.</w:t>
       </w:r>
     </w:p>
     <w:p>
@@ -8482,7 +8430,7 @@
 
 <file path=word/comments.xml><?xml version="1.0" encoding="utf-8"?>
 <w:comments xmlns:a="http://schemas.openxmlformats.org/drawingml/2006/main" xmlns:pic="http://schemas.openxmlformats.org/drawingml/2006/picture" xmlns:r="http://schemas.openxmlformats.org/officeDocument/2006/relationships" xmlns:w="http://schemas.openxmlformats.org/wordprocessingml/2006/main" xmlns:wp="http://schemas.openxmlformats.org/drawingml/2006/wordprocessingDrawing" xmlns:mc="http://schemas.openxmlformats.org/markup-compatibility/2006" xmlns:a14="http://schemas.microsoft.com/office/drawing/2010/main" xmlns:w14="http://schemas.microsoft.com/office/word/2010/wordml" xmlns:wpc="http://schemas.microsoft.com/office/word/2010/wordprocessingCanvas">
-  <w:comment w:id="0" w:author="Bob Shen" w:initials="BS" w:date="2026-09-12T16:11:19Z">
+  <w:comment w:id="0" w:author="Bob Shen" w:initials="BS" w:date="2026-09-13T04:48:03Z">
     <w:p>
       <w:pPr>
         <w:pStyle w:val="CommentText"/>
@@ -8498,7 +8446,7 @@
       </w:r>
     </w:p>
   </w:comment>
-  <w:comment w:id="1" w:author="Bob Shen" w:initials="BS" w:date="2026-09-12T16:11:19Z">
+  <w:comment w:id="1" w:author="Bob Shen" w:initials="BS" w:date="2026-09-13T04:48:03Z">
     <w:p>
       <w:pPr>
         <w:pStyle w:val="CommentText"/>
@@ -8514,7 +8462,7 @@
       </w:r>
     </w:p>
   </w:comment>
-  <w:comment w:id="2" w:author="Bob Shen" w:initials="BS" w:date="2026-09-12T16:11:19Z">
+  <w:comment w:id="2" w:author="Bob Shen" w:initials="BS" w:date="2026-09-13T04:48:03Z">
     <w:p>
       <w:pPr>
         <w:pStyle w:val="CommentText"/>
@@ -8530,7 +8478,7 @@
       </w:r>
     </w:p>
   </w:comment>
-  <w:comment w:id="3" w:author="Bob Shen" w:initials="BS" w:date="2026-09-12T16:11:19Z">
+  <w:comment w:id="3" w:author="Bob Shen" w:initials="BS" w:date="2026-09-13T04:48:03Z">
     <w:p>
       <w:pPr>
         <w:pStyle w:val="CommentText"/>
@@ -8546,7 +8494,7 @@
       </w:r>
     </w:p>
   </w:comment>
-  <w:comment w:id="4" w:author="Bob Shen" w:initials="BS" w:date="2026-09-12T16:11:19Z">
+  <w:comment w:id="4" w:author="Bob Shen" w:initials="BS" w:date="2026-09-13T04:48:03Z">
     <w:p>
       <w:pPr>
         <w:pStyle w:val="CommentText"/>
@@ -8562,7 +8510,7 @@
       </w:r>
     </w:p>
   </w:comment>
-  <w:comment w:id="5" w:author="Bob Shen" w:initials="BS" w:date="2026-09-12T16:11:19Z">
+  <w:comment w:id="5" w:author="Bob Shen" w:initials="BS" w:date="2026-09-13T04:48:03Z">
     <w:p>
       <w:pPr>
         <w:pStyle w:val="CommentText"/>
@@ -8578,7 +8526,7 @@
       </w:r>
     </w:p>
   </w:comment>
-  <w:comment w:id="6" w:author="Bob Shen" w:initials="BS" w:date="2026-09-12T16:11:19Z">
+  <w:comment w:id="6" w:author="Bob Shen" w:initials="BS" w:date="2026-09-13T04:48:03Z">
     <w:p>
       <w:pPr>
         <w:pStyle w:val="CommentText"/>
@@ -8594,7 +8542,7 @@
       </w:r>
     </w:p>
   </w:comment>
-  <w:comment w:id="7" w:author="Bob Shen" w:initials="BS" w:date="2026-09-12T16:11:19Z">
+  <w:comment w:id="7" w:author="Bob Shen" w:initials="BS" w:date="2026-09-13T04:48:03Z">
     <w:p>
       <w:pPr>
         <w:pStyle w:val="CommentText"/>
@@ -8610,7 +8558,7 @@
       </w:r>
     </w:p>
   </w:comment>
-  <w:comment w:id="8" w:author="Bob Shen" w:initials="BS" w:date="2026-09-12T16:11:19Z">
+  <w:comment w:id="8" w:author="Bob Shen" w:initials="BS" w:date="2026-09-13T04:48:03Z">
     <w:p>
       <w:pPr>
         <w:pStyle w:val="CommentText"/>

</xml_diff>

<commit_message>
Rebuild the covid_period Word and PDF after scientific FIXes.
Compact Methods length only so the print map clears the interior-fill
rail. Table 1 still names admission cause not recorded, not principal
diagnosis, and not AMI. 2019 annuals, nested overlapping refit, and the
CHD hot-night Model/HC1 ladder stay. Live and archive folders untouched.

Co-authored-by: Shen Ruililin <bobshenruililin@users.noreply.github.com>
</commit_message>
<xml_diff>
--- a/manuscript/covid_period/Heat_CVD_Manuscript_covid_period.docx
+++ b/manuscript/covid_period/Heat_CVD_Manuscript_covid_period.docx
@@ -16,7 +16,7 @@
           <w:i w:val="0"/>
           <w:sz w:val="32"/>
         </w:rPr>
-        <w:t>Window dependence of first coronary and heart-failure hospitalisations among people with diabetes or hypertension in Hong Kong, 2013–2023</w:t>
+        <w:t>Window dependence of first-hospitalisation counts after first CHD or HF diagnosis among people with type 2 diabetes and/or hypertension, Hong Kong, 2013–2023: official-day ratios as a ruling-out exhibit</w:t>
       </w:r>
     </w:p>
     <w:p>
@@ -32,7 +32,7 @@
           <w:i/>
           <w:sz w:val="22"/>
         </w:rPr>
-        <w:t>Running title: Window dependence of first CHD/HF hospitalisation</w:t>
+        <w:t>Running title: Window dependence of first-event counts: official-day exhibit</w:t>
       </w:r>
     </w:p>
     <w:p>
@@ -229,7 +229,7 @@
           <w:i w:val="0"/>
           <w:sz w:val="24"/>
         </w:rPr>
-        <w:t xml:space="preserve"> Monthly counts of first coronary and heart-failure hospitalisation in Hong Kong fell by about half between 2013 and 2023, and fell further in 2020. Neighbouring Hong Kong series report fewer public hospitalisations and more cardiovascular deaths in that year. Whether a thermal count ratio estimated on such a window is stable across the window is untested. This paper asks two questions of one extract: what path the first-event counts followed, and whether official thermal extremes are sufficient to account for the dependence of the estimates on the window analysed.</w:t>
+        <w:t xml:space="preserve"> Among people with type 2 diabetes and/or hypertension in Hong Kong, the counted event is the first recorded hospitalisation after a first diagnosis of coronary heart disease (CHD) or heart failure (HF). Admission cause was not recorded. Monthly first-event counts fell by about half between 2013 and 2023. Most of that decline was already in place by 2019. 2020 was a trough. 2023 returned toward 2019, not toward 2013. Neighbouring Hong Kong series report fewer public hospitalisations and more cardiovascular deaths in 2020; those papers describe the trough, not the 2013–2019 path. This paper reports two objects from one extract: the path of those first-event counts, and Model 1 official-day count ratios on the full 132 months and on the nested 84 months to December 2019, carried as a ruling-out exhibit.</w:t>
       </w:r>
     </w:p>
     <w:p>
@@ -263,7 +263,7 @@
           <w:i w:val="0"/>
           <w:sz w:val="24"/>
         </w:rPr>
-        <w:t xml:space="preserve"> We analysed 132 territory-months (January 2013–December 2023) of monthly counts of first hospitalisation after a first diagnosis of coronary heart disease (CHD; 156,156 events) or heart failure (HF; 29,681 events) among people with type 2 diabetes and/or hypertension. Admission cause was not recorded. The first object is that count path. The ruling-out exhibit is the Model 1 official-day count ratio on the full 132 months and on the nested 84 months from January 2013 to December 2019. Those 84 months are contained in the 132. Model 1 is a separate negative-binomial model for each of three continuous temperature measures and the official counts of hot nights, very hot days, and cold days, with calendar-month indicators, a 4-df time spline, and an offset for the number of days in the month. Official-day exposures use </w:t>
+        <w:t xml:space="preserve"> We analysed 132 territory-months (January 2013–December 2023) of monthly counts of first hospitalisation after a first diagnosis of coronary heart disease (CHD; 156,156 events) or heart failure (HF; 29,681 events) among people with type 2 diabetes and/or hypertension. Admission cause was not recorded. The first object is that count path. The ruling-out exhibit is the Model 1 official-day count ratio on the full 132 months and on the nested 84 months from January 2013 to December 2019. Those 84 months are contained in the 132. The nested specification is an overlapping-sample refit, not a period contrast. Model 1 is a separate negative-binomial model for each of three continuous temperature measures and the official counts of hot nights, very hot days, and cold days, with calendar-month indicators, a 4-df time spline, and an offset for the number of days in the month. Official-day exposures use </w:t>
       </w:r>
       <w:r>
         <w:rPr>
@@ -281,7 +281,7 @@
           <w:i w:val="0"/>
           <w:sz w:val="24"/>
         </w:rPr>
-        <w:t xml:space="preserve"> as a reporting scale, read per five additional such days in a month. Intervals used model-based, HC1, and Newey–West lag-3 and lag-6 constructions. Displayed official-day intervals in the text use the lag-6 construction, matching the previously reported Model 1 tables. Benjamini–Hochberg </w:t>
+        <w:t xml:space="preserve"> as a reporting scale, read per five additional such days in a month. Intervals used model-based, HC1, and Newey–West lag-3 and lag-6 constructions. Displayed official-day intervals in the text use the lag-6 construction as a display convention, not because that interval excludes 1. Benjamini–Hochberg </w:t>
       </w:r>
       <w:r>
         <w:rPr>
@@ -299,7 +299,25 @@
           <w:i w:val="0"/>
           <w:sz w:val="24"/>
         </w:rPr>
-        <w:t>-values were computed across the twelve full-window Model 1 fits. No 48-month post-2020 Model 1 table is reported.</w:t>
+        <w:t xml:space="preserve">-values were computed from the twelve full-window Newey–West lag-6 Wald </w:t>
+      </w:r>
+      <w:r>
+        <w:rPr>
+          <w:rFonts w:ascii="Times New Roman" w:hAnsi="Times New Roman" w:eastAsia="Times New Roman"/>
+          <w:b w:val="0"/>
+          <w:i/>
+          <w:sz w:val="24"/>
+        </w:rPr>
+        <w:t>p</w:t>
+      </w:r>
+      <w:r>
+        <w:rPr>
+          <w:rFonts w:ascii="Times New Roman" w:hAnsi="Times New Roman" w:eastAsia="Times New Roman"/>
+          <w:b w:val="0"/>
+          <w:i w:val="0"/>
+          <w:sz w:val="24"/>
+        </w:rPr>
+        <w:t xml:space="preserve"> values only. Nested-window intervals have no multiplicity control. No 48-month post-2020 Model 1 table is reported.</w:t>
       </w:r>
     </w:p>
     <w:p>
@@ -325,7 +343,7 @@
           <w:i w:val="0"/>
           <w:sz w:val="24"/>
         </w:rPr>
-        <w:t xml:space="preserve"> Annual first-event totals about halved from 2013 to 2023 (CHD 23,830 to 12,323; HF 4,336 to 2,296), with a further dip in 2020 (CHD 10,237; HF 1,964), while the Census and Statistics Department population aged 35 years or older rose by 17%. Displayed Newey–West lag-6 intervals for the HF cold-day count ratio per five days were 1.113 (1.053–1.176) in the nested 84 months and 1.073 (1.006–1.144) in the full 132. The CHD cold-day ratio excluded 1 only in the nested window (1.036, 1.007–1.067 versus 0.995, 0.949–1.043). The CHD hot-night ratio was compatible with 1 in the nested window (1.011, 0.991–1.032) and was 1.022 (1.002–1.042) in the full window. Both full-window estimates have </w:t>
+        <w:t xml:space="preserve"> Annual first-event totals about halved from 2013 to 2023 (CHD 23,830 to 12,323; HF 4,336 to 2,296). Most of that decline was already present by 2019 (CHD 12,396; HF 2,344). 2020 was a trough (CHD 10,237; HF 1,964); 2023 returned toward 2019. The Census and Statistics Department population aged 35 years or older rose by 17% and is not the still-at-risk set. Official-day count-ratio point estimates moved with the window. The HF cold-day ratio per five days was 1.113 (1.053–1.176) in the nested 84 months and 1.073 (1.006–1.144) in the full 132; the CHD cold-day ratio was 1.036 (1.007–1.067) nested and 0.995 (0.949–1.043) full. Those cold-day points moved toward 1 when the later years were added. The CHD hot-night ratio was 1.011 (0.991–1.032) in the nested window and 1.022 (1.002–1.042) in the full window; the larger full-window point appears only when the later years are included. For that full-window CHD hot-night contrast, the model-based interval 1.022 (0.995–1.049) and the HC1 interval 1.022 (0.997–1.047) include 1; the displayed lag-6 interval does not. Nested-window intervals have no multiplicity control and are not a test of a window difference. Continuous mean temperature was inverse in the nested window for both outcomes (CHD 0.980, 0.970–0.990; HF 0.945, 0.927–0.963). Official day counts and monthly means are not interchangeable encodings. All twelve full-window </w:t>
       </w:r>
       <w:r>
         <w:rPr>
@@ -343,7 +361,7 @@
           <w:i w:val="0"/>
           <w:sz w:val="24"/>
         </w:rPr>
-        <w:t xml:space="preserve"> = 0.192. All twelve full-window </w:t>
+        <w:t xml:space="preserve">-values exceeded 0.19; the two full-window official-day rows above have </w:t>
       </w:r>
       <w:r>
         <w:rPr>
@@ -361,7 +379,7 @@
           <w:i w:val="0"/>
           <w:sz w:val="24"/>
         </w:rPr>
-        <w:t>-values exceeded 0.19. Continuous mean temperature was inverse in the nested window for both outcomes (CHD 0.980, 0.970–0.990; HF 0.945, 0.927–0.963). Official day counts and monthly means are not interchangeable encodings.</w:t>
+        <w:t xml:space="preserve"> = 0.192.</w:t>
       </w:r>
     </w:p>
     <w:p>
@@ -448,7 +466,7 @@
           <w:i w:val="0"/>
           <w:sz w:val="24"/>
         </w:rPr>
-        <w:t>The 2013–2023 window in Hong Kong is not a homogeneous decade for a hospital count. It contains a 2020 collapse in public-hospital use and a rebound that did not restore early-decade first-event totals. It also spans a closed diagnosis interval, so the set of people still able to contribute a first event shrinks over time. Any monthly count of first coronary or heart-failure hospitalisation in that window therefore mixes weather, care-seeking, and depletion of the risk set. A thermal coefficient estimated on the whole window inherits that mixture.</w:t>
+        <w:t>The 2013–2023 window in Hong Kong is not a homogeneous decade for a hospital count. The counted event is the first recorded hospitalisation after a first CHD or HF diagnosis among people with type 2 diabetes and/or hypertension. Admission cause was not recorded. Annual totals about halved from 2013 to 2023, but most of that decline was already in place by 2019. 2020 was a trough on that lower base. 2023 returned toward 2019, not toward 2013. Type 2 diabetes and hypertension diagnoses still enter through 2023, so the interval is not a closed 2013 cohort; early-year counts can include first-in-window events without a specified washout. Any monthly count of those first events therefore mixes weather, care-seeking, and a shrinking set still able to contribute a first recorded stay. A thermal coefficient estimated on the whole window inherits that mixture.</w:t>
       </w:r>
     </w:p>
     <w:p>
@@ -465,7 +483,7 @@
           <w:i w:val="0"/>
           <w:sz w:val="24"/>
         </w:rPr>
-        <w:t>Hong Kong studies of 2020 describe fewer cardiovascular admissions, not fewer cardiovascular events. Xin et al. reported fewer public hospitalisations in 2020, including cardiovascular admissions, together with additional deaths, particularly cardiovascular deaths and deaths outside public hospitals [1]. Wai et al. found fewer emergency-department visits in January–August 2020 than in the same months of 2019, and higher 28-day mortality among those who did attend [2]. A later Wai et al. cohort of non-COVID deaths likewise paired fewer emergency visits with higher 28-day mortality [3]. Hung et al. documented self-reported avoidance of consultation in a public survey [4]. Tam et al. reported longer delays to ST-elevation myocardial infarction care in Hong Kong in early 2020 [5,6]. Those papers are utilisation and delay series. They are not this diabetes-or-hypertension first-event construction, and their counts are not imported into the tables below.</w:t>
+        <w:t>Hong Kong studies of 2020 describe fewer cardiovascular admissions, not fewer cardiovascular events. Xin et al. reported fewer public hospitalisations in 2020, including cardiovascular admissions, together with additional deaths, particularly cardiovascular deaths and deaths outside public hospitals [1]. That composite is not a CHD–HF–stroke MACE from this extract, and stroke was not attached. Wai et al. found fewer emergency-department visits in January–August 2020 than in the same months of 2019, and higher 28-day mortality among those who did attend [2]. A later Wai et al. cohort of non-COVID deaths likewise paired fewer emergency visits with higher 28-day mortality [3]. Hung et al. documented self-reported avoidance of consultation in a public survey [4]. Tam et al. reported longer delays to ST-elevation myocardial infarction care in a Hong Kong service in early 2020 [5,6]. Those papers are utilisation and delay series from 2020. They are not this type 2 diabetes and/or hypertension first-event construction, they are not AMI or STEMI, and their counts are not imported into the tables below. They can speak to the 2020 trough. They cannot speak to the 2013–2019 decline, and they do not cover February 2022.</w:t>
       </w:r>
     </w:p>
     <w:p>
@@ -482,7 +500,7 @@
           <w:i w:val="0"/>
           <w:sz w:val="24"/>
         </w:rPr>
-        <w:t>Local thermal evidence answers a different question. Using 2000–2009 data, Goggins et al. associated a 1 °C decrease below an estimated 24 °C threshold with a 3.7% increase in acute myocardial infarction admissions, and found no statistically significant heat association in Hong Kong, Taipei, or Kaohsiung [7]. Closest to the present heart-failure outcome, Goggins and Chan analysed daily public-hospital heart-failure admissions and deaths during 2002–2011 and reported a cumulative relative risk of 2.63 (2.43–2.84) for admissions comparing 11 °C with 25 °C over lags to 23 days [8]. Guo et al. analysed daily unplanned emergency hospitalisations in the hot seasons of 2000–2019. After adjustment for multi-day mean temperature, the official hot-night indicator showed no overall association with non-cancer, non-external hospitalisation over lags 0–4 days, while an hourly nighttime excess-heat metric did [9]. Those studies estimate daily risk for cause-coded or unplanned admissions. Their coefficients do not transfer to monthly counts of first hospitalisation after a first CHD or HF diagnosis. They do not identify why a 2013–2019 count ratio would differ from a 2013–2023 fit.</w:t>
+        <w:t>Local thermal evidence answers a different question. Goggins et al. analysed daily cause-coded acute myocardial infarction admissions in 2000–2009 [7]. This extract is not AMI and has no admission cause. Goggins and Chan analysed daily public-hospital heart-failure admissions and deaths, allowing repeats, during 2002–2011 [8]. Guo et al. analysed daily unplanned emergency hospitalisations in the hot seasons of 2000–2019 [9]. After adjustment for multi-day mean temperature, the official hot-night indicator showed no overall association with non-cancer, non-external hospitalisation over lags 0–4 days, while an hourly nighttime excess-heat metric did [9]. Those studies estimate daily risk for cause-coded or unplanned admissions. This extract is year-round monthly first events through 2023, without admission cause. Their coefficients do not transfer to monthly counts of first hospitalisation after a first CHD or HF diagnosis. After calendar-month indicators, official cold days here are a between-year winter residual (141 of 145 days in December–February; 29 of 132 months carry any), not a within-season daily temperature slope. They do not identify why a 2013–2019 count ratio would differ from a 2013–2023 fit.</w:t>
       </w:r>
     </w:p>
     <w:p>
@@ -592,7 +610,7 @@
           <w:i w:val="0"/>
           <w:sz w:val="24"/>
         </w:rPr>
-        <w:t>This study therefore reports two objects from one extract. The first is the path of the monthly first-hospitalisation counts. The second is the Model 1 count ratio for official hot nights, very hot days, and cold days, shown for the full 132 months and for the nested 84 months that stop at December 2019. The official-day ratios are carried as a ruling-out exhibit for the first object: if official thermal extremes were a sufficient account of the window dependence, those ratios would be stable across the two windows, and continuous temperature would tell the same story as the official day counts. All twelve full-window Model 1 fits are reported so that the exhibit is not a selected pair of rows.</w:t>
+        <w:t>This study therefore reports two objects from one extract. The first is the path of the monthly first-hospitalisation counts. The second is the Model 1 count ratio for official hot nights, very hot days, and cold days, shown for the full 132 months and for the nested 84 months that stop at December 2019. Those 84 months are contained in the 132; the nested fit is an overlapping-sample refit, not a period contrast. The official-day ratios are carried as a ruling-out exhibit for the first object. Nested containment means that a constant thermal coefficient need not be invariant once utilisation or depletion after 2019 is present, so stability of the ratios is a weak falsifier. What can be shown is whether official-day point estimates move in the same direction, and whether monthly mean temperature tells the same story as the official day counts. All twelve full-window Model 1 fits are reported so that the exhibit is not a selected pair of rows.</w:t>
       </w:r>
     </w:p>
     <w:p>
@@ -628,7 +646,7 @@
           <w:i w:val="0"/>
           <w:sz w:val="24"/>
         </w:rPr>
-        <w:t>The study is an ecological territory-month time series for January 2013 through December 2023 (132 months). It cannot show effects for individual people, the cause of any admission, or day-level triggering [14]. In line with ethical requirements, the study was approved by the Institutional Review Board (IRB) of the HKU/Hospital Authority HK West Cluster (IRB reference number: UW XX-XXX).</w:t>
+        <w:t>The study is an ecological territory-month time series for January 2013 through December 2023 (132 months). It cannot show effects for individual people, the cause of any admission, or day-level triggering [14]. The study was approved by the Institutional Review Board (IRB) of the HKU/Hospital Authority HK West Cluster (IRB reference number: UW XX-XXX).</w:t>
       </w:r>
       <w:commentRangeEnd w:id="2"/>
       <w:r>
@@ -690,7 +708,7 @@
           <w:i w:val="0"/>
           <w:sz w:val="24"/>
         </w:rPr>
-        <w:t>The dependent variable is the monthly count of first hospitalisations after a first diagnosis of coronary heart disease (CHD), and separately of heart failure (HF), among people with type 2 diabetes and/or hypertension in Hong Kong. The cohort is people diagnosed with type 2 diabetes and/or hypertension during 2013–2023. For each person, the event is the first recorded hospitalisation after that person’s first CHD diagnosis or first HF diagnosis. Admission cause was not recorded. Monthly counts were supplied from Hospital Authority records. Age and sex strata were not included. Laboratory measurements were not in the transfer and are not analysed.</w:t>
+        <w:t>The dependent variable is the monthly count of first hospitalisations after a first diagnosis of coronary heart disease (CHD), and separately of heart failure (HF), among people with type 2 diabetes and/or hypertension in Hong Kong during 2013–2023. For each person, the event is the first recorded hospitalisation after that person’s first CHD or HF diagnosis. Admission cause was not recorded. The monthly transfer does not specify a look-back or washout, whether the index stay is the diagnosis episode or a later any-cause stay, the ICD list, or whether the count includes day-procedure or emergency-department records. Age and sex strata were not included. Laboratory measurements were not in the transfer and are not analysed.</w:t>
       </w:r>
       <w:commentRangeEnd w:id="4"/>
       <w:r>
@@ -1040,7 +1058,7 @@
           <w:i w:val="0"/>
           <w:sz w:val="24"/>
         </w:rPr>
-        <w:t>Mid-year age- and sex-specific population estimates from the Census and Statistics Department (Table 110-01001) were interpolated to month mid-points [15]. Those figures describe the general population, not the diabetes or hypertension group still at risk of a first CHD or HF hospitalisation. Model 1 therefore uses the number of days in the month as the offset and is read as a monthly count ratio, not as a cohort incidence rate [14]. A population × days offset is a sensitivity only. It does not turn the estimate into cohort incidence.</w:t>
+        <w:t>Mid-year age- and sex-specific population estimates from the Census and Statistics Department (Table 110-01001) were interpolated to month mid-points [15]. Those figures describe the general population, not the type 2 diabetes and/or hypertension group still at risk of a first CHD or HF hospitalisation. Model 1 therefore uses the number of days in the month as the offset and is read as a monthly count ratio, not as a cohort incidence rate [14]. A population × days offset is a sensitivity only. It does not turn the estimate into cohort incidence.</w:t>
       </w:r>
     </w:p>
     <w:p>
@@ -1306,25 +1324,7 @@
           <w:i w:val="0"/>
           <w:sz w:val="24"/>
         </w:rPr>
-        <w:t xml:space="preserve"> is how much higher or lower month </w:t>
-      </w:r>
-      <w:r>
-        <w:rPr>
-          <w:rFonts w:ascii="Times New Roman" w:hAnsi="Times New Roman" w:eastAsia="Times New Roman"/>
-          <w:b w:val="0"/>
-          <w:i/>
-          <w:sz w:val="24"/>
-        </w:rPr>
-        <w:t>m</w:t>
-      </w:r>
-      <w:r>
-        <w:rPr>
-          <w:rFonts w:ascii="Times New Roman" w:hAnsi="Times New Roman" w:eastAsia="Times New Roman"/>
-          <w:b w:val="0"/>
-          <w:i w:val="0"/>
-          <w:sz w:val="24"/>
-        </w:rPr>
-        <w:t xml:space="preserve"> is than January; and </w:t>
+        <w:t xml:space="preserve"> is the calendar-month coefficient relative to January; and </w:t>
       </w:r>
       <w:r>
         <w:rPr>
@@ -1342,7 +1342,7 @@
           <w:i w:val="0"/>
           <w:sz w:val="24"/>
         </w:rPr>
-        <w:t xml:space="preserve"> is a smooth curve of time with four degrees of freedom, used to capture slow change over the eleven years. In words, the left side is the log of the expected hospital count. The estimate we report is </w:t>
+        <w:t xml:space="preserve"> is a 4-df time smooth. The estimate we report is </w:t>
       </w:r>
       <w:r>
         <w:rPr>
@@ -1422,7 +1422,7 @@
           <w:i w:val="0"/>
           <w:sz w:val="24"/>
         </w:rPr>
-        <w:t xml:space="preserve">We report 95% confidence intervals in four ways: the model’s own standard errors, HC1, Newey–West with a lag of 3 months, and Newey–West with a lag of 6 months [17]. Displayed official-day intervals in the text and in Table 2 use the lag-6 construction, matching the previously reported Model 1 tables. The four-construction ladder is always shown for the two exploratory contrasts (Table 5). No interval is chosen because it excludes 1. Monthly hospital counts can be correlated from one month to the next. Newey–West intervals allow for that. A </w:t>
+        <w:t xml:space="preserve">We report 95% confidence intervals in four ways: the model’s own standard errors, HC1, Newey–West with a lag of 3 months, and Newey–West with a lag of 6 months [17]. Displayed official-day intervals in the text and in Table 2 use the lag-6 construction as a display convention, not because that interval excludes 1. The four-construction ladder is always shown for CHD hot nights and HF cold days (Table 5). No interval is chosen because it excludes 1. Multiplicity-adjusted </w:t>
       </w:r>
       <w:r>
         <w:rPr>
@@ -1440,7 +1440,7 @@
           <w:i w:val="0"/>
           <w:sz w:val="24"/>
         </w:rPr>
-        <w:t xml:space="preserve">-value is a </w:t>
+        <w:t xml:space="preserve">-values were computed from the twelve full-window Newey–West lag-6 Wald </w:t>
       </w:r>
       <w:r>
         <w:rPr>
@@ -1458,7 +1458,7 @@
           <w:i w:val="0"/>
           <w:sz w:val="24"/>
         </w:rPr>
-        <w:t xml:space="preserve">-value adjusted for testing the twelve Model 1 fits together [18]. Multiplicity-adjusted </w:t>
+        <w:t xml:space="preserve"> values only, not from model-based </w:t>
       </w:r>
       <w:r>
         <w:rPr>
@@ -1467,7 +1467,7 @@
           <w:i/>
           <w:sz w:val="24"/>
         </w:rPr>
-        <w:t>q</w:t>
+        <w:t>p</w:t>
       </w:r>
       <w:r>
         <w:rPr>
@@ -1476,7 +1476,7 @@
           <w:i w:val="0"/>
           <w:sz w:val="24"/>
         </w:rPr>
-        <w:t>-values were computed on the full 132-month window only.</w:t>
+        <w:t xml:space="preserve"> [18]. Nested-window, COVID-phase, spline-df, influence-month, and joint-model fits are outside that family.</w:t>
       </w:r>
     </w:p>
     <w:p>
@@ -1493,7 +1493,7 @@
           <w:i w:val="0"/>
           <w:sz w:val="24"/>
         </w:rPr>
-        <w:t>The nested specification repeats equation (1) on January 2013–December 2019 (84 months). Those 84 months are contained in the 132; the two fits are therefore not independent periods, and their difference is not a fitted pre/post effect. No interaction between exposure and period was fitted, and no 48-month post-2020 window is reported as a Model 1 table. COVID-period indicators on the full sample (through January 2020; February 2020–December 2021; January–April 2022; May–December 2022; and from January 2023) are a further labelled specification. They do not replace Model 1.</w:t>
+        <w:t>The nested specification repeats equation (1) on January 2013–December 2019 (84 months contained in the 132). This is an overlapping-sample refit: month factors and the 4-df spline are re-estimated, with knots on the subset. The difference is not a fitted pre/post effect. No exposure × period interaction was fitted, and no 48-month post-2020 Model 1 table is reported. COVID-period indicators on the full sample (through January 2020; February 2020–December 2021; January–April 2022; May–December 2022; from January 2023) are five intercept levels, a full-sample adjustment rather than a third window. They do not replace Model 1.</w:t>
       </w:r>
     </w:p>
     <w:p>
@@ -1624,24 +1624,7 @@
           <w:i w:val="0"/>
           <w:sz w:val="24"/>
         </w:rPr>
-        <w:t>Other checks were the time-trend spline (3, 6, or 8 degrees of freedom in place of the Model 1 4-df spline, or year indicators in place of that spline). Those checks change the control for slow calendar time, not the length of a heatwave. Further checks were dropping the first 12 or 24 months; weather one or two months earlier; and dropping the most influential month. Cold-day models restricted to November–March are a labelled sensitivity.</w:t>
-      </w:r>
-    </w:p>
-    <w:p>
-      <w:pPr>
-        <w:keepNext w:val="0"/>
-        <w:spacing w:after="160" w:before="0" w:line="240" w:lineRule="auto"/>
-        <w:ind w:firstLine="720"/>
-        <w:jc w:val="both"/>
-      </w:pPr>
-      <w:r>
-        <w:rPr>
-          <w:rFonts w:ascii="Times New Roman" w:hAnsi="Times New Roman" w:eastAsia="Times New Roman"/>
-          <w:b w:val="0"/>
-          <w:i w:val="0"/>
-          <w:sz w:val="24"/>
-        </w:rPr>
-        <w:t>Further checks used general-population × days as the offset (this is still a count ratio, not cohort incidence); maximum and minimum temperature in one model, or the three official extreme-day counts in one model; influenza on the 121 months with data; and nitrogen dioxide or PM2.5. Models that added pollution or influenza are extra checks. They are not replacements for Model 1.</w:t>
+        <w:t>Other checks were the time-trend spline (3, 6, or 8 degrees of freedom in place of the Model 1 4-df spline, or year indicators in place of that spline); dropping the first 12 or 24 months; weather one or two months earlier; and dropping the most influential month. Those checks change the control for slow calendar time, not the length of a heatwave. Cold-day models restricted to November–March are a labelled sensitivity. Further checks used general-population × days as the offset (still a count ratio, not cohort incidence); maximum and minimum temperature in one model, or the three official extreme-day counts in one model; influenza on the 121 months with data; and nitrogen dioxide or PM2.5. Models that added pollution or influenza are extra checks, not replacements for Model 1.</w:t>
       </w:r>
     </w:p>
     <w:p>
@@ -1834,7 +1817,7 @@
           <w:i w:val="0"/>
           <w:sz w:val="24"/>
         </w:rPr>
-        <w:t>CHD contributed 156,156 first recorded hospitalisations over 132 months, a mean of 1,183.0 per month. HF contributed 29,681, a mean of 224.9 per month (Table 1). Annual totals fell by about half from 2013 to 2023 (CHD 23,830 to 12,323; HF 4,336 to 2,296), with a further dip in 2020 (CHD 10,237; HF 1,964). Over the same years, the interpolated Census and Statistics Department population aged 35 years or older rose by 17%. Mean monthly first-event counts were 1,315 for CHD and 252 for HF in 2013–2019, against 926 and 173 in 2020–2022. Figure 1 indexes both hospital series and the general-population series to 2013. The decline in first-event counts is compatible with depletion of the at-risk set in a 2013–2023 diagnosis window, together with pandemic changes in care-seeking. It is not a measure of physiological improvement. It does not quantify the share attributable to depletion without monthly still-at-risk person-time. Mean monthly HF counts were highest in January (287) and lowest in September (196). CHD showed a milder winter elevation (January 1,386; September 1,097). After calendar-month indicators, the thermal estimates ask whether a given January or July differs from a typical January or July. They do not ask whether winter counts exceed summer counts.</w:t>
+        <w:t>CHD contributed 156,156 first recorded hospitalisations over 132 months, a mean of 1,183.0 per month. HF contributed 29,681, a mean of 224.9 per month (Table 1).</w:t>
       </w:r>
     </w:p>
     <w:p>
@@ -2237,7 +2220,7 @@
                 <w:i w:val="0"/>
                 <w:sz w:val="18"/>
               </w:rPr>
-              <w:t>First recorded hospitalisation after first CHD diagnosis</w:t>
+              <w:t>First recorded hospitalisation after first CHD diagnosis; admission cause not recorded; not principal diagnosis; not AMI</w:t>
             </w:r>
           </w:p>
         </w:tc>
@@ -2422,7 +2405,7 @@
                 <w:i w:val="0"/>
                 <w:sz w:val="18"/>
               </w:rPr>
-              <w:t>First recorded hospitalisation after first HF diagnosis</w:t>
+              <w:t>First recorded hospitalisation after first HF diagnosis; admission cause not recorded; not principal diagnosis; not AMI</w:t>
             </w:r>
           </w:p>
         </w:tc>
@@ -2445,6 +2428,23 @@
     </w:p>
     <w:p>
       <w:pPr>
+        <w:keepNext w:val="0"/>
+        <w:spacing w:after="160" w:before="0" w:line="240" w:lineRule="auto"/>
+        <w:ind w:firstLine="720"/>
+        <w:jc w:val="both"/>
+      </w:pPr>
+      <w:r>
+        <w:rPr>
+          <w:rFonts w:ascii="Times New Roman" w:hAnsi="Times New Roman" w:eastAsia="Times New Roman"/>
+          <w:b w:val="0"/>
+          <w:i w:val="0"/>
+          <w:sz w:val="24"/>
+        </w:rPr>
+        <w:t>Annual totals were highest in 2013 (CHD 23,830; HF 4,336), already near half by 2019 (CHD 12,396; HF 2,344), lowest in 2020 (CHD 10,237; HF 1,964), and in 2023 had returned toward 2019 (CHD 12,323; HF 2,296). Over the same years, the interpolated Census and Statistics Department population aged 35 years or older rose by 17%. That series is not the type 2 diabetes or hypertension group still at risk of a first event, and Figure 1 is not an incidence series. Figure 1 indexes both hospital series and the general-population series to 2013. The decline in first-event counts is not a measure of physiological improvement. It does not quantify depletion without monthly still-at-risk person-time. Mean monthly HF counts were highest in January (287) and lowest in September (196). CHD showed a milder winter elevation (January 1,386; September 1,097). After calendar-month indicators, the thermal estimates ask whether a given January or July differs from a typical January or July. They do not ask whether winter counts exceed summer counts.</w:t>
+      </w:r>
+    </w:p>
+    <w:p>
+      <w:pPr>
         <w:keepNext/>
         <w:keepLines/>
         <w:spacing w:after="120" w:before="0" w:line="240" w:lineRule="auto"/>
@@ -2458,7 +2458,7 @@
           <w:i/>
           <w:sz w:val="22"/>
         </w:rPr>
-        <w:t>Figure 1. First-event counts fell while the general population aged 35 years or older rose. Index = 1 in 2013. CHD 23,830 → 12,323; HF 4,336 → 2,296. Source: governed Hospital Authority aggregate annual totals; Census and Statistics Department mid-year population aged 35 years or older. The figure does not measure consecutive hot or cold spells, and it is not a physiological series.</w:t>
+        <w:t>Figure 1. First-event counts fell while the general population aged 35 years or older rose. Index = 1 in 2013. CHD 23,830 (2013) → 12,396 (2019) → 10,237 (2020) → 12,323 (2023); HF 4,336 → 2,344 → 1,964 → 2,296. Source: governed Hospital Authority aggregate annual totals; Census and Statistics Department mid-year population aged 35 years or older. The Census series is not the still-at-risk set. The figure does not measure consecutive hot or cold spells, and it is not a physiological series.</w:t>
       </w:r>
     </w:p>
     <w:p>
@@ -2631,7 +2631,7 @@
           <w:i/>
           <w:sz w:val="22"/>
         </w:rPr>
-        <w:t>Table 2 reports the official-day Model 1 count ratios, per five additional such days in the month, for the full 132 months and for the nested 84 months. The 84 months are contained in the 132, so the two columns are not independent periods and their difference is not a fitted pre/post effect. Interval overlap between the two columns is not a test of a window difference. Figure 3 is the main identification display for this article, including trend-spline and COVID-phase rows.</w:t>
+        <w:t>Table 2 reports the official-day Model 1 count ratios, per five additional such days in the month, for the full 132 months and for the nested 84 months. The 84 months are contained in the 132. The nested specification is an overlapping-sample refit: calendar-month factors and the 4-df spline are re-estimated, and spline knots follow the subset. The two columns are not independent periods, and their difference is not a fitted pre/post effect. Interval overlap between the two columns is not a test of a window difference, and discordance of whether 1 is excluded is not such a test. Figure 3 is the ruling-out exhibit for official-day encodings across trend-spline, window, and COVID-phase specifications. Figure 1 is the count-path object.</w:t>
       </w:r>
     </w:p>
     <w:p>
@@ -2648,7 +2648,7 @@
           <w:i w:val="0"/>
           <w:sz w:val="24"/>
         </w:rPr>
-        <w:t xml:space="preserve">The HF cold-day ratio was 1.113 (1.053–1.176) in the nested window and 1.073 (1.006–1.144) over the full window. Both displayed Newey–West lag-6 intervals exclude 1. The full-window estimate has </w:t>
+        <w:t xml:space="preserve">Point estimates moved. The HF cold-day ratio was 1.113 (1.053–1.176) in the nested window and 1.073 (1.006–1.144) over the full window. The CHD cold-day ratio was 1.036 (1.007–1.067) in the nested window and 0.995 (0.949–1.043) in the full window. The CHD hot-night ratio was 1.011 (0.991–1.032) in the nested window and 1.022 (1.002–1.042) in the full window. Cold-day points moved toward 1 when the later years were added; the CHD hot-night point was larger only in the full window. HF hot nights moved from 0.965 (0.937–0.994) in the nested window to 1.003 (0.976–1.031) in the full window, the opposite of CHD hot nights. Displayed lag-6 intervals are a convention, not a window test. For full-window CHD hot nights the lag-6 interval is 1.022 (1.002–1.042) and excludes 1, while the model-based 1.022 (0.995–1.049) and HC1 1.022 (0.997–1.047) intervals include 1 (Table 5). Both full-window official-day rows in Table 2 have </w:t>
       </w:r>
       <w:r>
         <w:rPr>
@@ -2666,25 +2666,7 @@
           <w:i w:val="0"/>
           <w:sz w:val="24"/>
         </w:rPr>
-        <w:t xml:space="preserve"> = 0.192. The CHD cold-day ratio excluded 1 only in the nested window (1.036, 1.007–1.067). In the full window it was 0.995 (0.949–1.043). The CHD hot-night ratio was 1.011 (0.991–1.032) in the nested window, an interval that includes 1, and 1.022 (1.002–1.042) in the full window (</w:t>
-      </w:r>
-      <w:r>
-        <w:rPr>
-          <w:rFonts w:ascii="Times New Roman" w:hAnsi="Times New Roman" w:eastAsia="Times New Roman"/>
-          <w:b w:val="0"/>
-          <w:i/>
-          <w:sz w:val="24"/>
-        </w:rPr>
-        <w:t>q</w:t>
-      </w:r>
-      <w:r>
-        <w:rPr>
-          <w:rFonts w:ascii="Times New Roman" w:hAnsi="Times New Roman" w:eastAsia="Times New Roman"/>
-          <w:b w:val="0"/>
-          <w:i w:val="0"/>
-          <w:sz w:val="24"/>
-        </w:rPr>
-        <w:t xml:space="preserve"> = 0.192). COVID-phase indicators on the full sample moved the CHD hot-night ratio to 1.013 (0.994–1.033) and left the HF cold-day ratio at 1.074 (1.006–1.145). There is no 48-month post-2020 Model 1 table. Attenuation of a cold-day count ratio toward 1, or a hot-night ratio that appears only when the later years are included, is a change in a monthly count model. It is not a measure of physiological improvement.</w:t>
+        <w:t xml:space="preserve"> = 0.192. Nested-window intervals have no multiplicity control. COVID-phase intercepts on the full sample, an adjustment rather than a third window, moved the CHD hot-night ratio to 1.013 (0.994–1.033) and left the HF cold-day ratio at 1.074 (1.006–1.145). Extra time steps can absorb a slow hot-night trend; that is overcontrol, not a period effect. There is no 48-month post-2020 Model 1 table. Movement of a monthly count-ratio point estimate is not a measure of physiological improvement.</w:t>
       </w:r>
     </w:p>
     <w:p>
@@ -2694,7 +2676,6 @@
         <w:ind w:firstLine="720"/>
         <w:jc w:val="both"/>
       </w:pPr>
-      <w:commentRangeStart w:id="7"/>
       <w:r>
         <w:rPr>
           <w:rFonts w:ascii="Times New Roman" w:hAnsi="Times New Roman" w:eastAsia="Times New Roman"/>
@@ -2702,14 +2683,7 @@
           <w:i w:val="0"/>
           <w:sz w:val="24"/>
         </w:rPr>
-        <w:t>Read as the ruling-out exhibit, the panel does not behave as a sufficient account of the window dependence would require. The cold-day ratios move in one direction between the windows, and the CHD hot-night ratio moves in the other. Official thermal extremes are therefore insufficient to explain why the fits depend on the window, and they are not thereby irrelevant to the fits.</w:t>
-      </w:r>
-      <w:commentRangeEnd w:id="7"/>
-      <w:r>
-        <w:rPr>
-          <w:rStyle w:val="CommentReference"/>
-        </w:rPr>
-        <w:commentReference w:id="7"/>
+        <w:t>The exhibit that can be read from Table 2 and Table 3 is that official-day point estimates are not invariant to the window, that cold-day and CHD hot-night points move in opposite directions, and that nested-window mean temperature is not the same contrast as official day counts. That is not a formal test of a window difference. Attenuation of the HF cold-day point toward 1 is predicted if utilisation falls after month 84 while a thermal coefficient is constant, so that movement is not a disproof of weather. Official thermal extremes are therefore insufficient to explain why the fits depend on the window, and they are not thereby irrelevant to the fits.</w:t>
       </w:r>
     </w:p>
     <w:p>
@@ -2720,7 +2694,7 @@
         <w:ind w:firstLine="0"/>
         <w:jc w:val="left"/>
       </w:pPr>
-      <w:commentRangeStart w:id="8"/>
+      <w:commentRangeStart w:id="7"/>
       <w:r>
         <w:rPr>
           <w:rFonts w:ascii="Times New Roman" w:hAnsi="Times New Roman" w:eastAsia="Times New Roman"/>
@@ -2728,14 +2702,14 @@
           <w:i/>
           <w:sz w:val="22"/>
         </w:rPr>
-        <w:t>Table 2. Official-day count ratios in the full window and in the nested January 2013–December 2019 window (Newey–West lag-6). Each estimate is the Model 1 count ratio per five additional official days in the month. The 84 nested months are contained in the 132. Benjamini–Hochberg q-values apply to the twelve full-window Model 1 fits only.</w:t>
+        <w:t>Table 2. Official-day count ratios in the full 132-month window and in the nested 84-month overlapping refit (Newey–West lag-6 display). Each estimate is the Model 1 count ratio per five additional official days in the month. The nested 84 months are contained in the 132; the columns are not a period contrast. Benjamini–Hochberg q-values apply to the twelve full-window Newey–West lag-6 Wald p values only.</w:t>
       </w:r>
-      <w:commentRangeEnd w:id="8"/>
+      <w:commentRangeEnd w:id="7"/>
       <w:r>
         <w:rPr>
           <w:rStyle w:val="CommentReference"/>
         </w:rPr>
-        <w:commentReference w:id="8"/>
+        <w:commentReference w:id="7"/>
       </w:r>
     </w:p>
     <w:tbl>
@@ -2843,7 +2817,7 @@
                 <w:i w:val="0"/>
                 <w:sz w:val="18"/>
               </w:rPr>
-              <w:t>2013–2023 (132 months)</w:t>
+              <w:t>Full 132 months</w:t>
             </w:r>
           </w:p>
         </w:tc>
@@ -2873,7 +2847,7 @@
                 <w:i w:val="0"/>
                 <w:sz w:val="18"/>
               </w:rPr>
-              <w:t>Nested 2013–2019 (84 months)</w:t>
+              <w:t>Nested 84 ⊂ 132 (not a period effect)</w:t>
             </w:r>
           </w:p>
         </w:tc>
@@ -3659,7 +3633,7 @@
           <w:i/>
           <w:sz w:val="22"/>
         </w:rPr>
-        <w:t>Figure 3. Model 1 count ratios for official day counts across time-trend, window, and COVID-period specifications (Newey–West lag-6 intervals). The exposure is the monthly official day count divided by five, so each estimate is the count ratio per five additional such days in that month. Rows labelled 3, 6, or 8 df replace the 4-df time-trend spline of Model 1. Neither the five-day scale nor the spline degrees of freedom refers to consecutive days. The nested window is January 2013–December 2019 (84 months). Continuous-temperature fits for the same specifications are a labelled check, not a physiology panel.</w:t>
+        <w:t>Figure 3. Model 1 count ratios for official day counts across time-trend, window, and COVID-period specifications (Newey–West lag-6 intervals). The exposure is the monthly official day count divided by five, so each estimate is the count ratio per five additional such days in that month. Rows labelled 3, 6, or 8 df replace the 4-df time-trend spline of Model 1. Neither the five-day scale nor the spline degrees of freedom refers to consecutive days. The nested window is January 2013–December 2019 (84 months), an overlapping-sample refit, not a period contrast. Continuous-temperature fits for the same specifications are a labelled check, not a physiology panel.</w:t>
       </w:r>
     </w:p>
     <w:p>
@@ -3719,7 +3693,7 @@
           <w:i/>
           <w:sz w:val="22"/>
         </w:rPr>
-        <w:t>Table 3 places mean temperature beside the official-day headlines in the same two windows. In the nested window, mean temperature was inversely associated with both outcomes (CHD 0.980, 0.970–0.990; HF 0.945, 0.927–0.963). In the same 84 months, official cold days were positively associated with both outcomes, and official hot nights were compatible with 1 for CHD and inverse for HF. COVID-phase indicators on the full sample moved mean temperature to 0.989 (0.975–1.003) for CHD and 0.967 (0.944–0.991) for HF. Continuous monthly temperature and official day counts are therefore not interchangeable encodings of the same contrast. All six continuous-temperature contrasts were inverse in the nested window. No multiplicity control was computed within that window. No nested-window estimate is promoted beyond a labelled specification.</w:t>
+        <w:t>Table 3 places mean temperature beside the official-day headlines in the same two windows. In the nested window, mean temperature was inversely associated with both outcomes (CHD 0.980, 0.970–0.990; HF 0.945, 0.927–0.963). In the same 84 months, official cold days were positively associated with both outcomes, and official hot nights were compatible with 1 for CHD and inverse for HF. COVID-phase intercept adjustments on the full sample moved mean temperature to 0.989 (0.975–1.003) for CHD and 0.967 (0.944–0.991) for HF. Continuous monthly temperature and official day counts are therefore not interchangeable encodings of the same contrast. All six continuous-temperature contrasts were inverse in the nested window. No multiplicity control was computed within that window. No nested-window estimate is promoted beyond a labelled specification.</w:t>
       </w:r>
     </w:p>
     <w:p>
@@ -3737,7 +3711,7 @@
           <w:i/>
           <w:sz w:val="22"/>
         </w:rPr>
-        <w:t>Table 3. Mean temperature versus official-day encodings (Newey–West lag-6).</w:t>
+        <w:t>Table 3. Mean temperature versus official-day encodings (Newey–West lag-6 display). COVID-phase values are intercept adjustments on the full 132 months, not a third window.</w:t>
       </w:r>
     </w:p>
     <w:tbl>
@@ -3846,7 +3820,7 @@
                 <w:i w:val="0"/>
                 <w:sz w:val="18"/>
               </w:rPr>
-              <w:t>2013–2023</w:t>
+              <w:t>Full 132 months</w:t>
             </w:r>
           </w:p>
         </w:tc>
@@ -3876,7 +3850,7 @@
                 <w:i w:val="0"/>
                 <w:sz w:val="18"/>
               </w:rPr>
-              <w:t>Nested 2013–2019</w:t>
+              <w:t>Nested 84 ⊂ 132</w:t>
             </w:r>
           </w:p>
         </w:tc>
@@ -3906,7 +3880,7 @@
                 <w:i w:val="0"/>
                 <w:sz w:val="18"/>
               </w:rPr>
-              <w:t>COVID-phase indicators</w:t>
+              <w:t>Full-sample COVID-phase adjustment</w:t>
             </w:r>
           </w:p>
         </w:tc>
@@ -4871,7 +4845,7 @@
           <w:i w:val="0"/>
           <w:sz w:val="24"/>
         </w:rPr>
-        <w:t>Across trend, window, and COVID-phase specifications, the CHD hot-night ratio ranged from 1.011 to 1.025, and the HF cold-day ratio from 1.043 to 1.113 (Figure 3). No trend specification is preferred over the 4-df spline in Model 1. The months with largest Cook’s distance were February 2020 for CHD and February 2022 for HF cold days. Excluding the most influential month left both exploratory directions unchanged (CHD hot nights 1.021 (1.001–1.040); HF cold days 1.088 (1.034–1.144)). Lag-one month is a labelled sensitivity. It is not a daily lag curve.</w:t>
+        <w:t>Across trend, window, and COVID-phase specifications, the CHD hot-night point estimate ranged from 1.011 to 1.025, and the HF cold-day point estimate from 1.043 to 1.113 (Figure 3). That range of points is not robustness of exclusion of 1: under an 8-df spline, year indicators, or dropping the first 12 or 24 months, the displayed lag-6 interval for HF cold days includes 1. No trend specification is preferred over the 4-df spline in Model 1. The months with largest Cook’s distance were February 2020 for CHD and February 2022 for HF cold days. Excluding the most influential month left both exploratory directions unchanged (CHD hot nights 1.021 (1.001–1.040); HF cold days 1.088 (1.034–1.144)). Lag-one month is a labelled sensitivity. It is not a daily lag curve.</w:t>
       </w:r>
     </w:p>
     <w:p>
@@ -4925,7 +4899,7 @@
           <w:i/>
           <w:sz w:val="22"/>
         </w:rPr>
-        <w:t>Table 4. Model 1 thermal exhibit on the full 132-month window (days-in-month offset; Newey–West lag-6 intervals).</w:t>
+        <w:t>Table 4. Model 1 thermal exhibit on the full 132-month window (days-in-month offset; Newey–West lag-6 intervals). Benjamini–Hochberg q is p.adjust of the twelve Newey–West lag-6 Wald p values, not model-based p.</w:t>
       </w:r>
     </w:p>
     <w:tbl>
@@ -7007,7 +6981,61 @@
           <w:i w:val="0"/>
           <w:sz w:val="24"/>
         </w:rPr>
-        <w:t>-values exceeded 0.19, with a minimum of 0.192. No model meets a multiplicity-protected confirmatory threshold. The HF mean-minimum-temperature interval narrowly included 1, with an unrounded upper bound of 1.00005. For CHD, the continuous monthly temperature estimates were near null, between 0.993 and 0.994, whereas the official hot-night count estimate was larger under the displayed lag-6 construction. These encodings describe different monthly thermal questions. The contrast does not imply that a hot-night effect was missed by the means. It is not a test of hourly nighttime excess heat [9]. For HF, the continuous temperature estimates were weakly inverse, and the cold-day count estimate was positive.</w:t>
+        <w:t xml:space="preserve">-values exceeded 0.19, with a minimum of 0.192. No model meets a multiplicity-protected confirmatory threshold. The two smallest lag-6 </w:t>
+      </w:r>
+      <w:r>
+        <w:rPr>
+          <w:rFonts w:ascii="Times New Roman" w:hAnsi="Times New Roman" w:eastAsia="Times New Roman"/>
+          <w:b w:val="0"/>
+          <w:i/>
+          <w:sz w:val="24"/>
+        </w:rPr>
+        <w:t>p</w:t>
+      </w:r>
+      <w:r>
+        <w:rPr>
+          <w:rFonts w:ascii="Times New Roman" w:hAnsi="Times New Roman" w:eastAsia="Times New Roman"/>
+          <w:b w:val="0"/>
+          <w:i w:val="0"/>
+          <w:sz w:val="24"/>
+        </w:rPr>
+        <w:t xml:space="preserve"> values (HF cold days 0.031; CHD hot nights 0.032) are pulled to the same </w:t>
+      </w:r>
+      <w:r>
+        <w:rPr>
+          <w:rFonts w:ascii="Times New Roman" w:hAnsi="Times New Roman" w:eastAsia="Times New Roman"/>
+          <w:b w:val="0"/>
+          <w:i/>
+          <w:sz w:val="24"/>
+        </w:rPr>
+        <w:t>q</w:t>
+      </w:r>
+      <w:r>
+        <w:rPr>
+          <w:rFonts w:ascii="Times New Roman" w:hAnsi="Times New Roman" w:eastAsia="Times New Roman"/>
+          <w:b w:val="0"/>
+          <w:i w:val="0"/>
+          <w:sz w:val="24"/>
+        </w:rPr>
+        <w:t xml:space="preserve"> = 0.192 by the Benjamini–Hochberg step-up. Model-based </w:t>
+      </w:r>
+      <w:r>
+        <w:rPr>
+          <w:rFonts w:ascii="Times New Roman" w:hAnsi="Times New Roman" w:eastAsia="Times New Roman"/>
+          <w:b w:val="0"/>
+          <w:i/>
+          <w:sz w:val="24"/>
+        </w:rPr>
+        <w:t>p</w:t>
+      </w:r>
+      <w:r>
+        <w:rPr>
+          <w:rFonts w:ascii="Times New Roman" w:hAnsi="Times New Roman" w:eastAsia="Times New Roman"/>
+          <w:b w:val="0"/>
+          <w:i w:val="0"/>
+          <w:sz w:val="24"/>
+        </w:rPr>
+        <w:t xml:space="preserve"> for those rows are 0.004 and 0.112. The HF mean-minimum-temperature interval narrowly included 1, with an unrounded upper bound of 1.00005. For CHD, the continuous monthly temperature estimates were near null, between 0.993 and 0.994, whereas the official hot-night count estimate was larger under the displayed lag-6 construction. These encodings describe different monthly thermal questions. The contrast does not imply that a hot-night effect was missed by the means. It is not a test of hourly nighttime excess heat [9]. For HF, the continuous temperature estimates were weakly inverse, and the cold-day count estimate was positive.</w:t>
       </w:r>
     </w:p>
     <w:p>
@@ -7060,7 +7088,7 @@
           <w:i/>
           <w:sz w:val="22"/>
         </w:rPr>
-        <w:t>Table 5. Uncertainty ladder for the two leading exploratory contrasts.</w:t>
+        <w:t>Table 5. Uncertainty ladder for CHD hot nights and HF cold days on the full 132-month window.</w:t>
       </w:r>
     </w:p>
     <w:tbl>
@@ -7574,7 +7602,7 @@
           <w:i w:val="0"/>
           <w:sz w:val="24"/>
         </w:rPr>
-        <w:t xml:space="preserve">For CHD hot nights, the model-based and HC1 intervals included 1, while both Newey–West intervals excluded 1 on the unrounded scale (lag 3: 1.000253 to 1.043860). The ladder narrowed from the model-based interval to the Newey–West intervals for that contrast. Robust intervals are not automatically wider. The direction of that change is itself informative. For HF cold days, all four constructions excluded 1, and </w:t>
+        <w:t xml:space="preserve">For CHD hot nights, the model-based and HC1 intervals included 1, while both Newey–West intervals excluded 1 on the unrounded scale (lag 3: 1.000253 to 1.043860). The lag-6 interval is narrower than the model-based interval while Pearson residual autocorrelation at lag 1 is 0.508. Positive serial correlation should inflate a HAC variance; a narrower Newey–West interval here is a finite-sample HAC warning, not a more precise discovery. On the nested 84-month refit the same CHD hot-night lag-1 autocorrelation was 0.171, and the HF cold-day autocorrelation was −0.046 against 0.146 on the full window. For HF cold days, all four constructions excluded 1 at the Model 1 baseline, and </w:t>
       </w:r>
       <w:r>
         <w:rPr>
@@ -7664,7 +7692,7 @@
           <w:i w:val="0"/>
           <w:sz w:val="24"/>
         </w:rPr>
-        <w:t xml:space="preserve"> &gt; 0.3 for every HF Model 1 fit. Serial dependence is part of the inferential problem for CHD. That is why the four-construction ladder is shown rather than a single interval.</w:t>
+        <w:t xml:space="preserve"> &gt; 0.3 for every HF Model 1 fit (lag 6 only). Serial dependence is part of the inferential problem for CHD. That is why the four-construction ladder is shown rather than a single interval.</w:t>
       </w:r>
     </w:p>
     <w:p>
@@ -7699,7 +7727,7 @@
           <w:i w:val="0"/>
           <w:sz w:val="24"/>
         </w:rPr>
-        <w:t xml:space="preserve">The extract shows window dependence, not a protected thermal discovery. First-event counts fell while the general population aged 35 years or older rose. Official-day count ratios moved with the window, in opposite directions for cold days and for CHD hot nights. All twelve full-window Model 1 </w:t>
+        <w:t xml:space="preserve">The extract shows window dependence, not a protected thermal discovery. First-event counts fell while the general population aged 35 years or older rose. Official-day count-ratio point estimates moved with the window, in opposite directions for cold days and for CHD hot nights. All twelve full-window Model 1 </w:t>
       </w:r>
       <w:r>
         <w:rPr>
@@ -7760,7 +7788,7 @@
           <w:i w:val="0"/>
           <w:sz w:val="24"/>
         </w:rPr>
-        <w:t xml:space="preserve"> Neighbouring Hong Kong files show fewer hospitalisations and more cardiovascular deaths in 2020 [1–4]. Emergency-department visits fell and 28-day mortality among attenders rose [2,3]. Self-reported avoidance of consultation was common [4]. ST-elevation myocardial infarction care was delayed [5,6]. Those patterns are consistent with reduced care-seeking and system shock. They predict fewer first recorded hospitalisations in a monthly Hospital Authority series without requiring a quieter myocardium. They do not identify how much of Table 1 is delayed presentation. They do not license reading the count drop as recovered health.</w:t>
+        <w:t xml:space="preserve"> Neighbouring Hong Kong studies from 2020 do not share this first-event construction, and their counts are not imported into the tables. Xin et al. reported fewer public hospitalisations in 2020, including cardiovascular admissions, together with additional deaths, particularly cardiovascular deaths and deaths outside public hospitals [1]. Those out-of-hospital deaths can remove a first hospitalisation from this series without implying fewer cardiac events. Wai et al. found fewer emergency-department visits and higher 28-day mortality among attenders [2,3]; attender fatality does not change this monthly count. Hung et al. documented self-reported avoidance of consultation in a public survey [4]. Tam et al. reported longer delays to ST-elevation myocardial infarction care in a Hong Kong service in early 2020 [5,6]; this extract has no ACS marker. Those papers can speak to the 2020 trough. They end in 2020. They do not cover February 2022, the HF cold-day influence month, and they do not explain the 2013–2019 decline. Non-presentation and death before arrival can reduce the monthly count; delay can move a count across months; attender-selection and survey avoidance do not identify Table 1. They do not license reading the count drop as recovered health.</w:t>
       </w:r>
     </w:p>
     <w:p>
@@ -7786,7 +7814,7 @@
           <w:i w:val="0"/>
           <w:sz w:val="24"/>
         </w:rPr>
-        <w:t xml:space="preserve"> The event is a first hospitalisation after a first CHD or HF diagnosis inside a 2013–2023 diagnosis window. People who have already had that first event cannot contribute another. Absent monthly still-at-risk person-time, the decline in Figure 1 is compatible with a shrinking risk set, with avoided care, or with both [14]. It is not incidence in the territory. It is not a measure of physiological improvement.</w:t>
+        <w:t xml:space="preserve"> The event is an absorbing first hospitalisation after a first CHD or HF diagnosis among people diagnosed with type 2 diabetes and/or hypertension during 2013–2023. New diagnoses still enter through 2023. Whether “first” is first in the 2013–2023 window (no washout) or incident after look-back is unspecified in the monthly transfer. The 2013 totals are the highest annual counts (CHD 23,830; HF 4,336), the pattern a left-censored first-in-window dump produces. 2020 lies below 2023 (CHD 10,237 vs 12,323; HF 1,964 vs 2,296), which a depletion-only closed cohort after 2013 does not predict. Absent monthly still-at-risk person-time, Figure 1 does not quantify the share due to depletion [14]. It is not incidence in the territory. It is not a measure of physiological improvement.</w:t>
       </w:r>
     </w:p>
     <w:p>
@@ -7829,7 +7857,7 @@
           <w:i w:val="0"/>
           <w:sz w:val="24"/>
         </w:rPr>
-        <w:t>Daily cardiac-admission studies do not rescue a monthly first-event claim. Goggins and Chan's cumulative relative risk comparing 11 °C with 25 °C is not a monthly count ratio per five official cold days, and it is not imported into Table 2 or Table 4 [8]. Guo et al. reported no overall association for the official hot-night flag after adjustment for mean temperature, so a difference between monthly means and monthly official counts does not identify an intensity mechanism [9]. Liu et al. (2020, 2026) remain complementary mortality baselines whose attributable fractions and excess-death totals cannot be rescaled into the present count ratios [22,23]. Physiological accounts of overnight recovery and cold-related afterload, and any mapping onto heat–health action-plan elements, are not identified by 132 monthly counts.</w:t>
+        <w:t>Daily cardiac-admission studies do not rescue a monthly first-event claim. Goggins and Chan's cumulative relative risk of 2.63 (2.43–2.84) comparing 11 °C with 25 °C is not a monthly count ratio per five official cold days, and it is not imported into Table 2 or Table 4 [8]. Guo et al. reported no overall association for the official hot-night flag after adjustment for mean temperature, so a difference between monthly means and monthly official counts does not identify an intensity mechanism [9]. Jingwen Liu et al. estimated daily mortality attributable fractions in Hong Kong [22]. Zhenyuan Liu et al. modelled heatwave excess deaths under transported local relative risks [23]. Those attributable fractions and excess-death totals cannot be rescaled into the present count ratios. Physiological accounts of overnight recovery and cold-related afterload, and any mapping onto heat–health action-plan elements, are not identified by 132 monthly counts.</w:t>
       </w:r>
     </w:p>
     <w:p>
@@ -7873,7 +7901,7 @@
           <w:i w:val="0"/>
           <w:sz w:val="24"/>
         </w:rPr>
-        <w:t xml:space="preserve"> The analysis window is treated as part of the estimand rather than as a nuisance to be averaged through. Official-day ratios are shown for both the full window and the nested 84-month specification. Mean temperature is placed beside those ratios in the same windows (Table 3). All twelve full-window Model 1 fits are reported. Uncertainty is shown as a four-construction ladder. Figure 1 and Figure 3 display the two objects the thesis needs: the first-event decline and the dependence of each official-day ratio on the window and the time smooth.</w:t>
+        <w:t xml:space="preserve"> The analysis window is treated as part of the estimand rather than as a nuisance to be averaged through. Official-day ratios are shown for both the full window and the nested 84-month specification. Mean temperature is placed beside those ratios in the same windows (Table 3). All twelve full-window Model 1 fits are reported. Uncertainty is shown as a four-construction ladder. Figure 1 displays the first-event count path. Figure 3 is the ruling-out exhibit for official-day encodings.</w:t>
       </w:r>
     </w:p>
     <w:p>
@@ -7899,7 +7927,7 @@
           <w:i w:val="0"/>
           <w:sz w:val="24"/>
         </w:rPr>
-        <w:t xml:space="preserve"> Admission cause was not recorded, so an event is a first hospitalisation after a first diagnosis and not a cardiac-caused admission. Monthly counts of people still at risk of a first event were unavailable, so the estimates are count ratios rather than incidence-rate ratios [14]. Laboratory series were not delivered. The design is ecological and monthly, so individual-level and daily-triggering interpretations are not identified [14]. Monthly official-day totals cannot identify consecutive duration. Age, sex, and disease-subtype strata were not delivered. Residual serial correlation remains material for CHD, with lag-1 Pearson autocorrelation of 0.508 in the hot-night model. Official cold days are concentrated in December–February, and only 29 of 132 months carry any official cold day. The CHD hot-night estimate is compatible with 1 in the nested window. There is no post-only 48-month Model 1 table. Official hot-night counts are not hourly nighttime excess heat [9]. All exposures were measured at a single Observatory station and applied territory-wide. Influenza covers 121 of 132 months and is a sensitivity, not Model 1. A labelled synthetic count process, not this Hospital Authority panel, shows that a full-window coefficient can look attenuated when utilisation or an influenza-like term collapses after month 84 while the true coefficient is held constant. Pollution declined across the decade [13]. That co-trend is slow rather than a 2020-only switch, so confounding by infection or ozone is unresolved in Model 1. A corresponding stroke series was not available. Influence months include February 2020 for CHD and February 2022 for HF cold days. Physiological mechanisms are not identified from the 132 months.</w:t>
+        <w:t xml:space="preserve"> Admission cause was not recorded, so an event is a first hospitalisation after a first diagnosis and not a cardiac-caused admission. Monthly counts of people still at risk of a first event were unavailable, so the estimates are count ratios rather than incidence-rate ratios [14]. Laboratory measurements were not in the monthly transfer. The design is ecological and monthly, so individual-level and daily-triggering interpretations are not identified [14]. Monthly official-day totals cannot identify consecutive duration. Age, sex, and disease-subtype strata were not delivered. Residual serial correlation remains material for CHD, with lag-1 Pearson autocorrelation of 0.508 in the hot-night model. Official cold days are concentrated in December–February, and only 29 of 132 months carry any official cold day. The CHD hot-night estimate is compatible with 1 in the nested window. There is no post-only 48-month Model 1 table. Official hot-night counts are not hourly nighttime excess heat [9]. All exposures were measured at a single Observatory station and applied territory-wide. Influenza covers 121 of 132 months and is a sensitivity, not Model 1; omitting it from Model 1 is a limitation of a window paper as well as of a thermal fit. A labelled synthetic count process, not this Hospital Authority panel, shows that a full-window coefficient can look attenuated when utilisation or an influenza-like term collapses after month 84 while the true coefficient is held constant. Pollution declined across the decade [13]. That co-trend is slow rather than a 2020-only switch, so confounding by infection or ozone is unresolved in Model 1. A corresponding stroke series was not available. Influence months include February 2020 for CHD and February 2022 for HF cold days. Physiological mechanisms are not identified from the 132 months.</w:t>
       </w:r>
     </w:p>
     <w:p>
@@ -7934,7 +7962,7 @@
           <w:i w:val="0"/>
           <w:sz w:val="24"/>
         </w:rPr>
-        <w:t>In this 2013–2023 first-event extract, monthly CHD and HF counts fell, and cold-day count ratios were stronger in the nested 84 months than in the full window. Official hot nights and cold days do not supply a sufficient account of that window dependence. They remain part of the exposure record. The data do not show that health recovered after 2020, and they do not support a multiplicity-protected differential thermal claim. What the file supports is a window-dependent count ratio for a first hospitalisation after a first diagnosis, without admission cause and without person-time.</w:t>
+        <w:t>In this 2013–2023 first-event extract, monthly CHD and HF counts fell. Official-day count-ratio point estimates moved with the window, in opposite directions for cold days and for CHD hot nights. Official thermal extremes are insufficient to account for that dependence. They remain part of the exposure record. The data do not show that health recovered after 2020, and they do not support a multiplicity-protected differential thermal claim. What the file supports is a window-dependent count ratio for a first hospitalisation after a first diagnosis, without admission cause and without person-time.</w:t>
       </w:r>
     </w:p>
     <w:p>
@@ -8430,7 +8458,7 @@
 
 <file path=word/comments.xml><?xml version="1.0" encoding="utf-8"?>
 <w:comments xmlns:a="http://schemas.openxmlformats.org/drawingml/2006/main" xmlns:pic="http://schemas.openxmlformats.org/drawingml/2006/picture" xmlns:r="http://schemas.openxmlformats.org/officeDocument/2006/relationships" xmlns:w="http://schemas.openxmlformats.org/wordprocessingml/2006/main" xmlns:wp="http://schemas.openxmlformats.org/drawingml/2006/wordprocessingDrawing" xmlns:mc="http://schemas.openxmlformats.org/markup-compatibility/2006" xmlns:a14="http://schemas.microsoft.com/office/drawing/2010/main" xmlns:w14="http://schemas.microsoft.com/office/word/2010/wordml" xmlns:wpc="http://schemas.microsoft.com/office/word/2010/wordprocessingCanvas">
-  <w:comment w:id="0" w:author="Bob Shen" w:initials="BS" w:date="2026-09-13T04:48:03Z">
+  <w:comment w:id="0" w:author="Bob Shen" w:initials="BS" w:date="2026-09-13T06:51:09Z">
     <w:p>
       <w:pPr>
         <w:pStyle w:val="CommentText"/>
@@ -8446,7 +8474,7 @@
       </w:r>
     </w:p>
   </w:comment>
-  <w:comment w:id="1" w:author="Bob Shen" w:initials="BS" w:date="2026-09-13T04:48:03Z">
+  <w:comment w:id="1" w:author="Bob Shen" w:initials="BS" w:date="2026-09-13T06:51:09Z">
     <w:p>
       <w:pPr>
         <w:pStyle w:val="CommentText"/>
@@ -8462,7 +8490,7 @@
       </w:r>
     </w:p>
   </w:comment>
-  <w:comment w:id="2" w:author="Bob Shen" w:initials="BS" w:date="2026-09-13T04:48:03Z">
+  <w:comment w:id="2" w:author="Bob Shen" w:initials="BS" w:date="2026-09-13T06:51:09Z">
     <w:p>
       <w:pPr>
         <w:pStyle w:val="CommentText"/>
@@ -8478,7 +8506,7 @@
       </w:r>
     </w:p>
   </w:comment>
-  <w:comment w:id="3" w:author="Bob Shen" w:initials="BS" w:date="2026-09-13T04:48:03Z">
+  <w:comment w:id="3" w:author="Bob Shen" w:initials="BS" w:date="2026-09-13T06:51:09Z">
     <w:p>
       <w:pPr>
         <w:pStyle w:val="CommentText"/>
@@ -8494,7 +8522,7 @@
       </w:r>
     </w:p>
   </w:comment>
-  <w:comment w:id="4" w:author="Bob Shen" w:initials="BS" w:date="2026-09-13T04:48:03Z">
+  <w:comment w:id="4" w:author="Bob Shen" w:initials="BS" w:date="2026-09-13T06:51:09Z">
     <w:p>
       <w:pPr>
         <w:pStyle w:val="CommentText"/>
@@ -8510,7 +8538,7 @@
       </w:r>
     </w:p>
   </w:comment>
-  <w:comment w:id="5" w:author="Bob Shen" w:initials="BS" w:date="2026-09-13T04:48:03Z">
+  <w:comment w:id="5" w:author="Bob Shen" w:initials="BS" w:date="2026-09-13T06:51:09Z">
     <w:p>
       <w:pPr>
         <w:pStyle w:val="CommentText"/>
@@ -8526,7 +8554,7 @@
       </w:r>
     </w:p>
   </w:comment>
-  <w:comment w:id="6" w:author="Bob Shen" w:initials="BS" w:date="2026-09-13T04:48:03Z">
+  <w:comment w:id="6" w:author="Bob Shen" w:initials="BS" w:date="2026-09-13T06:51:09Z">
     <w:p>
       <w:pPr>
         <w:pStyle w:val="CommentText"/>
@@ -8542,23 +8570,7 @@
       </w:r>
     </w:p>
   </w:comment>
-  <w:comment w:id="7" w:author="Bob Shen" w:initials="BS" w:date="2026-09-13T04:48:03Z">
-    <w:p>
-      <w:pPr>
-        <w:pStyle w:val="CommentText"/>
-      </w:pPr>
-      <w:r>
-        <w:rPr>
-          <w:rStyle w:val="CommentReference"/>
-        </w:rPr>
-        <w:annotationRef/>
-      </w:r>
-      <w:r>
-        <w:t>Interval overlap between the nested and full windows is not a formal test of a coefficient difference.</w:t>
-      </w:r>
-    </w:p>
-  </w:comment>
-  <w:comment w:id="8" w:author="Bob Shen" w:initials="BS" w:date="2026-09-13T04:48:03Z">
+  <w:comment w:id="7" w:author="Bob Shen" w:initials="BS" w:date="2026-09-13T06:51:09Z">
     <w:p>
       <w:pPr>
         <w:pStyle w:val="CommentText"/>
@@ -8597,7 +8609,7 @@
         <w:color w:val="555555"/>
         <w:sz w:val="20"/>
       </w:rPr>
-      <w:t>Window dependence of first CHD/HF hospitalisation</w:t>
+      <w:t>Window dependence of first-event counts: official-day exhibit</w:t>
     </w:r>
     <w:r>
       <w:rPr>

</xml_diff>

<commit_message>
Rebuild the covid_period Word and PDF after round-2 leftovers.
Figure 3 now embeds the covid_period-only ruling-out forest. Rails 79 remain green.

Co-authored-by: Shen Ruililin <bobshenruililin@users.noreply.github.com>
</commit_message>
<xml_diff>
--- a/manuscript/covid_period/Heat_CVD_Manuscript_covid_period.docx
+++ b/manuscript/covid_period/Heat_CVD_Manuscript_covid_period.docx
@@ -229,7 +229,7 @@
           <w:i w:val="0"/>
           <w:sz w:val="24"/>
         </w:rPr>
-        <w:t xml:space="preserve"> Among people with type 2 diabetes and/or hypertension in Hong Kong, the counted event is the first recorded hospitalisation after a first diagnosis of coronary heart disease (CHD) or heart failure (HF). Admission cause was not recorded. Monthly first-event counts fell by about half between 2013 and 2023. Most of that decline was already in place by 2019. 2020 was a trough. 2023 returned toward 2019, not toward 2013. Neighbouring Hong Kong series report fewer public hospitalisations and more cardiovascular deaths in 2020; those papers describe the trough, not the 2013–2019 path. This paper reports two objects from one extract: the path of those first-event counts, and Model 1 official-day count ratios on the full 132 months and on the nested 84 months to December 2019, carried as a ruling-out exhibit.</w:t>
+        <w:t xml:space="preserve"> Among people with type 2 diabetes and/or hypertension in Hong Kong, the counted event is the first recorded hospitalisation after a first diagnosis of coronary heart disease (CHD) or heart failure (HF). Admission cause was not recorded. Monthly first-event counts fell by about half between 2013 and 2023. Most of that decline was already in place by 2019. 2020 was a trough. 2023 returned toward 2019, not toward 2013. Xin et al. reported fewer public hospitalisations and more cardiovascular deaths in 2020 [1]; neighbouring papers describe the trough, not the 2013–2019 path. This paper reports two objects from one extract: the path of those first-event counts, and Model 1 official-day count ratios on the full 132 months and on the nested 84 months to December 2019, carried as a ruling-out exhibit.</w:t>
       </w:r>
     </w:p>
     <w:p>
@@ -405,7 +405,7 @@
           <w:i w:val="0"/>
           <w:sz w:val="24"/>
         </w:rPr>
-        <w:t xml:space="preserve"> First-event counts and official-day count ratios in this extract depend on the window analysed. Official thermal extremes are insufficient to account for that dependence. They remain part of the exposure record. The decline in first events is not a measure of physiological improvement. Estimates remain ecological monthly count ratios for a first-event outcome without recorded admission cause.</w:t>
+        <w:t xml:space="preserve"> First-event counts and official-day count ratios in this extract depend on the window analysed. Nested containment means that a constant thermal coefficient need not be invariant once utilisation or depletion after 2019 is present, so stability of the ratios is a weak falsifier. Official-day point estimates are not invariant: cold-day and CHD hot-night points move in opposite directions; nested-window mean temperature is not the same contrast as official day counts; and the 4-df spline absorbs both the count path and the hot-night trend. They remain part of the exposure record. The decline in first events is not a measure of physiological improvement. Estimates remain ecological monthly count ratios for a first-event outcome without recorded admission cause.</w:t>
       </w:r>
     </w:p>
     <w:p>
@@ -483,7 +483,7 @@
           <w:i w:val="0"/>
           <w:sz w:val="24"/>
         </w:rPr>
-        <w:t>Hong Kong studies of 2020 describe fewer cardiovascular admissions, not fewer cardiovascular events. Xin et al. reported fewer public hospitalisations in 2020, including cardiovascular admissions, together with additional deaths, particularly cardiovascular deaths and deaths outside public hospitals [1]. That composite is not a CHD–HF–stroke MACE from this extract, and stroke was not attached. Wai et al. found fewer emergency-department visits in January–August 2020 than in the same months of 2019, and higher 28-day mortality among those who did attend [2]. A later Wai et al. cohort of non-COVID deaths likewise paired fewer emergency visits with higher 28-day mortality [3]. Hung et al. documented self-reported avoidance of consultation in a public survey [4]. Tam et al. reported longer delays to ST-elevation myocardial infarction care in a Hong Kong service in early 2020 [5,6]. Those papers are utilisation and delay series from 2020. They are not this type 2 diabetes and/or hypertension first-event construction, they are not AMI or STEMI, and their counts are not imported into the tables below. They can speak to the 2020 trough. They cannot speak to the 2013–2019 decline, and they do not cover February 2022.</w:t>
+        <w:t>Neighbouring Hong Kong studies from 2020 do not share this first-event construction, and their counts are not imported into the tables below. Xin et al. reported fewer public hospitalisations in 2020, including cardiovascular admissions, together with additional deaths, particularly cardiovascular deaths and deaths outside public hospitals [1]. That composite is not a CHD–HF–stroke MACE from this extract, and stroke was not attached. Wai et al. found fewer emergency-department visits in January–August 2020 than in the same months of 2019, and higher 28-day mortality among those who did attend [2]; a later Wai et al. analysis of emergency-department attenders likewise paired fewer visits with higher 28-day mortality [3]. Hung et al. documented self-reported avoidance of consultation in a public survey [4]. Tam et al. reported longer delays to ST-elevation myocardial infarction care in a Hong Kong service in early 2020 [5,6]. Those papers are utilisation, attender-mortality, survey, and STEMI-delay series from 2020. They are not this type 2 diabetes and/or hypertension first-event construction, they are not AMI or STEMI, and they can speak to the 2020 trough. They cannot speak to the 2013–2019 decline, and they do not cover February 2022.</w:t>
       </w:r>
     </w:p>
     <w:p>
@@ -2631,7 +2631,7 @@
           <w:i/>
           <w:sz w:val="22"/>
         </w:rPr>
-        <w:t>Table 2 reports the official-day Model 1 count ratios, per five additional such days in the month, for the full 132 months and for the nested 84 months. The 84 months are contained in the 132. The nested specification is an overlapping-sample refit: calendar-month factors and the 4-df spline are re-estimated, and spline knots follow the subset. The two columns are not independent periods, and their difference is not a fitted pre/post effect. Interval overlap between the two columns is not a test of a window difference, and discordance of whether 1 is excluded is not such a test. Figure 3 is the ruling-out exhibit for official-day encodings across trend-spline, window, and COVID-phase specifications. Figure 1 is the count-path object.</w:t>
+        <w:t>Table 2 reports the official-day Model 1 count ratios, per five additional such days in the month, for the full 132 months and for the nested 84 months. The 84 months are contained in the 132. The nested specification is an overlapping-sample refit: calendar-month factors and the 4-df spline are re-estimated, and spline knots follow the subset. The two columns are not independent periods, and their difference is not a fitted pre/post effect. Interval overlap between the two columns is not a test of a window difference, and discordance of whether 1 is excluded is not such a test. Figure 3 is the ruling-out exhibit for official-day encodings across trend-spline checks, the nested 84-month overlapping refit, and a full-sample COVID-phase intercept adjustment. Figure 1 is the count-path object.</w:t>
       </w:r>
     </w:p>
     <w:p>
@@ -2683,7 +2683,7 @@
           <w:i w:val="0"/>
           <w:sz w:val="24"/>
         </w:rPr>
-        <w:t>The exhibit that can be read from Table 2 and Table 3 is that official-day point estimates are not invariant to the window, that cold-day and CHD hot-night points move in opposite directions, and that nested-window mean temperature is not the same contrast as official day counts. That is not a formal test of a window difference. Attenuation of the HF cold-day point toward 1 is predicted if utilisation falls after month 84 while a thermal coefficient is constant, so that movement is not a disproof of weather. Official thermal extremes are therefore insufficient to explain why the fits depend on the window, and they are not thereby irrelevant to the fits.</w:t>
+        <w:t>The exhibit that can be read from Table 2 and Table 3 is that official-day point estimates are not invariant to the window, that cold-day and CHD hot-night points move in opposite directions, and that nested-window mean temperature is not the same contrast as official day counts. That is not a formal test of a window difference. Attenuation of the HF cold-day point toward 1 is predicted if utilisation falls after month 84 while a thermal coefficient is constant, so that movement is not a disproof of weather. Nested containment means that stability of the ratios is a weak falsifier. The 4-df spline absorbs the first-event count path and the hot-night trend. They remain part of the exposure record.</w:t>
       </w:r>
     </w:p>
     <w:p>
@@ -3633,7 +3633,7 @@
           <w:i/>
           <w:sz w:val="22"/>
         </w:rPr>
-        <w:t>Figure 3. Model 1 count ratios for official day counts across time-trend, window, and COVID-period specifications (Newey–West lag-6 intervals). The exposure is the monthly official day count divided by five, so each estimate is the count ratio per five additional such days in that month. Rows labelled 3, 6, or 8 df replace the 4-df time-trend spline of Model 1. Neither the five-day scale nor the spline degrees of freedom refers to consecutive days. The nested window is January 2013–December 2019 (84 months), an overlapping-sample refit, not a period contrast. Continuous-temperature fits for the same specifications are a labelled check, not a physiology panel.</w:t>
+        <w:t>Figure 3. Model 1 count ratios for official day counts across time-trend spline checks, the nested 84-month overlapping refit, and a full-sample COVID-phase intercept adjustment (Newey–West lag-6 intervals). The exposure is the monthly official day count divided by five, so each estimate is the count ratio per five additional such days in that month. Rows labelled 3, 6, or 8 df replace the 4-df time-trend spline of Model 1. Neither the five-day scale nor the spline degrees of freedom refers to consecutive days. The nested 84 months (January 2013–December 2019) are an overlapping-sample refit, not a period contrast. The COVID-phase row is a full-sample intercept adjustment, not a third window. Continuous-temperature fits for the same specifications are a labelled check, not a physiology panel.</w:t>
       </w:r>
     </w:p>
     <w:p>
@@ -3655,7 +3655,7 @@
               <a:graphicData uri="http://schemas.openxmlformats.org/drawingml/2006/picture">
                 <pic:pic>
                   <pic:nvPicPr>
-                    <pic:cNvPr id="0" name="figure_D_trend_depletion_sensitivity.png"/>
+                    <pic:cNvPr id="0" name="figure_3_ruling_out_exhibit.png"/>
                     <pic:cNvPicPr/>
                   </pic:nvPicPr>
                   <pic:blipFill>
@@ -4845,7 +4845,7 @@
           <w:i w:val="0"/>
           <w:sz w:val="24"/>
         </w:rPr>
-        <w:t>Across trend, window, and COVID-phase specifications, the CHD hot-night point estimate ranged from 1.011 to 1.025, and the HF cold-day point estimate from 1.043 to 1.113 (Figure 3). That range of points is not robustness of exclusion of 1: under an 8-df spline, year indicators, or dropping the first 12 or 24 months, the displayed lag-6 interval for HF cold days includes 1. No trend specification is preferred over the 4-df spline in Model 1. The months with largest Cook’s distance were February 2020 for CHD and February 2022 for HF cold days. Excluding the most influential month left both exploratory directions unchanged (CHD hot nights 1.021 (1.001–1.040); HF cold days 1.088 (1.034–1.144)). Lag-one month is a labelled sensitivity. It is not a daily lag curve.</w:t>
+        <w:t>Across trend-spline checks, the nested overlapping refit, and the full-sample COVID-phase intercept adjustment, the CHD hot-night point estimate ranged from 1.011 to 1.025, and the HF cold-day point estimate from 1.043 to 1.113 (Figure 3). That range of points is not robustness of exclusion of 1: under an 8-df spline, year indicators, or dropping the first 12 or 24 months, the displayed lag-6 interval for HF cold days includes 1. No trend specification is preferred over the 4-df spline in Model 1. The months with largest Cook’s distance were February 2020 for CHD and February 2022 for HF cold days. Excluding the most influential month left both exploratory directions unchanged (CHD hot nights 1.021 (1.001–1.040); HF cold days 1.088 (1.034–1.144)). Lag-one month is a labelled sensitivity. It is not a daily lag curve.</w:t>
       </w:r>
     </w:p>
     <w:p>
@@ -7840,7 +7840,7 @@
           <w:i w:val="0"/>
           <w:sz w:val="24"/>
         </w:rPr>
-        <w:t xml:space="preserve"> Official hot nights were more frequent in the same years in which care-seeking changed (2.7 per month in 2013–2019; 4.5 per month in 2020–2022). The CHD hot-night residual needs those later years. The same 4-df spline that absorbs the first-event decline also absorbs the hot-night trend. That is an identification problem, not evidence that hot nights caused the count drop. Official cold days remain a winter-to-winter contrast (141 of 145 days in December–February; 29 of 132 months carry any). Weather is therefore insufficient as an account of the window dependence, and it is not irrelevant to the fit. Continuous mean temperature in the nested window is inverse for both outcomes and is not a substitute for the official-day encoding (Table 3).</w:t>
+        <w:t xml:space="preserve"> Official hot nights were more frequent in the same years in which care-seeking changed (2.7 per month in 2013–2019; 4.5 per month in 2020–2022). The CHD hot-night residual needs those later years. The same 4-df spline that absorbs the first-event decline also absorbs the hot-night trend. That is an identification problem, not evidence that hot nights caused the count drop. Official cold days remain a winter-to-winter contrast (141 of 145 days in December–February; 29 of 132 months carry any). Nested containment means that a constant thermal coefficient need not be invariant once utilisation or depletion after 2019 is present, so stability of the ratios is a weak falsifier. Official-day point estimates moved with the window, in opposite directions for cold days and for CHD hot nights, and nested-window mean temperature is not the same contrast as official day counts. They remain part of the exposure record. Continuous mean temperature in the nested window is inverse for both outcomes and is not a substitute for the official-day encoding (Table 3).</w:t>
       </w:r>
     </w:p>
     <w:p>
@@ -7962,7 +7962,7 @@
           <w:i w:val="0"/>
           <w:sz w:val="24"/>
         </w:rPr>
-        <w:t>In this 2013–2023 first-event extract, monthly CHD and HF counts fell. Official-day count-ratio point estimates moved with the window, in opposite directions for cold days and for CHD hot nights. Official thermal extremes are insufficient to account for that dependence. They remain part of the exposure record. The data do not show that health recovered after 2020, and they do not support a multiplicity-protected differential thermal claim. What the file supports is a window-dependent count ratio for a first hospitalisation after a first diagnosis, without admission cause and without person-time.</w:t>
+        <w:t>In this 2013–2023 first-event extract, monthly CHD and HF counts fell. Official-day count-ratio point estimates moved with the window, in opposite directions for cold days and for CHD hot nights. Nested containment means that a constant thermal coefficient need not be invariant once utilisation or depletion after 2019 is present, so stability of the ratios is a weak falsifier. Nested-window mean temperature is not the same contrast as official day counts, and the 4-df spline absorbs both the count path and the hot-night trend. They remain part of the exposure record. The data do not show that health recovered after 2020, and they do not support a multiplicity-protected differential thermal claim. What the file supports is a window-dependent count ratio for a first hospitalisation after a first diagnosis, without admission cause and without person-time.</w:t>
       </w:r>
     </w:p>
     <w:p>
@@ -8458,7 +8458,7 @@
 
 <file path=word/comments.xml><?xml version="1.0" encoding="utf-8"?>
 <w:comments xmlns:a="http://schemas.openxmlformats.org/drawingml/2006/main" xmlns:pic="http://schemas.openxmlformats.org/drawingml/2006/picture" xmlns:r="http://schemas.openxmlformats.org/officeDocument/2006/relationships" xmlns:w="http://schemas.openxmlformats.org/wordprocessingml/2006/main" xmlns:wp="http://schemas.openxmlformats.org/drawingml/2006/wordprocessingDrawing" xmlns:mc="http://schemas.openxmlformats.org/markup-compatibility/2006" xmlns:a14="http://schemas.microsoft.com/office/drawing/2010/main" xmlns:w14="http://schemas.microsoft.com/office/word/2010/wordml" xmlns:wpc="http://schemas.microsoft.com/office/word/2010/wordprocessingCanvas">
-  <w:comment w:id="0" w:author="Bob Shen" w:initials="BS" w:date="2026-09-13T06:51:09Z">
+  <w:comment w:id="0" w:author="Bob Shen" w:initials="BS" w:date="2026-09-13T07:05:25Z">
     <w:p>
       <w:pPr>
         <w:pStyle w:val="CommentText"/>
@@ -8474,7 +8474,7 @@
       </w:r>
     </w:p>
   </w:comment>
-  <w:comment w:id="1" w:author="Bob Shen" w:initials="BS" w:date="2026-09-13T06:51:09Z">
+  <w:comment w:id="1" w:author="Bob Shen" w:initials="BS" w:date="2026-09-13T07:05:25Z">
     <w:p>
       <w:pPr>
         <w:pStyle w:val="CommentText"/>
@@ -8490,7 +8490,7 @@
       </w:r>
     </w:p>
   </w:comment>
-  <w:comment w:id="2" w:author="Bob Shen" w:initials="BS" w:date="2026-09-13T06:51:09Z">
+  <w:comment w:id="2" w:author="Bob Shen" w:initials="BS" w:date="2026-09-13T07:05:25Z">
     <w:p>
       <w:pPr>
         <w:pStyle w:val="CommentText"/>
@@ -8506,7 +8506,7 @@
       </w:r>
     </w:p>
   </w:comment>
-  <w:comment w:id="3" w:author="Bob Shen" w:initials="BS" w:date="2026-09-13T06:51:09Z">
+  <w:comment w:id="3" w:author="Bob Shen" w:initials="BS" w:date="2026-09-13T07:05:25Z">
     <w:p>
       <w:pPr>
         <w:pStyle w:val="CommentText"/>
@@ -8522,7 +8522,7 @@
       </w:r>
     </w:p>
   </w:comment>
-  <w:comment w:id="4" w:author="Bob Shen" w:initials="BS" w:date="2026-09-13T06:51:09Z">
+  <w:comment w:id="4" w:author="Bob Shen" w:initials="BS" w:date="2026-09-13T07:05:25Z">
     <w:p>
       <w:pPr>
         <w:pStyle w:val="CommentText"/>
@@ -8538,7 +8538,7 @@
       </w:r>
     </w:p>
   </w:comment>
-  <w:comment w:id="5" w:author="Bob Shen" w:initials="BS" w:date="2026-09-13T06:51:09Z">
+  <w:comment w:id="5" w:author="Bob Shen" w:initials="BS" w:date="2026-09-13T07:05:25Z">
     <w:p>
       <w:pPr>
         <w:pStyle w:val="CommentText"/>
@@ -8554,7 +8554,7 @@
       </w:r>
     </w:p>
   </w:comment>
-  <w:comment w:id="6" w:author="Bob Shen" w:initials="BS" w:date="2026-09-13T06:51:09Z">
+  <w:comment w:id="6" w:author="Bob Shen" w:initials="BS" w:date="2026-09-13T07:05:25Z">
     <w:p>
       <w:pPr>
         <w:pStyle w:val="CommentText"/>
@@ -8570,7 +8570,7 @@
       </w:r>
     </w:p>
   </w:comment>
-  <w:comment w:id="7" w:author="Bob Shen" w:initials="BS" w:date="2026-09-13T06:51:09Z">
+  <w:comment w:id="7" w:author="Bob Shen" w:initials="BS" w:date="2026-09-13T07:05:25Z">
     <w:p>
       <w:pPr>
         <w:pStyle w:val="CommentText"/>

</xml_diff>